<commit_message>
Updated the report and readme file.
</commit_message>
<xml_diff>
--- a/Evidence/CacheViewExpirationReport.docx
+++ b/Evidence/CacheViewExpirationReport.docx
@@ -47,13 +47,6 @@
       </w:r>
     </w:p>
     <w:p>
-      <w:pPr>
-        <w:rPr>
-          <w:rFonts w:ascii="Calibri" w:hAnsi="Calibri" w:cs="Calibri"/>
-          <w:sz w:val="22"/>
-          <w:szCs w:val="22"/>
-        </w:rPr>
-      </w:pPr>
       <w:hyperlink r:id="rId8" w:history="1">
         <w:r>
           <w:rPr>
@@ -113,6 +106,93 @@
           <w:sz w:val="22"/>
           <w:szCs w:val="22"/>
         </w:rPr>
+        <w:t>Sample repository:</w:t>
+      </w:r>
+      <w:r>
+        <w:rPr>
+          <w:rFonts w:ascii="Calibri" w:hAnsi="Calibri" w:cs="Calibri"/>
+          <w:sz w:val="22"/>
+          <w:szCs w:val="22"/>
+        </w:rPr>
+        <w:t xml:space="preserve"> </w:t>
+      </w:r>
+      <w:hyperlink r:id="rId9" w:history="1">
+        <w:r>
+          <w:rPr>
+            <w:rStyle w:val="Hyperlink"/>
+            <w:rFonts w:ascii="Calibri" w:hAnsi="Calibri" w:cs="Calibri"/>
+            <w:sz w:val="22"/>
+            <w:szCs w:val="22"/>
+          </w:rPr>
+          <w:t>https://github.com/NanthiniMahalingam/CacheViewExpirationBehavior/tree/main/CacheViewExpiration</w:t>
+        </w:r>
+      </w:hyperlink>
+      <w:r>
+        <w:rPr>
+          <w:rFonts w:ascii="Calibri" w:hAnsi="Calibri" w:cs="Calibri"/>
+          <w:sz w:val="22"/>
+          <w:szCs w:val="22"/>
+        </w:rPr>
+        <w:t xml:space="preserve">  </w:t>
+      </w:r>
+    </w:p>
+    <w:p>
+      <w:pPr>
+        <w:rPr>
+          <w:rFonts w:ascii="Calibri" w:hAnsi="Calibri" w:cs="Calibri"/>
+          <w:sz w:val="22"/>
+          <w:szCs w:val="22"/>
+        </w:rPr>
+      </w:pPr>
+      <w:r>
+        <w:rPr>
+          <w:rFonts w:ascii="Calibri" w:hAnsi="Calibri" w:cs="Calibri"/>
+          <w:b/>
+          <w:bCs/>
+          <w:sz w:val="22"/>
+          <w:szCs w:val="22"/>
+        </w:rPr>
+        <w:t>Evidence:</w:t>
+      </w:r>
+      <w:r>
+        <w:rPr>
+          <w:rFonts w:ascii="Calibri" w:hAnsi="Calibri" w:cs="Calibri"/>
+          <w:sz w:val="22"/>
+          <w:szCs w:val="22"/>
+        </w:rPr>
+        <w:t xml:space="preserve"> </w:t>
+      </w:r>
+      <w:hyperlink r:id="rId10" w:history="1">
+        <w:r>
+          <w:rPr>
+            <w:rStyle w:val="Hyperlink"/>
+            <w:rFonts w:ascii="Calibri" w:hAnsi="Calibri" w:cs="Calibri"/>
+            <w:sz w:val="22"/>
+            <w:szCs w:val="22"/>
+          </w:rPr>
+          <w:t>https://github.com/NanthiniMahalingam/CacheViewExpirationBehavior/tree/main/Evidence</w:t>
+        </w:r>
+      </w:hyperlink>
+      <w:r>
+        <w:t xml:space="preserve"> </w:t>
+      </w:r>
+    </w:p>
+    <w:p>
+      <w:pPr>
+        <w:rPr>
+          <w:rFonts w:ascii="Calibri" w:hAnsi="Calibri" w:cs="Calibri"/>
+          <w:sz w:val="22"/>
+          <w:szCs w:val="22"/>
+        </w:rPr>
+      </w:pPr>
+      <w:r>
+        <w:rPr>
+          <w:rFonts w:ascii="Calibri" w:hAnsi="Calibri" w:cs="Calibri"/>
+          <w:b/>
+          <w:bCs/>
+          <w:sz w:val="22"/>
+          <w:szCs w:val="22"/>
+        </w:rPr>
         <w:t>Blazor web app Configurations tested in</w:t>
       </w:r>
       <w:r>
@@ -121,28 +201,15 @@
           <w:sz w:val="22"/>
           <w:szCs w:val="22"/>
         </w:rPr>
-        <w:t>:  </w:t>
+        <w:t>: Static</w:t>
       </w:r>
-    </w:p>
-    <w:p>
-      <w:pPr>
-        <w:numPr>
-          <w:ilvl w:val="0"/>
-          <w:numId w:val="1"/>
-        </w:numPr>
-        <w:rPr>
-          <w:rFonts w:ascii="Calibri" w:hAnsi="Calibri" w:cs="Calibri"/>
-          <w:sz w:val="22"/>
-          <w:szCs w:val="22"/>
-        </w:rPr>
-      </w:pPr>
       <w:r>
         <w:rPr>
           <w:rFonts w:ascii="Calibri" w:hAnsi="Calibri" w:cs="Calibri"/>
           <w:sz w:val="22"/>
           <w:szCs w:val="22"/>
         </w:rPr>
-        <w:t xml:space="preserve">Interactive </w:t>
+        <w:t xml:space="preserve"> </w:t>
       </w:r>
       <w:r>
         <w:rPr>
@@ -157,6 +224,8 @@
       <w:pPr>
         <w:rPr>
           <w:rFonts w:ascii="Calibri" w:hAnsi="Calibri" w:cs="Calibri"/>
+          <w:b/>
+          <w:bCs/>
           <w:sz w:val="22"/>
           <w:szCs w:val="22"/>
         </w:rPr>
@@ -164,10 +233,12 @@
       <w:r>
         <w:rPr>
           <w:rFonts w:ascii="Calibri" w:hAnsi="Calibri" w:cs="Calibri"/>
-          <w:sz w:val="22"/>
-          <w:szCs w:val="22"/>
-        </w:rPr>
-        <w:t> </w:t>
+          <w:b/>
+          <w:bCs/>
+          <w:sz w:val="22"/>
+          <w:szCs w:val="22"/>
+        </w:rPr>
+        <w:t>.NET SDK:</w:t>
       </w:r>
     </w:p>
     <w:p>
@@ -181,28 +252,14 @@
       <w:r>
         <w:rPr>
           <w:rFonts w:ascii="Calibri" w:hAnsi="Calibri" w:cs="Calibri"/>
-          <w:b/>
-          <w:bCs/>
-          <w:sz w:val="22"/>
-          <w:szCs w:val="22"/>
-        </w:rPr>
-        <w:t>Environment:</w:t>
-      </w:r>
-      <w:r>
-        <w:rPr>
-          <w:rFonts w:ascii="Calibri" w:hAnsi="Calibri" w:cs="Calibri"/>
-          <w:sz w:val="22"/>
-          <w:szCs w:val="22"/>
-        </w:rPr>
-        <w:t> </w:t>
+          <w:sz w:val="22"/>
+          <w:szCs w:val="22"/>
+        </w:rPr>
+        <w:t xml:space="preserve"> Version:           11.0.100-rc.1.26425.128</w:t>
       </w:r>
     </w:p>
     <w:p>
       <w:pPr>
-        <w:numPr>
-          <w:ilvl w:val="0"/>
-          <w:numId w:val="2"/>
-        </w:numPr>
         <w:rPr>
           <w:rFonts w:ascii="Calibri" w:hAnsi="Calibri" w:cs="Calibri"/>
           <w:sz w:val="22"/>
@@ -215,31 +272,11 @@
           <w:sz w:val="22"/>
           <w:szCs w:val="22"/>
         </w:rPr>
-        <w:t>SDK: .NET 11 Preview 7 (</w:t>
-      </w:r>
-      <w:r>
-        <w:rPr>
-          <w:rFonts w:ascii="Calibri" w:hAnsi="Calibri" w:cs="Calibri"/>
-          <w:sz w:val="22"/>
-          <w:szCs w:val="22"/>
-        </w:rPr>
-        <w:t>11.0.100-rc.1.26425.128</w:t>
-      </w:r>
-      <w:r>
-        <w:rPr>
-          <w:rFonts w:ascii="Calibri" w:hAnsi="Calibri" w:cs="Calibri"/>
-          <w:sz w:val="22"/>
-          <w:szCs w:val="22"/>
-        </w:rPr>
-        <w:t>)  </w:t>
+        <w:t xml:space="preserve"> Commit:            3551975be0</w:t>
       </w:r>
     </w:p>
     <w:p>
       <w:pPr>
-        <w:numPr>
-          <w:ilvl w:val="0"/>
-          <w:numId w:val="3"/>
-        </w:numPr>
         <w:rPr>
           <w:rFonts w:ascii="Calibri" w:hAnsi="Calibri" w:cs="Calibri"/>
           <w:sz w:val="22"/>
@@ -252,15 +289,29 @@
           <w:sz w:val="22"/>
           <w:szCs w:val="22"/>
         </w:rPr>
-        <w:t>OS: Windows 11  </w:t>
+        <w:t xml:space="preserve"> Workload version:  11.0.100-</w:t>
+      </w:r>
+      <w:proofErr w:type="gramStart"/>
+      <w:r>
+        <w:rPr>
+          <w:rFonts w:ascii="Calibri" w:hAnsi="Calibri" w:cs="Calibri"/>
+          <w:sz w:val="22"/>
+          <w:szCs w:val="22"/>
+        </w:rPr>
+        <w:t>manifests.a</w:t>
+      </w:r>
+      <w:proofErr w:type="gramEnd"/>
+      <w:r>
+        <w:rPr>
+          <w:rFonts w:ascii="Calibri" w:hAnsi="Calibri" w:cs="Calibri"/>
+          <w:sz w:val="22"/>
+          <w:szCs w:val="22"/>
+        </w:rPr>
+        <w:t>6e318ce</w:t>
       </w:r>
     </w:p>
     <w:p>
       <w:pPr>
-        <w:numPr>
-          <w:ilvl w:val="0"/>
-          <w:numId w:val="4"/>
-        </w:numPr>
         <w:rPr>
           <w:rFonts w:ascii="Calibri" w:hAnsi="Calibri" w:cs="Calibri"/>
           <w:sz w:val="22"/>
@@ -273,7 +324,25 @@
           <w:sz w:val="22"/>
           <w:szCs w:val="22"/>
         </w:rPr>
-        <w:t>Browser: Edge</w:t>
+        <w:t xml:space="preserve"> </w:t>
+      </w:r>
+      <w:proofErr w:type="spellStart"/>
+      <w:r>
+        <w:rPr>
+          <w:rFonts w:ascii="Calibri" w:hAnsi="Calibri" w:cs="Calibri"/>
+          <w:sz w:val="22"/>
+          <w:szCs w:val="22"/>
+        </w:rPr>
+        <w:t>MSBuild</w:t>
+      </w:r>
+      <w:proofErr w:type="spellEnd"/>
+      <w:r>
+        <w:rPr>
+          <w:rFonts w:ascii="Calibri" w:hAnsi="Calibri" w:cs="Calibri"/>
+          <w:sz w:val="22"/>
+          <w:szCs w:val="22"/>
+        </w:rPr>
+        <w:t xml:space="preserve"> version:   18.11.0-1.26425.128+3551975be</w:t>
       </w:r>
     </w:p>
     <w:p>
@@ -284,6 +353,222 @@
           <w:szCs w:val="22"/>
         </w:rPr>
       </w:pPr>
+    </w:p>
+    <w:p>
+      <w:pPr>
+        <w:rPr>
+          <w:rFonts w:ascii="Calibri" w:hAnsi="Calibri" w:cs="Calibri"/>
+          <w:b/>
+          <w:bCs/>
+          <w:sz w:val="22"/>
+          <w:szCs w:val="22"/>
+        </w:rPr>
+      </w:pPr>
+      <w:r>
+        <w:rPr>
+          <w:rFonts w:ascii="Calibri" w:hAnsi="Calibri" w:cs="Calibri"/>
+          <w:b/>
+          <w:bCs/>
+          <w:sz w:val="22"/>
+          <w:szCs w:val="22"/>
+        </w:rPr>
+        <w:t>Runtime Environment:</w:t>
+      </w:r>
+    </w:p>
+    <w:p>
+      <w:pPr>
+        <w:rPr>
+          <w:rFonts w:ascii="Calibri" w:hAnsi="Calibri" w:cs="Calibri"/>
+          <w:sz w:val="22"/>
+          <w:szCs w:val="22"/>
+        </w:rPr>
+      </w:pPr>
+      <w:r>
+        <w:rPr>
+          <w:rFonts w:ascii="Calibri" w:hAnsi="Calibri" w:cs="Calibri"/>
+          <w:sz w:val="22"/>
+          <w:szCs w:val="22"/>
+        </w:rPr>
+        <w:t xml:space="preserve"> OS Name:     Windows</w:t>
+      </w:r>
+    </w:p>
+    <w:p>
+      <w:pPr>
+        <w:rPr>
+          <w:rFonts w:ascii="Calibri" w:hAnsi="Calibri" w:cs="Calibri"/>
+          <w:sz w:val="22"/>
+          <w:szCs w:val="22"/>
+        </w:rPr>
+      </w:pPr>
+      <w:r>
+        <w:rPr>
+          <w:rFonts w:ascii="Calibri" w:hAnsi="Calibri" w:cs="Calibri"/>
+          <w:sz w:val="22"/>
+          <w:szCs w:val="22"/>
+        </w:rPr>
+        <w:t xml:space="preserve"> OS Version</w:t>
+      </w:r>
+      <w:proofErr w:type="gramStart"/>
+      <w:r>
+        <w:rPr>
+          <w:rFonts w:ascii="Calibri" w:hAnsi="Calibri" w:cs="Calibri"/>
+          <w:sz w:val="22"/>
+          <w:szCs w:val="22"/>
+        </w:rPr>
+        <w:t>:  10.0</w:t>
+      </w:r>
+      <w:proofErr w:type="gramEnd"/>
+      <w:r>
+        <w:rPr>
+          <w:rFonts w:ascii="Calibri" w:hAnsi="Calibri" w:cs="Calibri"/>
+          <w:sz w:val="22"/>
+          <w:szCs w:val="22"/>
+        </w:rPr>
+        <w:t>.26100</w:t>
+      </w:r>
+    </w:p>
+    <w:p>
+      <w:pPr>
+        <w:rPr>
+          <w:rFonts w:ascii="Calibri" w:hAnsi="Calibri" w:cs="Calibri"/>
+          <w:sz w:val="22"/>
+          <w:szCs w:val="22"/>
+        </w:rPr>
+      </w:pPr>
+      <w:r>
+        <w:rPr>
+          <w:rFonts w:ascii="Calibri" w:hAnsi="Calibri" w:cs="Calibri"/>
+          <w:sz w:val="22"/>
+          <w:szCs w:val="22"/>
+        </w:rPr>
+        <w:t xml:space="preserve"> OS Platform: Windows</w:t>
+      </w:r>
+    </w:p>
+    <w:p>
+      <w:pPr>
+        <w:rPr>
+          <w:rFonts w:ascii="Calibri" w:hAnsi="Calibri" w:cs="Calibri"/>
+          <w:sz w:val="22"/>
+          <w:szCs w:val="22"/>
+        </w:rPr>
+      </w:pPr>
+      <w:r>
+        <w:rPr>
+          <w:rFonts w:ascii="Calibri" w:hAnsi="Calibri" w:cs="Calibri"/>
+          <w:sz w:val="22"/>
+          <w:szCs w:val="22"/>
+        </w:rPr>
+        <w:t xml:space="preserve"> RID:         win-x64</w:t>
+      </w:r>
+    </w:p>
+    <w:p>
+      <w:pPr>
+        <w:rPr>
+          <w:rFonts w:ascii="Calibri" w:hAnsi="Calibri" w:cs="Calibri"/>
+          <w:sz w:val="22"/>
+          <w:szCs w:val="22"/>
+        </w:rPr>
+      </w:pPr>
+      <w:r>
+        <w:rPr>
+          <w:rFonts w:ascii="Calibri" w:hAnsi="Calibri" w:cs="Calibri"/>
+          <w:sz w:val="22"/>
+          <w:szCs w:val="22"/>
+        </w:rPr>
+        <w:t xml:space="preserve"> Base Path:   C:\Program Files\dotnet\</w:t>
+      </w:r>
+      <w:proofErr w:type="spellStart"/>
+      <w:r>
+        <w:rPr>
+          <w:rFonts w:ascii="Calibri" w:hAnsi="Calibri" w:cs="Calibri"/>
+          <w:sz w:val="22"/>
+          <w:szCs w:val="22"/>
+        </w:rPr>
+        <w:t>sdk</w:t>
+      </w:r>
+      <w:proofErr w:type="spellEnd"/>
+      <w:r>
+        <w:rPr>
+          <w:rFonts w:ascii="Calibri" w:hAnsi="Calibri" w:cs="Calibri"/>
+          <w:sz w:val="22"/>
+          <w:szCs w:val="22"/>
+        </w:rPr>
+        <w:t>\11.0.100-rc.1.26425.128</w:t>
+      </w:r>
+    </w:p>
+    <w:p>
+      <w:pPr>
+        <w:rPr>
+          <w:rFonts w:ascii="Calibri" w:hAnsi="Calibri" w:cs="Calibri"/>
+          <w:sz w:val="22"/>
+          <w:szCs w:val="22"/>
+        </w:rPr>
+      </w:pPr>
+      <w:r>
+        <w:rPr>
+          <w:rFonts w:ascii="Calibri" w:hAnsi="Calibri" w:cs="Calibri"/>
+          <w:b/>
+          <w:bCs/>
+          <w:sz w:val="22"/>
+          <w:szCs w:val="22"/>
+        </w:rPr>
+        <w:t>Browser:</w:t>
+      </w:r>
+      <w:r>
+        <w:rPr>
+          <w:rFonts w:ascii="Calibri" w:hAnsi="Calibri" w:cs="Calibri"/>
+          <w:sz w:val="22"/>
+          <w:szCs w:val="22"/>
+        </w:rPr>
+        <w:t> </w:t>
+      </w:r>
+      <w:r>
+        <w:rPr>
+          <w:rFonts w:ascii="Calibri" w:hAnsi="Calibri" w:cs="Calibri"/>
+          <w:sz w:val="22"/>
+          <w:szCs w:val="22"/>
+        </w:rPr>
+        <w:t xml:space="preserve">Microsoft </w:t>
+      </w:r>
+      <w:r>
+        <w:rPr>
+          <w:rFonts w:ascii="Calibri" w:hAnsi="Calibri" w:cs="Calibri"/>
+          <w:sz w:val="22"/>
+          <w:szCs w:val="22"/>
+        </w:rPr>
+        <w:t>Edge</w:t>
+      </w:r>
+    </w:p>
+    <w:p>
+      <w:pPr>
+        <w:rPr>
+          <w:rFonts w:ascii="Calibri" w:hAnsi="Calibri" w:cs="Calibri"/>
+          <w:b/>
+          <w:bCs/>
+          <w:sz w:val="22"/>
+          <w:szCs w:val="22"/>
+        </w:rPr>
+      </w:pPr>
+      <w:r>
+        <w:rPr>
+          <w:rFonts w:ascii="Calibri" w:hAnsi="Calibri" w:cs="Calibri"/>
+          <w:b/>
+          <w:bCs/>
+          <w:sz w:val="22"/>
+          <w:szCs w:val="22"/>
+        </w:rPr>
+        <w:t>Test scenarios Covered as below</w:t>
+      </w:r>
+      <w:r>
+        <w:rPr>
+          <w:rFonts w:ascii="Calibri" w:hAnsi="Calibri" w:cs="Calibri"/>
+          <w:b/>
+          <w:bCs/>
+          <w:sz w:val="22"/>
+          <w:szCs w:val="22"/>
+        </w:rPr>
+        <w:t>:</w:t>
+      </w:r>
     </w:p>
     <w:tbl>
       <w:tblPr>
@@ -292,14 +577,15 @@
         <w:tblLook w:val="04A0" w:firstRow="1" w:lastRow="0" w:firstColumn="1" w:lastColumn="0" w:noHBand="0" w:noVBand="1"/>
       </w:tblPr>
       <w:tblGrid>
-        <w:gridCol w:w="1165"/>
-        <w:gridCol w:w="5068"/>
-        <w:gridCol w:w="3117"/>
+        <w:gridCol w:w="973"/>
+        <w:gridCol w:w="4021"/>
+        <w:gridCol w:w="2276"/>
+        <w:gridCol w:w="2080"/>
       </w:tblGrid>
       <w:tr>
         <w:tc>
           <w:tcPr>
-            <w:tcW w:w="1165" w:type="dxa"/>
+            <w:tcW w:w="973" w:type="dxa"/>
           </w:tcPr>
           <w:p>
             <w:pPr>
@@ -325,7 +611,7 @@
         </w:tc>
         <w:tc>
           <w:tcPr>
-            <w:tcW w:w="5068" w:type="dxa"/>
+            <w:tcW w:w="4021" w:type="dxa"/>
           </w:tcPr>
           <w:p>
             <w:pPr>
@@ -347,7 +633,7 @@
         </w:tc>
         <w:tc>
           <w:tcPr>
-            <w:tcW w:w="3117" w:type="dxa"/>
+            <w:tcW w:w="2276" w:type="dxa"/>
           </w:tcPr>
           <w:p>
             <w:pPr>
@@ -364,6 +650,28 @@
                 <w:szCs w:val="22"/>
               </w:rPr>
               <w:t>Edge result</w:t>
+            </w:r>
+          </w:p>
+        </w:tc>
+        <w:tc>
+          <w:tcPr>
+            <w:tcW w:w="2080" w:type="dxa"/>
+          </w:tcPr>
+          <w:p>
+            <w:pPr>
+              <w:rPr>
+                <w:rFonts w:ascii="Calibri" w:hAnsi="Calibri" w:cs="Calibri"/>
+                <w:sz w:val="22"/>
+                <w:szCs w:val="22"/>
+              </w:rPr>
+            </w:pPr>
+            <w:r>
+              <w:rPr>
+                <w:rFonts w:ascii="Calibri" w:hAnsi="Calibri" w:cs="Calibri"/>
+                <w:sz w:val="22"/>
+                <w:szCs w:val="22"/>
+              </w:rPr>
+              <w:t>Evidence</w:t>
             </w:r>
           </w:p>
         </w:tc>
@@ -371,7 +679,7 @@
       <w:tr>
         <w:tc>
           <w:tcPr>
-            <w:tcW w:w="1165" w:type="dxa"/>
+            <w:tcW w:w="973" w:type="dxa"/>
           </w:tcPr>
           <w:p>
             <w:pPr>
@@ -393,7 +701,7 @@
         </w:tc>
         <w:tc>
           <w:tcPr>
-            <w:tcW w:w="5068" w:type="dxa"/>
+            <w:tcW w:w="4021" w:type="dxa"/>
           </w:tcPr>
           <w:p>
             <w:pPr>
@@ -442,53 +750,327 @@
         </w:tc>
         <w:tc>
           <w:tcPr>
-            <w:tcW w:w="3117" w:type="dxa"/>
-          </w:tcPr>
-          <w:p>
-            <w:pPr>
-              <w:rPr>
-                <w:rFonts w:ascii="Calibri" w:hAnsi="Calibri" w:cs="Calibri"/>
-                <w:sz w:val="22"/>
-                <w:szCs w:val="22"/>
-              </w:rPr>
-            </w:pPr>
-            <w:r>
-              <w:rPr>
-                <w:rFonts w:ascii="Calibri" w:hAnsi="Calibri" w:cs="Calibri"/>
-                <w:sz w:val="22"/>
-                <w:szCs w:val="22"/>
-              </w:rPr>
-              <w:t>Pass</w:t>
-            </w:r>
+            <w:tcW w:w="2276" w:type="dxa"/>
+          </w:tcPr>
+          <w:p>
+            <w:pPr>
+              <w:rPr>
+                <w:rFonts w:ascii="Calibri" w:hAnsi="Calibri" w:cs="Calibri"/>
+                <w:sz w:val="22"/>
+                <w:szCs w:val="22"/>
+              </w:rPr>
+            </w:pPr>
+            <w:r>
+              <w:rPr>
+                <w:rFonts w:ascii="Calibri" w:hAnsi="Calibri" w:cs="Calibri"/>
+                <w:sz w:val="22"/>
+                <w:szCs w:val="22"/>
+              </w:rPr>
+              <w:t xml:space="preserve">Pass </w:t>
+            </w:r>
+          </w:p>
+        </w:tc>
+        <w:tc>
+          <w:tcPr>
+            <w:tcW w:w="2080" w:type="dxa"/>
+          </w:tcPr>
+          <w:p>
+            <w:pPr>
+              <w:rPr>
+                <w:rFonts w:ascii="Calibri" w:hAnsi="Calibri" w:cs="Calibri"/>
+                <w:sz w:val="22"/>
+                <w:szCs w:val="22"/>
+              </w:rPr>
+            </w:pPr>
+            <w:hyperlink r:id="rId11" w:history="1">
+              <w:r>
+                <w:rPr>
+                  <w:rStyle w:val="Hyperlink"/>
+                  <w:rFonts w:ascii="Calibri" w:hAnsi="Calibri" w:cs="Calibri"/>
+                  <w:sz w:val="22"/>
+                  <w:szCs w:val="22"/>
+                </w:rPr>
+                <w:t xml:space="preserve">Expire </w:t>
+              </w:r>
+              <w:proofErr w:type="gramStart"/>
+              <w:r>
+                <w:rPr>
+                  <w:rStyle w:val="Hyperlink"/>
+                  <w:rFonts w:ascii="Calibri" w:hAnsi="Calibri" w:cs="Calibri"/>
+                  <w:sz w:val="22"/>
+                  <w:szCs w:val="22"/>
+                </w:rPr>
+                <w:t>Value  on</w:t>
+              </w:r>
+              <w:proofErr w:type="gramEnd"/>
+              <w:r>
+                <w:rPr>
+                  <w:rStyle w:val="Hyperlink"/>
+                  <w:rFonts w:ascii="Calibri" w:hAnsi="Calibri" w:cs="Calibri"/>
+                  <w:sz w:val="22"/>
+                  <w:szCs w:val="22"/>
+                </w:rPr>
+                <w:t xml:space="preserve"> Initia</w:t>
+              </w:r>
+              <w:r>
+                <w:rPr>
+                  <w:rStyle w:val="Hyperlink"/>
+                  <w:rFonts w:ascii="Calibri" w:hAnsi="Calibri" w:cs="Calibri"/>
+                  <w:sz w:val="22"/>
+                  <w:szCs w:val="22"/>
+                </w:rPr>
+                <w:t>l Loading</w:t>
+              </w:r>
+            </w:hyperlink>
+            <w:r>
+              <w:rPr>
+                <w:rFonts w:ascii="Calibri" w:hAnsi="Calibri" w:cs="Calibri"/>
+                <w:sz w:val="22"/>
+                <w:szCs w:val="22"/>
+              </w:rPr>
+              <w:t xml:space="preserve"> ,</w:t>
+            </w:r>
+          </w:p>
+          <w:p>
+            <w:pPr>
+              <w:rPr>
+                <w:rFonts w:ascii="Calibri" w:hAnsi="Calibri" w:cs="Calibri"/>
+                <w:sz w:val="22"/>
+                <w:szCs w:val="22"/>
+              </w:rPr>
+            </w:pPr>
+          </w:p>
+          <w:p>
+            <w:pPr>
+              <w:rPr>
+                <w:rFonts w:ascii="Calibri" w:hAnsi="Calibri" w:cs="Calibri"/>
+                <w:sz w:val="22"/>
+                <w:szCs w:val="22"/>
+              </w:rPr>
+            </w:pPr>
+            <w:hyperlink r:id="rId12" w:history="1">
+              <w:r>
+                <w:rPr>
+                  <w:rStyle w:val="Hyperlink"/>
+                  <w:rFonts w:ascii="Calibri" w:hAnsi="Calibri" w:cs="Calibri"/>
+                  <w:sz w:val="22"/>
+                  <w:szCs w:val="22"/>
+                </w:rPr>
+                <w:t>Expire Value after 10 sec</w:t>
+              </w:r>
+            </w:hyperlink>
+            <w:r>
+              <w:rPr>
+                <w:rFonts w:ascii="Calibri" w:hAnsi="Calibri" w:cs="Calibri"/>
+                <w:sz w:val="22"/>
+                <w:szCs w:val="22"/>
+              </w:rPr>
+              <w:t xml:space="preserve">, </w:t>
+            </w:r>
+          </w:p>
+          <w:p>
+            <w:pPr>
+              <w:rPr>
+                <w:rFonts w:ascii="Calibri" w:hAnsi="Calibri" w:cs="Calibri"/>
+                <w:sz w:val="22"/>
+                <w:szCs w:val="22"/>
+              </w:rPr>
+            </w:pPr>
+          </w:p>
+          <w:p>
+            <w:pPr>
+              <w:rPr>
+                <w:rFonts w:ascii="Calibri" w:hAnsi="Calibri" w:cs="Calibri"/>
+                <w:sz w:val="22"/>
+                <w:szCs w:val="22"/>
+              </w:rPr>
+            </w:pPr>
+            <w:hyperlink r:id="rId13" w:history="1">
+              <w:r>
+                <w:rPr>
+                  <w:rStyle w:val="Hyperlink"/>
+                  <w:rFonts w:ascii="Calibri" w:hAnsi="Calibri" w:cs="Calibri"/>
+                  <w:sz w:val="22"/>
+                  <w:szCs w:val="22"/>
+                </w:rPr>
+                <w:t xml:space="preserve">Expire Value after </w:t>
+              </w:r>
+              <w:r>
+                <w:rPr>
+                  <w:rStyle w:val="Hyperlink"/>
+                  <w:rFonts w:ascii="Calibri" w:hAnsi="Calibri" w:cs="Calibri"/>
+                  <w:sz w:val="22"/>
+                  <w:szCs w:val="22"/>
+                </w:rPr>
+                <w:t>15</w:t>
+              </w:r>
+              <w:r>
+                <w:rPr>
+                  <w:rStyle w:val="Hyperlink"/>
+                  <w:rFonts w:ascii="Calibri" w:hAnsi="Calibri" w:cs="Calibri"/>
+                  <w:sz w:val="22"/>
+                  <w:szCs w:val="22"/>
+                </w:rPr>
+                <w:t xml:space="preserve"> sec</w:t>
+              </w:r>
+            </w:hyperlink>
+            <w:r>
+              <w:rPr>
+                <w:rFonts w:ascii="Calibri" w:hAnsi="Calibri" w:cs="Calibri"/>
+                <w:sz w:val="22"/>
+                <w:szCs w:val="22"/>
+              </w:rPr>
+              <w:t>,</w:t>
+            </w:r>
+          </w:p>
+          <w:p>
+            <w:pPr>
+              <w:rPr>
+                <w:rFonts w:ascii="Calibri" w:hAnsi="Calibri" w:cs="Calibri"/>
+                <w:sz w:val="22"/>
+                <w:szCs w:val="22"/>
+              </w:rPr>
+            </w:pPr>
+          </w:p>
+          <w:p>
+            <w:pPr>
+              <w:rPr>
+                <w:rFonts w:ascii="Calibri" w:hAnsi="Calibri" w:cs="Calibri"/>
+                <w:sz w:val="22"/>
+                <w:szCs w:val="22"/>
+              </w:rPr>
+            </w:pPr>
+            <w:hyperlink r:id="rId14" w:history="1">
+              <w:r>
+                <w:rPr>
+                  <w:rStyle w:val="Hyperlink"/>
+                  <w:rFonts w:ascii="Calibri" w:hAnsi="Calibri" w:cs="Calibri"/>
+                  <w:sz w:val="22"/>
+                  <w:szCs w:val="22"/>
+                </w:rPr>
+                <w:t xml:space="preserve">Expire Value after </w:t>
+              </w:r>
+              <w:r>
+                <w:rPr>
+                  <w:rStyle w:val="Hyperlink"/>
+                  <w:rFonts w:ascii="Calibri" w:hAnsi="Calibri" w:cs="Calibri"/>
+                  <w:sz w:val="22"/>
+                  <w:szCs w:val="22"/>
+                </w:rPr>
+                <w:t>2</w:t>
+              </w:r>
+              <w:r>
+                <w:rPr>
+                  <w:rStyle w:val="Hyperlink"/>
+                  <w:rFonts w:ascii="Calibri" w:hAnsi="Calibri" w:cs="Calibri"/>
+                  <w:sz w:val="22"/>
+                  <w:szCs w:val="22"/>
+                </w:rPr>
+                <w:t>0 sec</w:t>
+              </w:r>
+            </w:hyperlink>
+            <w:r>
+              <w:rPr>
+                <w:rFonts w:ascii="Calibri" w:hAnsi="Calibri" w:cs="Calibri"/>
+                <w:sz w:val="22"/>
+                <w:szCs w:val="22"/>
+              </w:rPr>
+              <w:t>,</w:t>
+            </w:r>
+          </w:p>
+          <w:p>
+            <w:pPr>
+              <w:rPr>
+                <w:rFonts w:ascii="Calibri" w:hAnsi="Calibri" w:cs="Calibri"/>
+                <w:sz w:val="22"/>
+                <w:szCs w:val="22"/>
+              </w:rPr>
+            </w:pPr>
+            <w:r>
+              <w:rPr>
+                <w:rFonts w:ascii="Calibri" w:hAnsi="Calibri" w:cs="Calibri"/>
+                <w:sz w:val="22"/>
+                <w:szCs w:val="22"/>
+              </w:rPr>
+              <w:t xml:space="preserve"> </w:t>
+            </w:r>
+          </w:p>
+          <w:p>
+            <w:pPr>
+              <w:rPr>
+                <w:rFonts w:ascii="Calibri" w:hAnsi="Calibri" w:cs="Calibri"/>
+                <w:sz w:val="22"/>
+                <w:szCs w:val="22"/>
+              </w:rPr>
+            </w:pPr>
+            <w:hyperlink r:id="rId15" w:history="1">
+              <w:r>
+                <w:rPr>
+                  <w:rStyle w:val="Hyperlink"/>
+                  <w:rFonts w:ascii="Calibri" w:hAnsi="Calibri" w:cs="Calibri"/>
+                  <w:sz w:val="22"/>
+                  <w:szCs w:val="22"/>
+                </w:rPr>
+                <w:t xml:space="preserve">Expire Value after </w:t>
+              </w:r>
+              <w:r>
+                <w:rPr>
+                  <w:rStyle w:val="Hyperlink"/>
+                  <w:rFonts w:ascii="Calibri" w:hAnsi="Calibri" w:cs="Calibri"/>
+                  <w:sz w:val="22"/>
+                  <w:szCs w:val="22"/>
+                </w:rPr>
+                <w:t>2</w:t>
+              </w:r>
+              <w:r>
+                <w:rPr>
+                  <w:rStyle w:val="Hyperlink"/>
+                  <w:rFonts w:ascii="Calibri" w:hAnsi="Calibri" w:cs="Calibri"/>
+                  <w:sz w:val="22"/>
+                  <w:szCs w:val="22"/>
+                </w:rPr>
+                <w:t xml:space="preserve"> </w:t>
+              </w:r>
+              <w:r>
+                <w:rPr>
+                  <w:rStyle w:val="Hyperlink"/>
+                  <w:rFonts w:ascii="Calibri" w:hAnsi="Calibri" w:cs="Calibri"/>
+                  <w:sz w:val="22"/>
+                  <w:szCs w:val="22"/>
+                </w:rPr>
+                <w:t>min</w:t>
+              </w:r>
+            </w:hyperlink>
           </w:p>
         </w:tc>
       </w:tr>
       <w:tr>
         <w:tc>
           <w:tcPr>
-            <w:tcW w:w="1165" w:type="dxa"/>
-          </w:tcPr>
-          <w:p>
-            <w:pPr>
-              <w:rPr>
-                <w:rFonts w:ascii="Calibri" w:hAnsi="Calibri" w:cs="Calibri"/>
-                <w:sz w:val="22"/>
-                <w:szCs w:val="22"/>
-              </w:rPr>
-            </w:pPr>
-            <w:r>
-              <w:rPr>
-                <w:rFonts w:ascii="Calibri" w:hAnsi="Calibri" w:cs="Calibri"/>
-                <w:sz w:val="22"/>
-                <w:szCs w:val="22"/>
-              </w:rPr>
+            <w:tcW w:w="973" w:type="dxa"/>
+          </w:tcPr>
+          <w:p>
+            <w:pPr>
+              <w:rPr>
+                <w:rFonts w:ascii="Calibri" w:hAnsi="Calibri" w:cs="Calibri"/>
+                <w:sz w:val="22"/>
+                <w:szCs w:val="22"/>
+              </w:rPr>
+            </w:pPr>
+            <w:r>
+              <w:rPr>
+                <w:rFonts w:ascii="Calibri" w:hAnsi="Calibri" w:cs="Calibri"/>
+                <w:sz w:val="22"/>
+                <w:szCs w:val="22"/>
+              </w:rPr>
+              <w:lastRenderedPageBreak/>
               <w:t>2</w:t>
             </w:r>
           </w:p>
         </w:tc>
         <w:tc>
           <w:tcPr>
-            <w:tcW w:w="5068" w:type="dxa"/>
+            <w:tcW w:w="4021" w:type="dxa"/>
           </w:tcPr>
           <w:p>
             <w:pPr>
@@ -510,7 +1092,7 @@
         </w:tc>
         <w:tc>
           <w:tcPr>
-            <w:tcW w:w="3117" w:type="dxa"/>
+            <w:tcW w:w="2276" w:type="dxa"/>
           </w:tcPr>
           <w:p>
             <w:pPr>
@@ -528,13 +1110,38 @@
               </w:rPr>
               <w:t>Pass</w:t>
             </w:r>
+          </w:p>
+        </w:tc>
+        <w:tc>
+          <w:tcPr>
+            <w:tcW w:w="2080" w:type="dxa"/>
+          </w:tcPr>
+          <w:p>
+            <w:pPr>
+              <w:rPr>
+                <w:rFonts w:ascii="Calibri" w:hAnsi="Calibri" w:cs="Calibri"/>
+                <w:sz w:val="22"/>
+                <w:szCs w:val="22"/>
+              </w:rPr>
+            </w:pPr>
+            <w:hyperlink r:id="rId16" w:history="1">
+              <w:r>
+                <w:rPr>
+                  <w:rStyle w:val="Hyperlink"/>
+                  <w:rFonts w:ascii="Calibri" w:hAnsi="Calibri" w:cs="Calibri"/>
+                  <w:sz w:val="22"/>
+                  <w:szCs w:val="22"/>
+                </w:rPr>
+                <w:t>Period based section</w:t>
+              </w:r>
+            </w:hyperlink>
           </w:p>
         </w:tc>
       </w:tr>
       <w:tr>
         <w:tc>
           <w:tcPr>
-            <w:tcW w:w="1165" w:type="dxa"/>
+            <w:tcW w:w="973" w:type="dxa"/>
           </w:tcPr>
           <w:p>
             <w:pPr>
@@ -556,7 +1163,7 @@
         </w:tc>
         <w:tc>
           <w:tcPr>
-            <w:tcW w:w="5068" w:type="dxa"/>
+            <w:tcW w:w="4021" w:type="dxa"/>
           </w:tcPr>
           <w:p>
             <w:pPr>
@@ -587,7 +1194,7 @@
         </w:tc>
         <w:tc>
           <w:tcPr>
-            <w:tcW w:w="3117" w:type="dxa"/>
+            <w:tcW w:w="2276" w:type="dxa"/>
           </w:tcPr>
           <w:p>
             <w:pPr>
@@ -605,13 +1212,38 @@
               </w:rPr>
               <w:t>pass</w:t>
             </w:r>
+          </w:p>
+        </w:tc>
+        <w:tc>
+          <w:tcPr>
+            <w:tcW w:w="2080" w:type="dxa"/>
+          </w:tcPr>
+          <w:p>
+            <w:pPr>
+              <w:rPr>
+                <w:rFonts w:ascii="Calibri" w:hAnsi="Calibri" w:cs="Calibri"/>
+                <w:sz w:val="22"/>
+                <w:szCs w:val="22"/>
+              </w:rPr>
+            </w:pPr>
+            <w:hyperlink r:id="rId17" w:history="1">
+              <w:r>
+                <w:rPr>
+                  <w:rStyle w:val="Hyperlink"/>
+                  <w:rFonts w:ascii="Calibri" w:hAnsi="Calibri" w:cs="Calibri"/>
+                  <w:sz w:val="22"/>
+                  <w:szCs w:val="22"/>
+                </w:rPr>
+                <w:t>Moment based section</w:t>
+              </w:r>
+            </w:hyperlink>
           </w:p>
         </w:tc>
       </w:tr>
       <w:tr>
         <w:tc>
           <w:tcPr>
-            <w:tcW w:w="1165" w:type="dxa"/>
+            <w:tcW w:w="973" w:type="dxa"/>
           </w:tcPr>
           <w:p>
             <w:pPr>
@@ -633,7 +1265,7 @@
         </w:tc>
         <w:tc>
           <w:tcPr>
-            <w:tcW w:w="5068" w:type="dxa"/>
+            <w:tcW w:w="4021" w:type="dxa"/>
           </w:tcPr>
           <w:p>
             <w:pPr>
@@ -664,7 +1296,7 @@
         </w:tc>
         <w:tc>
           <w:tcPr>
-            <w:tcW w:w="3117" w:type="dxa"/>
+            <w:tcW w:w="2276" w:type="dxa"/>
           </w:tcPr>
           <w:p>
             <w:pPr>
@@ -682,13 +1314,38 @@
               </w:rPr>
               <w:t>Pass</w:t>
             </w:r>
+          </w:p>
+        </w:tc>
+        <w:tc>
+          <w:tcPr>
+            <w:tcW w:w="2080" w:type="dxa"/>
+          </w:tcPr>
+          <w:p>
+            <w:pPr>
+              <w:rPr>
+                <w:rFonts w:ascii="Calibri" w:hAnsi="Calibri" w:cs="Calibri"/>
+                <w:sz w:val="22"/>
+                <w:szCs w:val="22"/>
+              </w:rPr>
+            </w:pPr>
+            <w:hyperlink r:id="rId18" w:history="1">
+              <w:r>
+                <w:rPr>
+                  <w:rStyle w:val="Hyperlink"/>
+                  <w:rFonts w:ascii="Calibri" w:hAnsi="Calibri" w:cs="Calibri"/>
+                  <w:sz w:val="22"/>
+                  <w:szCs w:val="22"/>
+                </w:rPr>
+                <w:t>Expire sliding with absolute time of expire after</w:t>
+              </w:r>
+            </w:hyperlink>
           </w:p>
         </w:tc>
       </w:tr>
       <w:tr>
         <w:tc>
           <w:tcPr>
-            <w:tcW w:w="1165" w:type="dxa"/>
+            <w:tcW w:w="973" w:type="dxa"/>
           </w:tcPr>
           <w:p>
             <w:pPr>
@@ -710,7 +1367,7 @@
         </w:tc>
         <w:tc>
           <w:tcPr>
-            <w:tcW w:w="5068" w:type="dxa"/>
+            <w:tcW w:w="4021" w:type="dxa"/>
           </w:tcPr>
           <w:p>
             <w:pPr>
@@ -741,7 +1398,7 @@
         </w:tc>
         <w:tc>
           <w:tcPr>
-            <w:tcW w:w="3117" w:type="dxa"/>
+            <w:tcW w:w="2276" w:type="dxa"/>
           </w:tcPr>
           <w:p>
             <w:pPr>
@@ -758,6 +1415,39 @@
                 <w:szCs w:val="22"/>
               </w:rPr>
               <w:t>Pass</w:t>
+            </w:r>
+          </w:p>
+        </w:tc>
+        <w:tc>
+          <w:tcPr>
+            <w:tcW w:w="2080" w:type="dxa"/>
+          </w:tcPr>
+          <w:p>
+            <w:pPr>
+              <w:rPr>
+                <w:rFonts w:ascii="Calibri" w:hAnsi="Calibri" w:cs="Calibri"/>
+                <w:sz w:val="22"/>
+                <w:szCs w:val="22"/>
+              </w:rPr>
+            </w:pPr>
+            <w:hyperlink r:id="rId19" w:history="1">
+              <w:r>
+                <w:rPr>
+                  <w:rStyle w:val="Hyperlink"/>
+                  <w:rFonts w:ascii="Calibri" w:hAnsi="Calibri" w:cs="Calibri"/>
+                  <w:sz w:val="22"/>
+                  <w:szCs w:val="22"/>
+                </w:rPr>
+                <w:t>No expiration with default</w:t>
+              </w:r>
+            </w:hyperlink>
+            <w:r>
+              <w:rPr>
+                <w:rFonts w:ascii="Calibri" w:hAnsi="Calibri" w:cs="Calibri"/>
+                <w:sz w:val="22"/>
+                <w:szCs w:val="22"/>
+              </w:rPr>
+              <w:t xml:space="preserve"> </w:t>
             </w:r>
           </w:p>
         </w:tc>
@@ -765,7 +1455,7 @@
       <w:tr>
         <w:tc>
           <w:tcPr>
-            <w:tcW w:w="1165" w:type="dxa"/>
+            <w:tcW w:w="973" w:type="dxa"/>
           </w:tcPr>
           <w:p>
             <w:pPr>
@@ -787,7 +1477,7 @@
         </w:tc>
         <w:tc>
           <w:tcPr>
-            <w:tcW w:w="5068" w:type="dxa"/>
+            <w:tcW w:w="4021" w:type="dxa"/>
           </w:tcPr>
           <w:p>
             <w:pPr>
@@ -852,7 +1542,7 @@
         </w:tc>
         <w:tc>
           <w:tcPr>
-            <w:tcW w:w="3117" w:type="dxa"/>
+            <w:tcW w:w="2276" w:type="dxa"/>
           </w:tcPr>
           <w:p>
             <w:pPr>
@@ -879,13 +1569,83 @@
                 <w:szCs w:val="22"/>
               </w:rPr>
             </w:pPr>
+          </w:p>
+        </w:tc>
+        <w:tc>
+          <w:tcPr>
+            <w:tcW w:w="2080" w:type="dxa"/>
+          </w:tcPr>
+          <w:p>
+            <w:pPr>
+              <w:rPr>
+                <w:rFonts w:ascii="Calibri" w:hAnsi="Calibri" w:cs="Calibri"/>
+                <w:sz w:val="22"/>
+                <w:szCs w:val="22"/>
+              </w:rPr>
+            </w:pPr>
+            <w:hyperlink r:id="rId20" w:history="1">
+              <w:r>
+                <w:rPr>
+                  <w:rStyle w:val="Hyperlink"/>
+                  <w:rFonts w:ascii="Calibri" w:hAnsi="Calibri" w:cs="Calibri"/>
+                  <w:sz w:val="22"/>
+                  <w:szCs w:val="22"/>
+                </w:rPr>
+                <w:t>Expire Sliding alone within 10sec</w:t>
+              </w:r>
+            </w:hyperlink>
+            <w:r>
+              <w:rPr>
+                <w:rFonts w:ascii="Calibri" w:hAnsi="Calibri" w:cs="Calibri"/>
+                <w:sz w:val="22"/>
+                <w:szCs w:val="22"/>
+              </w:rPr>
+              <w:t>,</w:t>
+            </w:r>
+          </w:p>
+          <w:p>
+            <w:pPr>
+              <w:rPr>
+                <w:rFonts w:ascii="Calibri" w:hAnsi="Calibri" w:cs="Calibri"/>
+                <w:sz w:val="22"/>
+                <w:szCs w:val="22"/>
+              </w:rPr>
+            </w:pPr>
+          </w:p>
+          <w:p>
+            <w:pPr>
+              <w:rPr>
+                <w:rFonts w:ascii="Calibri" w:hAnsi="Calibri" w:cs="Calibri"/>
+                <w:sz w:val="22"/>
+                <w:szCs w:val="22"/>
+              </w:rPr>
+            </w:pPr>
+            <w:hyperlink r:id="rId21" w:history="1">
+              <w:r>
+                <w:rPr>
+                  <w:rStyle w:val="Hyperlink"/>
+                  <w:rFonts w:ascii="Calibri" w:hAnsi="Calibri" w:cs="Calibri"/>
+                  <w:sz w:val="22"/>
+                  <w:szCs w:val="22"/>
+                </w:rPr>
+                <w:t>Expire slider alone beyond 10sec</w:t>
+              </w:r>
+            </w:hyperlink>
+            <w:r>
+              <w:rPr>
+                <w:rFonts w:ascii="Calibri" w:hAnsi="Calibri" w:cs="Calibri"/>
+                <w:sz w:val="22"/>
+                <w:szCs w:val="22"/>
+              </w:rPr>
+              <w:t>,</w:t>
+            </w:r>
           </w:p>
         </w:tc>
       </w:tr>
       <w:tr>
         <w:tc>
           <w:tcPr>
-            <w:tcW w:w="1165" w:type="dxa"/>
+            <w:tcW w:w="973" w:type="dxa"/>
           </w:tcPr>
           <w:p>
             <w:pPr>
@@ -907,7 +1667,7 @@
         </w:tc>
         <w:tc>
           <w:tcPr>
-            <w:tcW w:w="5068" w:type="dxa"/>
+            <w:tcW w:w="4021" w:type="dxa"/>
           </w:tcPr>
           <w:p>
             <w:pPr>
@@ -929,31 +1689,84 @@
         </w:tc>
         <w:tc>
           <w:tcPr>
-            <w:tcW w:w="3117" w:type="dxa"/>
-          </w:tcPr>
-          <w:p>
-            <w:pPr>
-              <w:rPr>
-                <w:rFonts w:ascii="Calibri" w:hAnsi="Calibri" w:cs="Calibri"/>
-                <w:sz w:val="22"/>
-                <w:szCs w:val="22"/>
-              </w:rPr>
-            </w:pPr>
-            <w:r>
-              <w:rPr>
-                <w:rFonts w:ascii="Calibri" w:hAnsi="Calibri" w:cs="Calibri"/>
-                <w:sz w:val="22"/>
-                <w:szCs w:val="22"/>
-              </w:rPr>
-              <w:t>Expire on case wins and pass</w:t>
-            </w:r>
+            <w:tcW w:w="2276" w:type="dxa"/>
+          </w:tcPr>
+          <w:p>
+            <w:pPr>
+              <w:rPr>
+                <w:rFonts w:ascii="Calibri" w:hAnsi="Calibri" w:cs="Calibri"/>
+                <w:sz w:val="22"/>
+                <w:szCs w:val="22"/>
+              </w:rPr>
+            </w:pPr>
+            <w:r>
+              <w:rPr>
+                <w:rFonts w:ascii="Calibri" w:hAnsi="Calibri" w:cs="Calibri"/>
+                <w:sz w:val="22"/>
+                <w:szCs w:val="22"/>
+              </w:rPr>
+              <w:t>P</w:t>
+            </w:r>
+            <w:r>
+              <w:rPr>
+                <w:rFonts w:ascii="Calibri" w:hAnsi="Calibri" w:cs="Calibri"/>
+                <w:sz w:val="22"/>
+                <w:szCs w:val="22"/>
+              </w:rPr>
+              <w:t>ass</w:t>
+            </w:r>
+          </w:p>
+        </w:tc>
+        <w:tc>
+          <w:tcPr>
+            <w:tcW w:w="2080" w:type="dxa"/>
+          </w:tcPr>
+          <w:p>
+            <w:pPr>
+              <w:rPr>
+                <w:rFonts w:ascii="Calibri" w:hAnsi="Calibri" w:cs="Calibri"/>
+                <w:sz w:val="22"/>
+                <w:szCs w:val="22"/>
+              </w:rPr>
+            </w:pPr>
+            <w:hyperlink r:id="rId22" w:history="1">
+              <w:r>
+                <w:rPr>
+                  <w:rStyle w:val="Hyperlink"/>
+                  <w:rFonts w:ascii="Calibri" w:hAnsi="Calibri" w:cs="Calibri"/>
+                  <w:sz w:val="22"/>
+                  <w:szCs w:val="22"/>
+                </w:rPr>
+                <w:t xml:space="preserve">Both period and </w:t>
+              </w:r>
+              <w:proofErr w:type="gramStart"/>
+              <w:r>
+                <w:rPr>
+                  <w:rStyle w:val="Hyperlink"/>
+                  <w:rFonts w:ascii="Calibri" w:hAnsi="Calibri" w:cs="Calibri"/>
+                  <w:sz w:val="22"/>
+                  <w:szCs w:val="22"/>
+                </w:rPr>
+                <w:t>moment based</w:t>
+              </w:r>
+              <w:proofErr w:type="gramEnd"/>
+              <w:r>
+                <w:rPr>
+                  <w:rStyle w:val="Hyperlink"/>
+                  <w:rFonts w:ascii="Calibri" w:hAnsi="Calibri" w:cs="Calibri"/>
+                  <w:sz w:val="22"/>
+                  <w:szCs w:val="22"/>
+                </w:rPr>
+                <w:t xml:space="preserve"> section</w:t>
+              </w:r>
+            </w:hyperlink>
           </w:p>
         </w:tc>
       </w:tr>
       <w:tr>
         <w:tc>
           <w:tcPr>
-            <w:tcW w:w="1165" w:type="dxa"/>
+            <w:tcW w:w="973" w:type="dxa"/>
           </w:tcPr>
           <w:p>
             <w:pPr>
@@ -975,7 +1788,7 @@
         </w:tc>
         <w:tc>
           <w:tcPr>
-            <w:tcW w:w="5068" w:type="dxa"/>
+            <w:tcW w:w="4021" w:type="dxa"/>
           </w:tcPr>
           <w:p>
             <w:pPr>
@@ -1006,7 +1819,7 @@
         </w:tc>
         <w:tc>
           <w:tcPr>
-            <w:tcW w:w="3117" w:type="dxa"/>
+            <w:tcW w:w="2276" w:type="dxa"/>
           </w:tcPr>
           <w:p>
             <w:pPr>
@@ -1023,6 +1836,67 @@
                 <w:szCs w:val="22"/>
               </w:rPr>
               <w:t>Pass</w:t>
+            </w:r>
+          </w:p>
+        </w:tc>
+        <w:tc>
+          <w:tcPr>
+            <w:tcW w:w="2080" w:type="dxa"/>
+          </w:tcPr>
+          <w:p>
+            <w:pPr>
+              <w:rPr>
+                <w:rFonts w:ascii="Calibri" w:hAnsi="Calibri" w:cs="Calibri"/>
+                <w:sz w:val="22"/>
+                <w:szCs w:val="22"/>
+              </w:rPr>
+            </w:pPr>
+            <w:hyperlink r:id="rId23" w:history="1">
+              <w:r>
+                <w:rPr>
+                  <w:rStyle w:val="Hyperlink"/>
+                  <w:rFonts w:ascii="Calibri" w:hAnsi="Calibri" w:cs="Calibri"/>
+                  <w:sz w:val="22"/>
+                  <w:szCs w:val="22"/>
+                </w:rPr>
+                <w:t>Start the app</w:t>
+              </w:r>
+            </w:hyperlink>
+            <w:r>
+              <w:rPr>
+                <w:rFonts w:ascii="Calibri" w:hAnsi="Calibri" w:cs="Calibri"/>
+                <w:sz w:val="22"/>
+                <w:szCs w:val="22"/>
+              </w:rPr>
+              <w:t xml:space="preserve">, </w:t>
+            </w:r>
+          </w:p>
+          <w:p>
+            <w:pPr>
+              <w:rPr>
+                <w:rFonts w:ascii="Calibri" w:hAnsi="Calibri" w:cs="Calibri"/>
+                <w:sz w:val="22"/>
+                <w:szCs w:val="22"/>
+              </w:rPr>
+            </w:pPr>
+            <w:hyperlink r:id="rId24" w:history="1">
+              <w:r>
+                <w:rPr>
+                  <w:rStyle w:val="Hyperlink"/>
+                  <w:rFonts w:ascii="Calibri" w:hAnsi="Calibri" w:cs="Calibri"/>
+                  <w:sz w:val="22"/>
+                  <w:szCs w:val="22"/>
+                </w:rPr>
+                <w:t>Restart the app</w:t>
+              </w:r>
+            </w:hyperlink>
+            <w:r>
+              <w:rPr>
+                <w:rFonts w:ascii="Calibri" w:hAnsi="Calibri" w:cs="Calibri"/>
+                <w:sz w:val="22"/>
+                <w:szCs w:val="22"/>
+              </w:rPr>
+              <w:t xml:space="preserve"> </w:t>
             </w:r>
           </w:p>
         </w:tc>
@@ -1085,13 +1959,13 @@
         <w:tblLook w:val="04A0" w:firstRow="1" w:lastRow="0" w:firstColumn="1" w:lastColumn="0" w:noHBand="0" w:noVBand="1"/>
       </w:tblPr>
       <w:tblGrid>
-        <w:gridCol w:w="766"/>
-        <w:gridCol w:w="1440"/>
-        <w:gridCol w:w="1433"/>
-        <w:gridCol w:w="1423"/>
-        <w:gridCol w:w="1417"/>
-        <w:gridCol w:w="1426"/>
-        <w:gridCol w:w="1445"/>
+        <w:gridCol w:w="1008"/>
+        <w:gridCol w:w="1399"/>
+        <w:gridCol w:w="1393"/>
+        <w:gridCol w:w="1383"/>
+        <w:gridCol w:w="1377"/>
+        <w:gridCol w:w="1386"/>
+        <w:gridCol w:w="1404"/>
       </w:tblGrid>
       <w:tr>
         <w:tc>
@@ -1117,22 +1991,6 @@
               </w:rPr>
               <w:t>Server time</w:t>
             </w:r>
-          </w:p>
-        </w:tc>
-        <w:tc>
-          <w:tcPr>
-            <w:tcW w:w="1429" w:type="dxa"/>
-            <w:vAlign w:val="center"/>
-          </w:tcPr>
-          <w:p>
-            <w:pPr>
-              <w:rPr>
-                <w:rFonts w:ascii="Calibri" w:hAnsi="Calibri" w:cs="Calibri"/>
-                <w:sz w:val="22"/>
-                <w:szCs w:val="22"/>
-              </w:rPr>
-            </w:pPr>
-            <w:proofErr w:type="spellStart"/>
             <w:r>
               <w:rPr>
                 <w:rFonts w:ascii="Segoe UI" w:hAnsi="Segoe UI" w:cs="Segoe UI"/>
@@ -1141,9 +1999,24 @@
                 <w:sz w:val="20"/>
                 <w:szCs w:val="20"/>
               </w:rPr>
-              <w:t>ExpiresAfter</w:t>
-            </w:r>
-            <w:proofErr w:type="spellEnd"/>
+              <w:t xml:space="preserve"> with reloading the page</w:t>
+            </w:r>
+          </w:p>
+        </w:tc>
+        <w:tc>
+          <w:tcPr>
+            <w:tcW w:w="1429" w:type="dxa"/>
+            <w:vAlign w:val="center"/>
+          </w:tcPr>
+          <w:p>
+            <w:pPr>
+              <w:rPr>
+                <w:rFonts w:ascii="Calibri" w:hAnsi="Calibri" w:cs="Calibri"/>
+                <w:sz w:val="22"/>
+                <w:szCs w:val="22"/>
+              </w:rPr>
+            </w:pPr>
+            <w:proofErr w:type="spellStart"/>
             <w:r>
               <w:rPr>
                 <w:rFonts w:ascii="Segoe UI" w:hAnsi="Segoe UI" w:cs="Segoe UI"/>
@@ -1152,8 +2025,9 @@
                 <w:sz w:val="20"/>
                 <w:szCs w:val="20"/>
               </w:rPr>
-              <w:t xml:space="preserve"> GUID</w:t>
-            </w:r>
+              <w:t>ExpiresAfter</w:t>
+            </w:r>
+            <w:proofErr w:type="spellEnd"/>
             <w:r>
               <w:rPr>
                 <w:rFonts w:ascii="Segoe UI" w:hAnsi="Segoe UI" w:cs="Segoe UI"/>
@@ -1162,17 +2036,9 @@
                 <w:sz w:val="20"/>
                 <w:szCs w:val="20"/>
               </w:rPr>
-              <w:t xml:space="preserve"> 10sec </w:t>
-            </w:r>
-          </w:p>
-        </w:tc>
-        <w:tc>
-          <w:tcPr>
-            <w:tcW w:w="1423" w:type="dxa"/>
-            <w:vAlign w:val="center"/>
-          </w:tcPr>
-          <w:p>
-            <w:pPr>
+              <w:t xml:space="preserve"> GUID</w:t>
+            </w:r>
+            <w:r>
               <w:rPr>
                 <w:rFonts w:ascii="Segoe UI" w:hAnsi="Segoe UI" w:cs="Segoe UI"/>
                 <w:b/>
@@ -1180,9 +2046,17 @@
                 <w:sz w:val="20"/>
                 <w:szCs w:val="20"/>
               </w:rPr>
-            </w:pPr>
-            <w:proofErr w:type="spellStart"/>
-            <w:r>
+              <w:t xml:space="preserve"> 10sec </w:t>
+            </w:r>
+          </w:p>
+        </w:tc>
+        <w:tc>
+          <w:tcPr>
+            <w:tcW w:w="1423" w:type="dxa"/>
+            <w:vAlign w:val="center"/>
+          </w:tcPr>
+          <w:p>
+            <w:pPr>
               <w:rPr>
                 <w:rFonts w:ascii="Segoe UI" w:hAnsi="Segoe UI" w:cs="Segoe UI"/>
                 <w:b/>
@@ -1190,18 +2064,8 @@
                 <w:sz w:val="20"/>
                 <w:szCs w:val="20"/>
               </w:rPr>
-              <w:t>ExpiresOn</w:t>
-            </w:r>
-            <w:proofErr w:type="spellEnd"/>
-          </w:p>
-          <w:p>
-            <w:pPr>
-              <w:rPr>
-                <w:rFonts w:ascii="Calibri" w:hAnsi="Calibri" w:cs="Calibri"/>
-                <w:sz w:val="22"/>
-                <w:szCs w:val="22"/>
-              </w:rPr>
-            </w:pPr>
+            </w:pPr>
+            <w:proofErr w:type="spellStart"/>
             <w:r>
               <w:rPr>
                 <w:rFonts w:ascii="Segoe UI" w:hAnsi="Segoe UI" w:cs="Segoe UI"/>
@@ -1210,8 +2074,18 @@
                 <w:sz w:val="20"/>
                 <w:szCs w:val="20"/>
               </w:rPr>
-              <w:t>GUID</w:t>
-            </w:r>
+              <w:t>ExpiresOn</w:t>
+            </w:r>
+            <w:proofErr w:type="spellEnd"/>
+          </w:p>
+          <w:p>
+            <w:pPr>
+              <w:rPr>
+                <w:rFonts w:ascii="Calibri" w:hAnsi="Calibri" w:cs="Calibri"/>
+                <w:sz w:val="22"/>
+                <w:szCs w:val="22"/>
+              </w:rPr>
+            </w:pPr>
             <w:r>
               <w:rPr>
                 <w:rFonts w:ascii="Segoe UI" w:hAnsi="Segoe UI" w:cs="Segoe UI"/>
@@ -1220,17 +2094,9 @@
                 <w:sz w:val="20"/>
                 <w:szCs w:val="20"/>
               </w:rPr>
-              <w:t xml:space="preserve"> 30sec</w:t>
-            </w:r>
-          </w:p>
-        </w:tc>
-        <w:tc>
-          <w:tcPr>
-            <w:tcW w:w="1413" w:type="dxa"/>
-            <w:vAlign w:val="center"/>
-          </w:tcPr>
-          <w:p>
-            <w:pPr>
+              <w:t>GUID</w:t>
+            </w:r>
+            <w:r>
               <w:rPr>
                 <w:rFonts w:ascii="Segoe UI" w:hAnsi="Segoe UI" w:cs="Segoe UI"/>
                 <w:b/>
@@ -1238,8 +2104,17 @@
                 <w:sz w:val="20"/>
                 <w:szCs w:val="20"/>
               </w:rPr>
-            </w:pPr>
-            <w:r>
+              <w:t xml:space="preserve"> 30sec</w:t>
+            </w:r>
+          </w:p>
+        </w:tc>
+        <w:tc>
+          <w:tcPr>
+            <w:tcW w:w="1413" w:type="dxa"/>
+            <w:vAlign w:val="center"/>
+          </w:tcPr>
+          <w:p>
+            <w:pPr>
               <w:rPr>
                 <w:rFonts w:ascii="Segoe UI" w:hAnsi="Segoe UI" w:cs="Segoe UI"/>
                 <w:b/>
@@ -1247,8 +2122,7 @@
                 <w:sz w:val="20"/>
                 <w:szCs w:val="20"/>
               </w:rPr>
-              <w:t>Sliding</w:t>
-            </w:r>
+            </w:pPr>
             <w:r>
               <w:rPr>
                 <w:rFonts w:ascii="Segoe UI" w:hAnsi="Segoe UI" w:cs="Segoe UI"/>
@@ -1257,7 +2131,7 @@
                 <w:sz w:val="20"/>
                 <w:szCs w:val="20"/>
               </w:rPr>
-              <w:t xml:space="preserve"> 10sec</w:t>
+              <w:t>Sliding</w:t>
             </w:r>
             <w:r>
               <w:rPr>
@@ -1267,17 +2141,8 @@
                 <w:sz w:val="20"/>
                 <w:szCs w:val="20"/>
               </w:rPr>
-              <w:t xml:space="preserve"> + absolute</w:t>
-            </w:r>
-          </w:p>
-          <w:p>
-            <w:pPr>
-              <w:rPr>
-                <w:rFonts w:ascii="Calibri" w:hAnsi="Calibri" w:cs="Calibri"/>
-                <w:sz w:val="22"/>
-                <w:szCs w:val="22"/>
-              </w:rPr>
-            </w:pPr>
+              <w:t xml:space="preserve"> 10sec</w:t>
+            </w:r>
             <w:r>
               <w:rPr>
                 <w:rFonts w:ascii="Segoe UI" w:hAnsi="Segoe UI" w:cs="Segoe UI"/>
@@ -1286,8 +2151,17 @@
                 <w:sz w:val="20"/>
                 <w:szCs w:val="20"/>
               </w:rPr>
-              <w:t>GUID</w:t>
-            </w:r>
+              <w:t xml:space="preserve"> + absolute</w:t>
+            </w:r>
+          </w:p>
+          <w:p>
+            <w:pPr>
+              <w:rPr>
+                <w:rFonts w:ascii="Calibri" w:hAnsi="Calibri" w:cs="Calibri"/>
+                <w:sz w:val="22"/>
+                <w:szCs w:val="22"/>
+              </w:rPr>
+            </w:pPr>
             <w:r>
               <w:rPr>
                 <w:rFonts w:ascii="Segoe UI" w:hAnsi="Segoe UI" w:cs="Segoe UI"/>
@@ -1296,17 +2170,9 @@
                 <w:sz w:val="20"/>
                 <w:szCs w:val="20"/>
               </w:rPr>
-              <w:t xml:space="preserve"> 2min</w:t>
-            </w:r>
-          </w:p>
-        </w:tc>
-        <w:tc>
-          <w:tcPr>
-            <w:tcW w:w="1407" w:type="dxa"/>
-            <w:vAlign w:val="center"/>
-          </w:tcPr>
-          <w:p>
-            <w:pPr>
+              <w:t>GUID</w:t>
+            </w:r>
+            <w:r>
               <w:rPr>
                 <w:rFonts w:ascii="Segoe UI" w:hAnsi="Segoe UI" w:cs="Segoe UI"/>
                 <w:b/>
@@ -1314,8 +2180,17 @@
                 <w:sz w:val="20"/>
                 <w:szCs w:val="20"/>
               </w:rPr>
-            </w:pPr>
-            <w:r>
+              <w:t xml:space="preserve"> 2min</w:t>
+            </w:r>
+          </w:p>
+        </w:tc>
+        <w:tc>
+          <w:tcPr>
+            <w:tcW w:w="1407" w:type="dxa"/>
+            <w:vAlign w:val="center"/>
+          </w:tcPr>
+          <w:p>
+            <w:pPr>
               <w:rPr>
                 <w:rFonts w:ascii="Segoe UI" w:hAnsi="Segoe UI" w:cs="Segoe UI"/>
                 <w:b/>
@@ -1323,16 +2198,6 @@
                 <w:sz w:val="20"/>
                 <w:szCs w:val="20"/>
               </w:rPr>
-              <w:t>Sliding only</w:t>
-            </w:r>
-          </w:p>
-          <w:p>
-            <w:pPr>
-              <w:rPr>
-                <w:rFonts w:ascii="Calibri" w:hAnsi="Calibri" w:cs="Calibri"/>
-                <w:sz w:val="22"/>
-                <w:szCs w:val="22"/>
-              </w:rPr>
             </w:pPr>
             <w:r>
               <w:rPr>
@@ -1342,8 +2207,17 @@
                 <w:sz w:val="20"/>
                 <w:szCs w:val="20"/>
               </w:rPr>
-              <w:t>GUID</w:t>
-            </w:r>
+              <w:t>Sliding only</w:t>
+            </w:r>
+          </w:p>
+          <w:p>
+            <w:pPr>
+              <w:rPr>
+                <w:rFonts w:ascii="Calibri" w:hAnsi="Calibri" w:cs="Calibri"/>
+                <w:sz w:val="22"/>
+                <w:szCs w:val="22"/>
+              </w:rPr>
+            </w:pPr>
             <w:r>
               <w:rPr>
                 <w:rFonts w:ascii="Segoe UI" w:hAnsi="Segoe UI" w:cs="Segoe UI"/>
@@ -1352,17 +2226,9 @@
                 <w:sz w:val="20"/>
                 <w:szCs w:val="20"/>
               </w:rPr>
-              <w:t xml:space="preserve"> 10sec</w:t>
-            </w:r>
-          </w:p>
-        </w:tc>
-        <w:tc>
-          <w:tcPr>
-            <w:tcW w:w="1416" w:type="dxa"/>
-            <w:vAlign w:val="center"/>
-          </w:tcPr>
-          <w:p>
-            <w:pPr>
+              <w:t>GUID</w:t>
+            </w:r>
+            <w:r>
               <w:rPr>
                 <w:rFonts w:ascii="Segoe UI" w:hAnsi="Segoe UI" w:cs="Segoe UI"/>
                 <w:b/>
@@ -1370,8 +2236,17 @@
                 <w:sz w:val="20"/>
                 <w:szCs w:val="20"/>
               </w:rPr>
-            </w:pPr>
-            <w:r>
+              <w:t xml:space="preserve"> 10sec</w:t>
+            </w:r>
+          </w:p>
+        </w:tc>
+        <w:tc>
+          <w:tcPr>
+            <w:tcW w:w="1416" w:type="dxa"/>
+            <w:vAlign w:val="center"/>
+          </w:tcPr>
+          <w:p>
+            <w:pPr>
               <w:rPr>
                 <w:rFonts w:ascii="Segoe UI" w:hAnsi="Segoe UI" w:cs="Segoe UI"/>
                 <w:b/>
@@ -1379,16 +2254,6 @@
                 <w:sz w:val="20"/>
                 <w:szCs w:val="20"/>
               </w:rPr>
-              <w:t>Default</w:t>
-            </w:r>
-          </w:p>
-          <w:p>
-            <w:pPr>
-              <w:rPr>
-                <w:rFonts w:ascii="Calibri" w:hAnsi="Calibri" w:cs="Calibri"/>
-                <w:sz w:val="22"/>
-                <w:szCs w:val="22"/>
-              </w:rPr>
             </w:pPr>
             <w:r>
               <w:rPr>
@@ -1398,17 +2263,18 @@
                 <w:sz w:val="20"/>
                 <w:szCs w:val="20"/>
               </w:rPr>
-              <w:t>GUID</w:t>
-            </w:r>
-          </w:p>
-        </w:tc>
-        <w:tc>
-          <w:tcPr>
-            <w:tcW w:w="1435" w:type="dxa"/>
-            <w:vAlign w:val="center"/>
-          </w:tcPr>
-          <w:p>
-            <w:pPr>
+              <w:t>Default</w:t>
+            </w:r>
+          </w:p>
+          <w:p>
+            <w:pPr>
+              <w:rPr>
+                <w:rFonts w:ascii="Calibri" w:hAnsi="Calibri" w:cs="Calibri"/>
+                <w:sz w:val="22"/>
+                <w:szCs w:val="22"/>
+              </w:rPr>
+            </w:pPr>
+            <w:r>
               <w:rPr>
                 <w:rFonts w:ascii="Segoe UI" w:hAnsi="Segoe UI" w:cs="Segoe UI"/>
                 <w:b/>
@@ -1416,9 +2282,17 @@
                 <w:sz w:val="20"/>
                 <w:szCs w:val="20"/>
               </w:rPr>
-            </w:pPr>
-            <w:proofErr w:type="spellStart"/>
-            <w:r>
+              <w:t>GUID</w:t>
+            </w:r>
+          </w:p>
+        </w:tc>
+        <w:tc>
+          <w:tcPr>
+            <w:tcW w:w="1435" w:type="dxa"/>
+            <w:vAlign w:val="center"/>
+          </w:tcPr>
+          <w:p>
+            <w:pPr>
               <w:rPr>
                 <w:rFonts w:ascii="Segoe UI" w:hAnsi="Segoe UI" w:cs="Segoe UI"/>
                 <w:b/>
@@ -1426,8 +2300,8 @@
                 <w:sz w:val="20"/>
                 <w:szCs w:val="20"/>
               </w:rPr>
-              <w:t>Expire</w:t>
-            </w:r>
+            </w:pPr>
+            <w:proofErr w:type="spellStart"/>
             <w:r>
               <w:rPr>
                 <w:rFonts w:ascii="Segoe UI" w:hAnsi="Segoe UI" w:cs="Segoe UI"/>
@@ -1436,9 +2310,8 @@
                 <w:sz w:val="20"/>
                 <w:szCs w:val="20"/>
               </w:rPr>
-              <w:t>After</w:t>
-            </w:r>
-            <w:proofErr w:type="spellEnd"/>
+              <w:t>Expire</w:t>
+            </w:r>
             <w:r>
               <w:rPr>
                 <w:rFonts w:ascii="Segoe UI" w:hAnsi="Segoe UI" w:cs="Segoe UI"/>
@@ -1447,9 +2320,9 @@
                 <w:sz w:val="20"/>
                 <w:szCs w:val="20"/>
               </w:rPr>
-              <w:t xml:space="preserve"> + </w:t>
-            </w:r>
-            <w:proofErr w:type="spellStart"/>
+              <w:t>After</w:t>
+            </w:r>
+            <w:proofErr w:type="spellEnd"/>
             <w:r>
               <w:rPr>
                 <w:rFonts w:ascii="Segoe UI" w:hAnsi="Segoe UI" w:cs="Segoe UI"/>
@@ -1458,8 +2331,9 @@
                 <w:sz w:val="20"/>
                 <w:szCs w:val="20"/>
               </w:rPr>
-              <w:t>Expire</w:t>
-            </w:r>
+              <w:t xml:space="preserve"> + </w:t>
+            </w:r>
+            <w:proofErr w:type="spellStart"/>
             <w:r>
               <w:rPr>
                 <w:rFonts w:ascii="Segoe UI" w:hAnsi="Segoe UI" w:cs="Segoe UI"/>
@@ -1468,18 +2342,8 @@
                 <w:sz w:val="20"/>
                 <w:szCs w:val="20"/>
               </w:rPr>
-              <w:t>On</w:t>
-            </w:r>
-            <w:proofErr w:type="spellEnd"/>
-          </w:p>
-          <w:p>
-            <w:pPr>
-              <w:rPr>
-                <w:rFonts w:ascii="Calibri" w:hAnsi="Calibri" w:cs="Calibri"/>
-                <w:sz w:val="22"/>
-                <w:szCs w:val="22"/>
-              </w:rPr>
-            </w:pPr>
+              <w:t>Expire</w:t>
+            </w:r>
             <w:r>
               <w:rPr>
                 <w:rFonts w:ascii="Segoe UI" w:hAnsi="Segoe UI" w:cs="Segoe UI"/>
@@ -1488,6 +2352,26 @@
                 <w:sz w:val="20"/>
                 <w:szCs w:val="20"/>
               </w:rPr>
+              <w:t>On</w:t>
+            </w:r>
+            <w:proofErr w:type="spellEnd"/>
+          </w:p>
+          <w:p>
+            <w:pPr>
+              <w:rPr>
+                <w:rFonts w:ascii="Calibri" w:hAnsi="Calibri" w:cs="Calibri"/>
+                <w:sz w:val="22"/>
+                <w:szCs w:val="22"/>
+              </w:rPr>
+            </w:pPr>
+            <w:r>
+              <w:rPr>
+                <w:rFonts w:ascii="Segoe UI" w:hAnsi="Segoe UI" w:cs="Segoe UI"/>
+                <w:b/>
+                <w:bCs/>
+                <w:sz w:val="20"/>
+                <w:szCs w:val="20"/>
+              </w:rPr>
               <w:t>GUID</w:t>
             </w:r>
           </w:p>
@@ -1503,6 +2387,8 @@
             <w:pPr>
               <w:rPr>
                 <w:rFonts w:ascii="Calibri" w:hAnsi="Calibri" w:cs="Calibri"/>
+                <w:b/>
+                <w:bCs/>
                 <w:sz w:val="22"/>
                 <w:szCs w:val="22"/>
               </w:rPr>
@@ -1510,6 +2396,8 @@
             <w:r>
               <w:rPr>
                 <w:rFonts w:ascii="Segoe UI" w:hAnsi="Segoe UI" w:cs="Segoe UI"/>
+                <w:b/>
+                <w:bCs/>
                 <w:sz w:val="20"/>
                 <w:szCs w:val="20"/>
               </w:rPr>
@@ -1759,6 +2647,8 @@
             <w:pPr>
               <w:rPr>
                 <w:rFonts w:ascii="Calibri" w:hAnsi="Calibri" w:cs="Calibri"/>
+                <w:b/>
+                <w:bCs/>
                 <w:sz w:val="22"/>
                 <w:szCs w:val="22"/>
               </w:rPr>
@@ -1766,42 +2656,53 @@
             <w:r>
               <w:rPr>
                 <w:rFonts w:ascii="Segoe UI" w:hAnsi="Segoe UI" w:cs="Segoe UI"/>
+                <w:b/>
+                <w:bCs/>
                 <w:sz w:val="20"/>
                 <w:szCs w:val="20"/>
               </w:rPr>
-              <w:t>+</w:t>
+              <w:lastRenderedPageBreak/>
+              <w:t xml:space="preserve">After </w:t>
             </w:r>
             <w:r>
               <w:rPr>
                 <w:rFonts w:ascii="Segoe UI" w:hAnsi="Segoe UI" w:cs="Segoe UI"/>
+                <w:b/>
+                <w:bCs/>
                 <w:sz w:val="20"/>
                 <w:szCs w:val="20"/>
               </w:rPr>
-              <w:t>10</w:t>
+              <w:t>+</w:t>
             </w:r>
             <w:r>
               <w:rPr>
                 <w:rFonts w:ascii="Segoe UI" w:hAnsi="Segoe UI" w:cs="Segoe UI"/>
+                <w:b/>
+                <w:bCs/>
                 <w:sz w:val="20"/>
                 <w:szCs w:val="20"/>
               </w:rPr>
-              <w:t xml:space="preserve"> sec</w:t>
+              <w:t>10</w:t>
             </w:r>
             <w:r>
               <w:rPr>
                 <w:rFonts w:ascii="Segoe UI" w:hAnsi="Segoe UI" w:cs="Segoe UI"/>
+                <w:b/>
+                <w:bCs/>
                 <w:sz w:val="20"/>
                 <w:szCs w:val="20"/>
               </w:rPr>
-              <w:t xml:space="preserve"> </w:t>
+              <w:t xml:space="preserve"> sec</w:t>
             </w:r>
             <w:r>
               <w:rPr>
                 <w:rFonts w:ascii="Segoe UI" w:hAnsi="Segoe UI" w:cs="Segoe UI"/>
+                <w:b/>
+                <w:bCs/>
                 <w:sz w:val="20"/>
                 <w:szCs w:val="20"/>
               </w:rPr>
-              <w:t>‏</w:t>
+              <w:t xml:space="preserve"> ‏</w:t>
             </w:r>
           </w:p>
         </w:tc>
@@ -2015,6 +2916,8 @@
             <w:pPr>
               <w:rPr>
                 <w:rFonts w:ascii="Calibri" w:hAnsi="Calibri" w:cs="Calibri"/>
+                <w:b/>
+                <w:bCs/>
                 <w:sz w:val="22"/>
                 <w:szCs w:val="22"/>
               </w:rPr>
@@ -2022,9 +2925,21 @@
             <w:r>
               <w:rPr>
                 <w:rFonts w:ascii="Segoe UI" w:hAnsi="Segoe UI" w:cs="Segoe UI"/>
+                <w:b/>
+                <w:bCs/>
                 <w:sz w:val="20"/>
                 <w:szCs w:val="20"/>
               </w:rPr>
+              <w:t xml:space="preserve">After </w:t>
+            </w:r>
+            <w:r>
+              <w:rPr>
+                <w:rFonts w:ascii="Segoe UI" w:hAnsi="Segoe UI" w:cs="Segoe UI"/>
+                <w:b/>
+                <w:bCs/>
+                <w:sz w:val="20"/>
+                <w:szCs w:val="20"/>
+              </w:rPr>
               <w:t>+15 sec</w:t>
             </w:r>
           </w:p>
@@ -2231,6 +3146,8 @@
             <w:pPr>
               <w:rPr>
                 <w:rFonts w:ascii="Calibri" w:hAnsi="Calibri" w:cs="Calibri"/>
+                <w:b/>
+                <w:bCs/>
                 <w:sz w:val="22"/>
                 <w:szCs w:val="22"/>
               </w:rPr>
@@ -2238,9 +3155,21 @@
             <w:r>
               <w:rPr>
                 <w:rFonts w:ascii="Segoe UI" w:hAnsi="Segoe UI" w:cs="Segoe UI"/>
+                <w:b/>
+                <w:bCs/>
                 <w:sz w:val="20"/>
                 <w:szCs w:val="20"/>
               </w:rPr>
+              <w:t xml:space="preserve">After </w:t>
+            </w:r>
+            <w:r>
+              <w:rPr>
+                <w:rFonts w:ascii="Segoe UI" w:hAnsi="Segoe UI" w:cs="Segoe UI"/>
+                <w:b/>
+                <w:bCs/>
+                <w:sz w:val="20"/>
+                <w:szCs w:val="20"/>
+              </w:rPr>
               <w:t>+30 sec</w:t>
             </w:r>
           </w:p>
@@ -2447,6 +3376,8 @@
             <w:pPr>
               <w:rPr>
                 <w:rFonts w:ascii="Calibri" w:hAnsi="Calibri" w:cs="Calibri"/>
+                <w:b/>
+                <w:bCs/>
                 <w:sz w:val="22"/>
                 <w:szCs w:val="22"/>
               </w:rPr>
@@ -2454,6 +3385,18 @@
             <w:r>
               <w:rPr>
                 <w:rFonts w:ascii="Segoe UI" w:hAnsi="Segoe UI" w:cs="Segoe UI"/>
+                <w:b/>
+                <w:bCs/>
+                <w:sz w:val="20"/>
+                <w:szCs w:val="20"/>
+              </w:rPr>
+              <w:t xml:space="preserve">After   </w:t>
+            </w:r>
+            <w:r>
+              <w:rPr>
+                <w:rFonts w:ascii="Segoe UI" w:hAnsi="Segoe UI" w:cs="Segoe UI"/>
+                <w:b/>
+                <w:bCs/>
                 <w:sz w:val="20"/>
                 <w:szCs w:val="20"/>
               </w:rPr>
@@ -2687,6 +3630,70 @@
           <w:sz w:val="22"/>
           <w:szCs w:val="22"/>
         </w:rPr>
+        <w:t>Test not covered scenario:</w:t>
+      </w:r>
+      <w:r>
+        <w:rPr>
+          <w:rFonts w:ascii="Calibri" w:hAnsi="Calibri" w:cs="Calibri"/>
+          <w:sz w:val="22"/>
+          <w:szCs w:val="22"/>
+        </w:rPr>
+        <w:t xml:space="preserve"> None</w:t>
+      </w:r>
+    </w:p>
+    <w:p>
+      <w:pPr>
+        <w:rPr>
+          <w:rFonts w:ascii="Calibri" w:hAnsi="Calibri" w:cs="Calibri"/>
+          <w:sz w:val="22"/>
+          <w:szCs w:val="22"/>
+        </w:rPr>
+      </w:pPr>
+      <w:r>
+        <w:rPr>
+          <w:rFonts w:ascii="Calibri" w:hAnsi="Calibri" w:cs="Calibri"/>
+          <w:b/>
+          <w:bCs/>
+          <w:sz w:val="22"/>
+          <w:szCs w:val="22"/>
+        </w:rPr>
+        <w:t>Test commit version:</w:t>
+      </w:r>
+      <w:r>
+        <w:rPr>
+          <w:rFonts w:ascii="Calibri" w:hAnsi="Calibri" w:cs="Calibri"/>
+          <w:b/>
+          <w:bCs/>
+          <w:sz w:val="22"/>
+          <w:szCs w:val="22"/>
+        </w:rPr>
+        <w:t xml:space="preserve"> </w:t>
+      </w:r>
+      <w:r>
+        <w:rPr>
+          <w:rFonts w:ascii="Calibri" w:hAnsi="Calibri" w:cs="Calibri"/>
+          <w:sz w:val="22"/>
+          <w:szCs w:val="22"/>
+        </w:rPr>
+        <w:t>4fe3f6d803c2a8a5a80935a96d01103c40576049</w:t>
+      </w:r>
+    </w:p>
+    <w:p>
+      <w:pPr>
+        <w:rPr>
+          <w:rFonts w:ascii="Calibri" w:hAnsi="Calibri" w:cs="Calibri"/>
+          <w:sz w:val="22"/>
+          <w:szCs w:val="22"/>
+        </w:rPr>
+      </w:pPr>
+      <w:r>
+        <w:rPr>
+          <w:rFonts w:ascii="Calibri" w:hAnsi="Calibri" w:cs="Calibri"/>
+          <w:b/>
+          <w:bCs/>
+          <w:sz w:val="22"/>
+          <w:szCs w:val="22"/>
+        </w:rPr>
         <w:t>Cons</w:t>
       </w:r>
       <w:r>
@@ -2705,8 +3712,19 @@
           <w:sz w:val="22"/>
           <w:szCs w:val="22"/>
         </w:rPr>
-        <w:t>: Found below console error</w:t>
+        <w:t xml:space="preserve">: Found below </w:t>
       </w:r>
+      <w:hyperlink r:id="rId25" w:history="1">
+        <w:r>
+          <w:rPr>
+            <w:rStyle w:val="Hyperlink"/>
+            <w:rFonts w:ascii="Calibri" w:hAnsi="Calibri" w:cs="Calibri"/>
+            <w:sz w:val="22"/>
+            <w:szCs w:val="22"/>
+          </w:rPr>
+          <w:t>console error</w:t>
+        </w:r>
+      </w:hyperlink>
       <w:r>
         <w:rPr>
           <w:rFonts w:ascii="Calibri" w:hAnsi="Calibri" w:cs="Calibri"/>
@@ -2852,84 +3870,6 @@
           <w:szCs w:val="22"/>
         </w:rPr>
       </w:pPr>
-    </w:p>
-    <w:p>
-      <w:pPr>
-        <w:rPr>
-          <w:rFonts w:ascii="Calibri" w:hAnsi="Calibri" w:cs="Calibri"/>
-          <w:sz w:val="22"/>
-          <w:szCs w:val="22"/>
-        </w:rPr>
-      </w:pPr>
-      <w:r>
-        <w:rPr>
-          <w:rFonts w:ascii="Calibri" w:hAnsi="Calibri" w:cs="Calibri"/>
-          <w:noProof/>
-          <w:sz w:val="22"/>
-          <w:szCs w:val="22"/>
-        </w:rPr>
-        <w:lastRenderedPageBreak/>
-        <w:drawing>
-          <wp:inline distT="0" distB="0" distL="0" distR="0" wp14:anchorId="65A80BD9" wp14:editId="4F78C536">
-            <wp:extent cx="5943600" cy="3117850"/>
-            <wp:effectExtent l="0" t="0" r="0" b="6350"/>
-            <wp:docPr id="551585704" name="Picture 1"/>
-            <wp:cNvGraphicFramePr>
-              <a:graphicFrameLocks xmlns:a="http://schemas.openxmlformats.org/drawingml/2006/main" noChangeAspect="1"/>
-            </wp:cNvGraphicFramePr>
-            <a:graphic xmlns:a="http://schemas.openxmlformats.org/drawingml/2006/main">
-              <a:graphicData uri="http://schemas.openxmlformats.org/drawingml/2006/picture">
-                <pic:pic xmlns:pic="http://schemas.openxmlformats.org/drawingml/2006/picture">
-                  <pic:nvPicPr>
-                    <pic:cNvPr id="551585704" name=""/>
-                    <pic:cNvPicPr/>
-                  </pic:nvPicPr>
-                  <pic:blipFill>
-                    <a:blip r:embed="rId9"/>
-                    <a:stretch>
-                      <a:fillRect/>
-                    </a:stretch>
-                  </pic:blipFill>
-                  <pic:spPr>
-                    <a:xfrm>
-                      <a:off x="0" y="0"/>
-                      <a:ext cx="5943600" cy="3117850"/>
-                    </a:xfrm>
-                    <a:prstGeom prst="rect">
-                      <a:avLst/>
-                    </a:prstGeom>
-                  </pic:spPr>
-                </pic:pic>
-              </a:graphicData>
-            </a:graphic>
-          </wp:inline>
-        </w:drawing>
-      </w:r>
-    </w:p>
-    <w:p>
-      <w:pPr>
-        <w:rPr>
-          <w:rFonts w:ascii="Calibri" w:hAnsi="Calibri" w:cs="Calibri"/>
-          <w:sz w:val="22"/>
-          <w:szCs w:val="22"/>
-        </w:rPr>
-      </w:pPr>
-      <w:r>
-        <w:rPr>
-          <w:rFonts w:ascii="Calibri" w:hAnsi="Calibri" w:cs="Calibri"/>
-          <w:sz w:val="22"/>
-          <w:szCs w:val="22"/>
-        </w:rPr>
-        <w:br/>
-      </w:r>
-      <w:r>
-        <w:rPr>
-          <w:rFonts w:ascii="Calibri" w:hAnsi="Calibri" w:cs="Calibri"/>
-          <w:sz w:val="22"/>
-          <w:szCs w:val="22"/>
-        </w:rPr>
-        <w:br/>
-      </w:r>
       <w:r>
         <w:rPr>
           <w:rFonts w:ascii="Calibri" w:hAnsi="Calibri" w:cs="Calibri"/>
@@ -2958,62 +3898,25 @@
         </w:rPr>
         <w:t>None</w:t>
       </w:r>
-    </w:p>
-    <w:p>
-      <w:pPr>
-        <w:rPr>
-          <w:rFonts w:ascii="Calibri" w:hAnsi="Calibri" w:cs="Calibri"/>
-          <w:b/>
-          <w:bCs/>
-          <w:sz w:val="22"/>
-          <w:szCs w:val="22"/>
-        </w:rPr>
-      </w:pPr>
       <w:r>
         <w:rPr>
           <w:rFonts w:ascii="Calibri" w:hAnsi="Calibri" w:cs="Calibri"/>
-          <w:b/>
-          <w:bCs/>
-          <w:noProof/>
-          <w:sz w:val="22"/>
-          <w:szCs w:val="22"/>
-        </w:rPr>
-        <w:drawing>
-          <wp:inline distT="0" distB="0" distL="0" distR="0" wp14:anchorId="129A777C" wp14:editId="79CA75B0">
-            <wp:extent cx="5943600" cy="3123565"/>
-            <wp:effectExtent l="0" t="0" r="0" b="635"/>
-            <wp:docPr id="1289303578" name="Picture 1"/>
-            <wp:cNvGraphicFramePr>
-              <a:graphicFrameLocks xmlns:a="http://schemas.openxmlformats.org/drawingml/2006/main" noChangeAspect="1"/>
-            </wp:cNvGraphicFramePr>
-            <a:graphic xmlns:a="http://schemas.openxmlformats.org/drawingml/2006/main">
-              <a:graphicData uri="http://schemas.openxmlformats.org/drawingml/2006/picture">
-                <pic:pic xmlns:pic="http://schemas.openxmlformats.org/drawingml/2006/picture">
-                  <pic:nvPicPr>
-                    <pic:cNvPr id="1289303578" name=""/>
-                    <pic:cNvPicPr/>
-                  </pic:nvPicPr>
-                  <pic:blipFill>
-                    <a:blip r:embed="rId10"/>
-                    <a:stretch>
-                      <a:fillRect/>
-                    </a:stretch>
-                  </pic:blipFill>
-                  <pic:spPr>
-                    <a:xfrm>
-                      <a:off x="0" y="0"/>
-                      <a:ext cx="5943600" cy="3123565"/>
-                    </a:xfrm>
-                    <a:prstGeom prst="rect">
-                      <a:avLst/>
-                    </a:prstGeom>
-                  </pic:spPr>
-                </pic:pic>
-              </a:graphicData>
-            </a:graphic>
-          </wp:inline>
-        </w:drawing>
+          <w:sz w:val="22"/>
+          <w:szCs w:val="22"/>
+        </w:rPr>
+        <w:t xml:space="preserve"> - </w:t>
       </w:r>
+      <w:hyperlink r:id="rId26" w:history="1">
+        <w:r>
+          <w:rPr>
+            <w:rStyle w:val="Hyperlink"/>
+            <w:rFonts w:ascii="Calibri" w:hAnsi="Calibri" w:cs="Calibri"/>
+            <w:sz w:val="22"/>
+            <w:szCs w:val="22"/>
+          </w:rPr>
+          <w:t>evidence for run time error</w:t>
+        </w:r>
+      </w:hyperlink>
     </w:p>
     <w:p>
       <w:pPr>
@@ -5944,6 +6847,18 @@
       <w:szCs w:val="20"/>
     </w:rPr>
   </w:style>
+  <w:style w:type="character" w:styleId="FollowedHyperlink">
+    <w:name w:val="FollowedHyperlink"/>
+    <w:basedOn w:val="DefaultParagraphFont"/>
+    <w:uiPriority w:val="99"/>
+    <w:semiHidden/>
+    <w:unhideWhenUsed/>
+    <w:rsid w:val="00BB360E"/>
+    <w:rPr>
+      <w:color w:val="96607D" w:themeColor="followedHyperlink"/>
+      <w:u w:val="single"/>
+    </w:rPr>
+  </w:style>
 </w:styles>
 </file>
 
@@ -6243,6 +7158,23 @@
 </file>
 
 <file path=customXml/item1.xml><?xml version="1.0" encoding="utf-8"?>
+<p:properties xmlns:p="http://schemas.microsoft.com/office/2006/metadata/properties" xmlns:xsi="http://www.w3.org/2001/XMLSchema-instance" xmlns:pc="http://schemas.microsoft.com/office/infopath/2007/PartnerControls">
+  <documentManagement>
+    <_activity xmlns="3b1629a4-d2b2-4f19-9676-5f20b70ce082" xsi:nil="true"/>
+  </documentManagement>
+</p:properties>
+</file>
+
+<file path=customXml/item2.xml><?xml version="1.0" encoding="utf-8"?>
+<?mso-contentType ?>
+<FormTemplates xmlns="http://schemas.microsoft.com/sharepoint/v3/contenttype/forms">
+  <Display>DocumentLibraryForm</Display>
+  <Edit>DocumentLibraryForm</Edit>
+  <New>DocumentLibraryForm</New>
+</FormTemplates>
+</file>
+
+<file path=customXml/item3.xml><?xml version="1.0" encoding="utf-8"?>
 <ct:contentTypeSchema xmlns:ct="http://schemas.microsoft.com/office/2006/metadata/contentType" xmlns:ma="http://schemas.microsoft.com/office/2006/metadata/properties/metaAttributes" ct:_="" ma:_="" ma:contentTypeName="Document" ma:contentTypeID="0x010100EC19F68DC43C164F9A3DE24D5D9AFCF8" ma:contentTypeVersion="16" ma:contentTypeDescription="Create a new document." ma:contentTypeScope="" ma:versionID="26b9fde581bd410d35edec2660bbbce3">
   <xsd:schema xmlns:xsd="http://www.w3.org/2001/XMLSchema" xmlns:xs="http://www.w3.org/2001/XMLSchema" xmlns:p="http://schemas.microsoft.com/office/2006/metadata/properties" xmlns:ns3="3b1629a4-d2b2-4f19-9676-5f20b70ce082" xmlns:ns4="c9aeeca5-d7bd-4245-9100-dfc107739a16" targetNamespace="http://schemas.microsoft.com/office/2006/metadata/properties" ma:root="true" ma:fieldsID="85b2c106fe9133781cbefcb571257798" ns3:_="" ns4:_="">
     <xsd:import namespace="3b1629a4-d2b2-4f19-9676-5f20b70ce082"/>
@@ -6481,24 +7413,25 @@
 </ct:contentTypeSchema>
 </file>
 
-<file path=customXml/item2.xml><?xml version="1.0" encoding="utf-8"?>
-<?mso-contentType ?>
-<FormTemplates xmlns="http://schemas.microsoft.com/sharepoint/v3/contenttype/forms">
-  <Display>DocumentLibraryForm</Display>
-  <Edit>DocumentLibraryForm</Edit>
-  <New>DocumentLibraryForm</New>
-</FormTemplates>
+<file path=customXml/itemProps1.xml><?xml version="1.0" encoding="utf-8"?>
+<ds:datastoreItem xmlns:ds="http://schemas.openxmlformats.org/officeDocument/2006/customXml" ds:itemID="{AA3C9C74-6E90-4DC2-A21D-57B9661F21F3}">
+  <ds:schemaRefs>
+    <ds:schemaRef ds:uri="http://schemas.microsoft.com/office/2006/metadata/properties"/>
+    <ds:schemaRef ds:uri="http://schemas.microsoft.com/office/infopath/2007/PartnerControls"/>
+    <ds:schemaRef ds:uri="3b1629a4-d2b2-4f19-9676-5f20b70ce082"/>
+  </ds:schemaRefs>
+</ds:datastoreItem>
 </file>
 
-<file path=customXml/item3.xml><?xml version="1.0" encoding="utf-8"?>
-<p:properties xmlns:p="http://schemas.microsoft.com/office/2006/metadata/properties" xmlns:xsi="http://www.w3.org/2001/XMLSchema-instance" xmlns:pc="http://schemas.microsoft.com/office/infopath/2007/PartnerControls">
-  <documentManagement>
-    <_activity xmlns="3b1629a4-d2b2-4f19-9676-5f20b70ce082" xsi:nil="true"/>
-  </documentManagement>
-</p:properties>
+<file path=customXml/itemProps2.xml><?xml version="1.0" encoding="utf-8"?>
+<ds:datastoreItem xmlns:ds="http://schemas.openxmlformats.org/officeDocument/2006/customXml" ds:itemID="{927D1DB6-87D8-40C0-80F8-9F563F981634}">
+  <ds:schemaRefs>
+    <ds:schemaRef ds:uri="http://schemas.microsoft.com/sharepoint/v3/contenttype/forms"/>
+  </ds:schemaRefs>
+</ds:datastoreItem>
 </file>
 
-<file path=customXml/itemProps1.xml><?xml version="1.0" encoding="utf-8"?>
+<file path=customXml/itemProps3.xml><?xml version="1.0" encoding="utf-8"?>
 <ds:datastoreItem xmlns:ds="http://schemas.openxmlformats.org/officeDocument/2006/customXml" ds:itemID="{9988BF47-9E56-4B76-B22A-8F1982E4B201}">
   <ds:schemaRefs>
     <ds:schemaRef ds:uri="http://schemas.microsoft.com/office/2006/metadata/contentType"/>
@@ -6515,22 +7448,4 @@
     <ds:schemaRef ds:uri="http://schemas.microsoft.com/internal/obd"/>
   </ds:schemaRefs>
 </ds:datastoreItem>
-</file>
-
-<file path=customXml/itemProps2.xml><?xml version="1.0" encoding="utf-8"?>
-<ds:datastoreItem xmlns:ds="http://schemas.openxmlformats.org/officeDocument/2006/customXml" ds:itemID="{927D1DB6-87D8-40C0-80F8-9F563F981634}">
-  <ds:schemaRefs>
-    <ds:schemaRef ds:uri="http://schemas.microsoft.com/sharepoint/v3/contenttype/forms"/>
-  </ds:schemaRefs>
-</ds:datastoreItem>
-</file>
-
-<file path=customXml/itemProps3.xml><?xml version="1.0" encoding="utf-8"?>
-<ds:datastoreItem xmlns:ds="http://schemas.openxmlformats.org/officeDocument/2006/customXml" ds:itemID="{AA3C9C74-6E90-4DC2-A21D-57B9661F21F3}">
-  <ds:schemaRefs>
-    <ds:schemaRef ds:uri="http://schemas.microsoft.com/office/2006/metadata/properties"/>
-    <ds:schemaRef ds:uri="http://schemas.microsoft.com/office/infopath/2007/PartnerControls"/>
-    <ds:schemaRef ds:uri="3b1629a4-d2b2-4f19-9676-5f20b70ce082"/>
-  </ds:schemaRefs>
-</ds:datastoreItem>
 </file>
</xml_diff>

<commit_message>
Updated read me file.
</commit_message>
<xml_diff>
--- a/Evidence/CacheViewExpirationReport.docx
+++ b/Evidence/CacheViewExpirationReport.docx
@@ -1339,13 +1339,6 @@
             <w:tcW w:w="2080" w:type="dxa"/>
           </w:tcPr>
           <w:p>
-            <w:pPr>
-              <w:rPr>
-                <w:rFonts w:ascii="Calibri" w:hAnsi="Calibri" w:cs="Calibri"/>
-                <w:sz w:val="22"/>
-                <w:szCs w:val="22"/>
-              </w:rPr>
-            </w:pPr>
             <w:hyperlink r:id="rId18" w:history="1">
               <w:r>
                 <w:rPr>
@@ -1357,6 +1350,38 @@
                 <w:t>Expire sliding with absolute time of expire after</w:t>
               </w:r>
             </w:hyperlink>
+            <w:r>
+              <w:t>,</w:t>
+            </w:r>
+          </w:p>
+          <w:p>
+            <w:pPr>
+              <w:rPr>
+                <w:rFonts w:ascii="Calibri" w:hAnsi="Calibri" w:cs="Calibri"/>
+                <w:sz w:val="22"/>
+                <w:szCs w:val="22"/>
+              </w:rPr>
+            </w:pPr>
+          </w:p>
+          <w:p>
+            <w:pPr>
+              <w:rPr>
+                <w:rFonts w:ascii="Calibri" w:hAnsi="Calibri" w:cs="Calibri"/>
+                <w:sz w:val="22"/>
+                <w:szCs w:val="22"/>
+              </w:rPr>
+            </w:pPr>
+            <w:hyperlink r:id="rId19" w:history="1">
+              <w:r>
+                <w:rPr>
+                  <w:rStyle w:val="Hyperlink"/>
+                  <w:rFonts w:ascii="Calibri" w:hAnsi="Calibri" w:cs="Calibri"/>
+                  <w:sz w:val="22"/>
+                  <w:szCs w:val="22"/>
+                </w:rPr>
+                <w:t>Idle window with expire after</w:t>
+              </w:r>
+            </w:hyperlink>
           </w:p>
         </w:tc>
       </w:tr>
@@ -1448,7 +1473,7 @@
                 <w:szCs w:val="22"/>
               </w:rPr>
             </w:pPr>
-            <w:hyperlink r:id="rId19" w:history="1">
+            <w:hyperlink r:id="rId20" w:history="1">
               <w:r>
                 <w:rPr>
                   <w:rStyle w:val="Hyperlink"/>
@@ -1601,7 +1626,7 @@
                 <w:szCs w:val="22"/>
               </w:rPr>
             </w:pPr>
-            <w:hyperlink r:id="rId20" w:history="1">
+            <w:hyperlink r:id="rId21" w:history="1">
               <w:r>
                 <w:rPr>
                   <w:rStyle w:val="Hyperlink"/>
@@ -1638,7 +1663,7 @@
                 <w:szCs w:val="22"/>
               </w:rPr>
             </w:pPr>
-            <w:hyperlink r:id="rId21" w:history="1">
+            <w:hyperlink r:id="rId22" w:history="1">
               <w:r>
                 <w:rPr>
                   <w:rStyle w:val="Hyperlink"/>
@@ -1740,14 +1765,7 @@
             <w:tcW w:w="2080" w:type="dxa"/>
           </w:tcPr>
           <w:p>
-            <w:pPr>
-              <w:rPr>
-                <w:rFonts w:ascii="Calibri" w:hAnsi="Calibri" w:cs="Calibri"/>
-                <w:sz w:val="22"/>
-                <w:szCs w:val="22"/>
-              </w:rPr>
-            </w:pPr>
-            <w:hyperlink r:id="rId22" w:history="1">
+            <w:hyperlink r:id="rId23" w:history="1">
               <w:r>
                 <w:rPr>
                   <w:rStyle w:val="Hyperlink"/>
@@ -1778,6 +1796,64 @@
                 <w:t xml:space="preserve"> section</w:t>
               </w:r>
             </w:hyperlink>
+            <w:r>
+              <w:t xml:space="preserve"> .</w:t>
+            </w:r>
+          </w:p>
+          <w:p/>
+          <w:p>
+            <w:pPr>
+              <w:rPr>
+                <w:rFonts w:ascii="Calibri" w:hAnsi="Calibri" w:cs="Calibri"/>
+                <w:sz w:val="22"/>
+                <w:szCs w:val="22"/>
+              </w:rPr>
+            </w:pPr>
+            <w:hyperlink r:id="rId24" w:history="1">
+              <w:proofErr w:type="spellStart"/>
+              <w:r>
+                <w:rPr>
+                  <w:rStyle w:val="Hyperlink"/>
+                  <w:rFonts w:ascii="Calibri" w:hAnsi="Calibri" w:cs="Calibri"/>
+                  <w:sz w:val="22"/>
+                  <w:szCs w:val="22"/>
+                </w:rPr>
+                <w:t>ExpireOn</w:t>
+              </w:r>
+              <w:proofErr w:type="spellEnd"/>
+              <w:r>
+                <w:rPr>
+                  <w:rStyle w:val="Hyperlink"/>
+                  <w:rFonts w:ascii="Calibri" w:hAnsi="Calibri" w:cs="Calibri"/>
+                  <w:sz w:val="22"/>
+                  <w:szCs w:val="22"/>
+                </w:rPr>
+                <w:t xml:space="preserve"> wins when combining the </w:t>
+              </w:r>
+              <w:proofErr w:type="gramStart"/>
+              <w:r>
+                <w:rPr>
+                  <w:rStyle w:val="Hyperlink"/>
+                  <w:rFonts w:ascii="Calibri" w:hAnsi="Calibri" w:cs="Calibri"/>
+                  <w:sz w:val="22"/>
+                  <w:szCs w:val="22"/>
+                </w:rPr>
+                <w:t>expire</w:t>
+              </w:r>
+              <w:proofErr w:type="gramEnd"/>
+              <w:r>
+                <w:rPr>
+                  <w:rStyle w:val="Hyperlink"/>
+                  <w:rFonts w:ascii="Calibri" w:hAnsi="Calibri" w:cs="Calibri"/>
+                  <w:sz w:val="22"/>
+                  <w:szCs w:val="22"/>
+                </w:rPr>
+                <w:t xml:space="preserve"> after and expire on scenario</w:t>
+              </w:r>
+            </w:hyperlink>
+            <w:r>
+              <w:t xml:space="preserve"> .</w:t>
+            </w:r>
           </w:p>
         </w:tc>
       </w:tr>
@@ -1869,7 +1945,7 @@
                 <w:szCs w:val="22"/>
               </w:rPr>
             </w:pPr>
-            <w:hyperlink r:id="rId23" w:history="1">
+            <w:hyperlink r:id="rId25" w:history="1">
               <w:r>
                 <w:rPr>
                   <w:rStyle w:val="Hyperlink"/>
@@ -1897,7 +1973,7 @@
                 <w:szCs w:val="22"/>
               </w:rPr>
             </w:pPr>
-            <w:hyperlink r:id="rId24" w:history="1">
+            <w:hyperlink r:id="rId26" w:history="1">
               <w:r>
                 <w:rPr>
                   <w:rStyle w:val="Hyperlink"/>
@@ -2008,7 +2084,26 @@
           <w:tcPr>
             <w:tcW w:w="2080" w:type="dxa"/>
           </w:tcPr>
-          <w:p/>
+          <w:p>
+            <w:pPr>
+              <w:rPr>
+                <w:rFonts w:ascii="Calibri" w:hAnsi="Calibri" w:cs="Calibri"/>
+                <w:sz w:val="22"/>
+                <w:szCs w:val="22"/>
+              </w:rPr>
+            </w:pPr>
+            <w:hyperlink r:id="rId27" w:history="1">
+              <w:r>
+                <w:rPr>
+                  <w:rStyle w:val="Hyperlink"/>
+                  <w:rFonts w:ascii="Calibri" w:hAnsi="Calibri" w:cs="Calibri"/>
+                  <w:sz w:val="22"/>
+                  <w:szCs w:val="22"/>
+                </w:rPr>
+                <w:t>Idle window with expire after</w:t>
+              </w:r>
+            </w:hyperlink>
+          </w:p>
         </w:tc>
       </w:tr>
       <w:tr>
@@ -2108,7 +2203,37 @@
           <w:tcPr>
             <w:tcW w:w="2080" w:type="dxa"/>
           </w:tcPr>
-          <w:p/>
+          <w:p>
+            <w:pPr>
+              <w:rPr>
+                <w:rFonts w:ascii="Calibri" w:hAnsi="Calibri" w:cs="Calibri"/>
+                <w:sz w:val="22"/>
+                <w:szCs w:val="22"/>
+              </w:rPr>
+            </w:pPr>
+            <w:hyperlink r:id="rId28" w:history="1">
+              <w:r>
+                <w:rPr>
+                  <w:rStyle w:val="Hyperlink"/>
+                  <w:rFonts w:ascii="Calibri" w:hAnsi="Calibri" w:cs="Calibri"/>
+                  <w:sz w:val="22"/>
+                  <w:szCs w:val="22"/>
+                </w:rPr>
+                <w:t xml:space="preserve">Passed </w:t>
+              </w:r>
+              <w:proofErr w:type="spellStart"/>
+              <w:r>
+                <w:rPr>
+                  <w:rStyle w:val="Hyperlink"/>
+                  <w:rFonts w:ascii="Calibri" w:hAnsi="Calibri" w:cs="Calibri"/>
+                  <w:sz w:val="22"/>
+                  <w:szCs w:val="22"/>
+                </w:rPr>
+                <w:t>ExpireOn</w:t>
+              </w:r>
+              <w:proofErr w:type="spellEnd"/>
+            </w:hyperlink>
+          </w:p>
         </w:tc>
       </w:tr>
     </w:tbl>
@@ -2135,6 +2260,7 @@
           <w:sz w:val="22"/>
           <w:szCs w:val="22"/>
         </w:rPr>
+        <w:lastRenderedPageBreak/>
         <w:t xml:space="preserve">Expiration validation values after </w:t>
       </w:r>
       <w:r>
@@ -2209,8 +2335,24 @@
                 <w:sz w:val="20"/>
                 <w:szCs w:val="20"/>
               </w:rPr>
-              <w:t xml:space="preserve"> with </w:t>
-            </w:r>
+              <w:t xml:space="preserve"> with reloading the page</w:t>
+            </w:r>
+          </w:p>
+        </w:tc>
+        <w:tc>
+          <w:tcPr>
+            <w:tcW w:w="1429" w:type="dxa"/>
+            <w:vAlign w:val="center"/>
+          </w:tcPr>
+          <w:p>
+            <w:pPr>
+              <w:rPr>
+                <w:rFonts w:ascii="Calibri" w:hAnsi="Calibri" w:cs="Calibri"/>
+                <w:sz w:val="22"/>
+                <w:szCs w:val="22"/>
+              </w:rPr>
+            </w:pPr>
+            <w:proofErr w:type="spellStart"/>
             <w:r>
               <w:rPr>
                 <w:rFonts w:ascii="Segoe UI" w:hAnsi="Segoe UI" w:cs="Segoe UI"/>
@@ -2219,25 +2361,9 @@
                 <w:sz w:val="20"/>
                 <w:szCs w:val="20"/>
               </w:rPr>
-              <w:lastRenderedPageBreak/>
-              <w:t>reloading the page</w:t>
-            </w:r>
-          </w:p>
-        </w:tc>
-        <w:tc>
-          <w:tcPr>
-            <w:tcW w:w="1429" w:type="dxa"/>
-            <w:vAlign w:val="center"/>
-          </w:tcPr>
-          <w:p>
-            <w:pPr>
-              <w:rPr>
-                <w:rFonts w:ascii="Calibri" w:hAnsi="Calibri" w:cs="Calibri"/>
-                <w:sz w:val="22"/>
-                <w:szCs w:val="22"/>
-              </w:rPr>
-            </w:pPr>
-            <w:proofErr w:type="spellStart"/>
+              <w:t>ExpiresAfter</w:t>
+            </w:r>
+            <w:proofErr w:type="spellEnd"/>
             <w:r>
               <w:rPr>
                 <w:rFonts w:ascii="Segoe UI" w:hAnsi="Segoe UI" w:cs="Segoe UI"/>
@@ -2246,10 +2372,8 @@
                 <w:sz w:val="20"/>
                 <w:szCs w:val="20"/>
               </w:rPr>
-              <w:lastRenderedPageBreak/>
-              <w:t>ExpiresAfter</w:t>
-            </w:r>
-            <w:proofErr w:type="spellEnd"/>
+              <w:t xml:space="preserve"> GUID</w:t>
+            </w:r>
             <w:r>
               <w:rPr>
                 <w:rFonts w:ascii="Segoe UI" w:hAnsi="Segoe UI" w:cs="Segoe UI"/>
@@ -2258,9 +2382,17 @@
                 <w:sz w:val="20"/>
                 <w:szCs w:val="20"/>
               </w:rPr>
-              <w:t xml:space="preserve"> GUID</w:t>
-            </w:r>
-            <w:r>
+              <w:t xml:space="preserve"> 10sec </w:t>
+            </w:r>
+          </w:p>
+        </w:tc>
+        <w:tc>
+          <w:tcPr>
+            <w:tcW w:w="1423" w:type="dxa"/>
+            <w:vAlign w:val="center"/>
+          </w:tcPr>
+          <w:p>
+            <w:pPr>
               <w:rPr>
                 <w:rFonts w:ascii="Segoe UI" w:hAnsi="Segoe UI" w:cs="Segoe UI"/>
                 <w:b/>
@@ -2268,17 +2400,9 @@
                 <w:sz w:val="20"/>
                 <w:szCs w:val="20"/>
               </w:rPr>
-              <w:t xml:space="preserve"> 10sec </w:t>
-            </w:r>
-          </w:p>
-        </w:tc>
-        <w:tc>
-          <w:tcPr>
-            <w:tcW w:w="1423" w:type="dxa"/>
-            <w:vAlign w:val="center"/>
-          </w:tcPr>
-          <w:p>
-            <w:pPr>
+            </w:pPr>
+            <w:proofErr w:type="spellStart"/>
+            <w:r>
               <w:rPr>
                 <w:rFonts w:ascii="Segoe UI" w:hAnsi="Segoe UI" w:cs="Segoe UI"/>
                 <w:b/>
@@ -2286,8 +2410,18 @@
                 <w:sz w:val="20"/>
                 <w:szCs w:val="20"/>
               </w:rPr>
-            </w:pPr>
-            <w:proofErr w:type="spellStart"/>
+              <w:t>ExpiresOn</w:t>
+            </w:r>
+            <w:proofErr w:type="spellEnd"/>
+          </w:p>
+          <w:p>
+            <w:pPr>
+              <w:rPr>
+                <w:rFonts w:ascii="Calibri" w:hAnsi="Calibri" w:cs="Calibri"/>
+                <w:sz w:val="22"/>
+                <w:szCs w:val="22"/>
+              </w:rPr>
+            </w:pPr>
             <w:r>
               <w:rPr>
                 <w:rFonts w:ascii="Segoe UI" w:hAnsi="Segoe UI" w:cs="Segoe UI"/>
@@ -2296,18 +2430,8 @@
                 <w:sz w:val="20"/>
                 <w:szCs w:val="20"/>
               </w:rPr>
-              <w:t>ExpiresOn</w:t>
-            </w:r>
-            <w:proofErr w:type="spellEnd"/>
-          </w:p>
-          <w:p>
-            <w:pPr>
-              <w:rPr>
-                <w:rFonts w:ascii="Calibri" w:hAnsi="Calibri" w:cs="Calibri"/>
-                <w:sz w:val="22"/>
-                <w:szCs w:val="22"/>
-              </w:rPr>
-            </w:pPr>
+              <w:t>GUID</w:t>
+            </w:r>
             <w:r>
               <w:rPr>
                 <w:rFonts w:ascii="Segoe UI" w:hAnsi="Segoe UI" w:cs="Segoe UI"/>
@@ -2316,9 +2440,17 @@
                 <w:sz w:val="20"/>
                 <w:szCs w:val="20"/>
               </w:rPr>
-              <w:t>GUID</w:t>
-            </w:r>
-            <w:r>
+              <w:t xml:space="preserve"> 30sec</w:t>
+            </w:r>
+          </w:p>
+        </w:tc>
+        <w:tc>
+          <w:tcPr>
+            <w:tcW w:w="1413" w:type="dxa"/>
+            <w:vAlign w:val="center"/>
+          </w:tcPr>
+          <w:p>
+            <w:pPr>
               <w:rPr>
                 <w:rFonts w:ascii="Segoe UI" w:hAnsi="Segoe UI" w:cs="Segoe UI"/>
                 <w:b/>
@@ -2326,17 +2458,8 @@
                 <w:sz w:val="20"/>
                 <w:szCs w:val="20"/>
               </w:rPr>
-              <w:t xml:space="preserve"> 30sec</w:t>
-            </w:r>
-          </w:p>
-        </w:tc>
-        <w:tc>
-          <w:tcPr>
-            <w:tcW w:w="1413" w:type="dxa"/>
-            <w:vAlign w:val="center"/>
-          </w:tcPr>
-          <w:p>
-            <w:pPr>
+            </w:pPr>
+            <w:r>
               <w:rPr>
                 <w:rFonts w:ascii="Segoe UI" w:hAnsi="Segoe UI" w:cs="Segoe UI"/>
                 <w:b/>
@@ -2344,7 +2467,8 @@
                 <w:sz w:val="20"/>
                 <w:szCs w:val="20"/>
               </w:rPr>
-            </w:pPr>
+              <w:t>Sliding</w:t>
+            </w:r>
             <w:r>
               <w:rPr>
                 <w:rFonts w:ascii="Segoe UI" w:hAnsi="Segoe UI" w:cs="Segoe UI"/>
@@ -2353,7 +2477,7 @@
                 <w:sz w:val="20"/>
                 <w:szCs w:val="20"/>
               </w:rPr>
-              <w:t>Sliding</w:t>
+              <w:t xml:space="preserve"> 10sec</w:t>
             </w:r>
             <w:r>
               <w:rPr>
@@ -2363,8 +2487,17 @@
                 <w:sz w:val="20"/>
                 <w:szCs w:val="20"/>
               </w:rPr>
-              <w:t xml:space="preserve"> 10sec</w:t>
-            </w:r>
+              <w:t xml:space="preserve"> + absolute</w:t>
+            </w:r>
+          </w:p>
+          <w:p>
+            <w:pPr>
+              <w:rPr>
+                <w:rFonts w:ascii="Calibri" w:hAnsi="Calibri" w:cs="Calibri"/>
+                <w:sz w:val="22"/>
+                <w:szCs w:val="22"/>
+              </w:rPr>
+            </w:pPr>
             <w:r>
               <w:rPr>
                 <w:rFonts w:ascii="Segoe UI" w:hAnsi="Segoe UI" w:cs="Segoe UI"/>
@@ -2373,17 +2506,8 @@
                 <w:sz w:val="20"/>
                 <w:szCs w:val="20"/>
               </w:rPr>
-              <w:t xml:space="preserve"> + absolute</w:t>
-            </w:r>
-          </w:p>
-          <w:p>
-            <w:pPr>
-              <w:rPr>
-                <w:rFonts w:ascii="Calibri" w:hAnsi="Calibri" w:cs="Calibri"/>
-                <w:sz w:val="22"/>
-                <w:szCs w:val="22"/>
-              </w:rPr>
-            </w:pPr>
+              <w:t>GUID</w:t>
+            </w:r>
             <w:r>
               <w:rPr>
                 <w:rFonts w:ascii="Segoe UI" w:hAnsi="Segoe UI" w:cs="Segoe UI"/>
@@ -2392,10 +2516,17 @@
                 <w:sz w:val="20"/>
                 <w:szCs w:val="20"/>
               </w:rPr>
-              <w:lastRenderedPageBreak/>
-              <w:t>GUID</w:t>
-            </w:r>
-            <w:r>
+              <w:t xml:space="preserve"> 2min</w:t>
+            </w:r>
+          </w:p>
+        </w:tc>
+        <w:tc>
+          <w:tcPr>
+            <w:tcW w:w="1407" w:type="dxa"/>
+            <w:vAlign w:val="center"/>
+          </w:tcPr>
+          <w:p>
+            <w:pPr>
               <w:rPr>
                 <w:rFonts w:ascii="Segoe UI" w:hAnsi="Segoe UI" w:cs="Segoe UI"/>
                 <w:b/>
@@ -2403,17 +2534,8 @@
                 <w:sz w:val="20"/>
                 <w:szCs w:val="20"/>
               </w:rPr>
-              <w:t xml:space="preserve"> 2min</w:t>
-            </w:r>
-          </w:p>
-        </w:tc>
-        <w:tc>
-          <w:tcPr>
-            <w:tcW w:w="1407" w:type="dxa"/>
-            <w:vAlign w:val="center"/>
-          </w:tcPr>
-          <w:p>
-            <w:pPr>
+            </w:pPr>
+            <w:r>
               <w:rPr>
                 <w:rFonts w:ascii="Segoe UI" w:hAnsi="Segoe UI" w:cs="Segoe UI"/>
                 <w:b/>
@@ -2421,6 +2543,16 @@
                 <w:sz w:val="20"/>
                 <w:szCs w:val="20"/>
               </w:rPr>
+              <w:t>Sliding only</w:t>
+            </w:r>
+          </w:p>
+          <w:p>
+            <w:pPr>
+              <w:rPr>
+                <w:rFonts w:ascii="Calibri" w:hAnsi="Calibri" w:cs="Calibri"/>
+                <w:sz w:val="22"/>
+                <w:szCs w:val="22"/>
+              </w:rPr>
             </w:pPr>
             <w:r>
               <w:rPr>
@@ -2430,18 +2562,8 @@
                 <w:sz w:val="20"/>
                 <w:szCs w:val="20"/>
               </w:rPr>
-              <w:lastRenderedPageBreak/>
-              <w:t>Sliding only</w:t>
-            </w:r>
-          </w:p>
-          <w:p>
-            <w:pPr>
-              <w:rPr>
-                <w:rFonts w:ascii="Calibri" w:hAnsi="Calibri" w:cs="Calibri"/>
-                <w:sz w:val="22"/>
-                <w:szCs w:val="22"/>
-              </w:rPr>
-            </w:pPr>
+              <w:t>GUID</w:t>
+            </w:r>
             <w:r>
               <w:rPr>
                 <w:rFonts w:ascii="Segoe UI" w:hAnsi="Segoe UI" w:cs="Segoe UI"/>
@@ -2450,9 +2572,17 @@
                 <w:sz w:val="20"/>
                 <w:szCs w:val="20"/>
               </w:rPr>
-              <w:t>GUID</w:t>
-            </w:r>
-            <w:r>
+              <w:t xml:space="preserve"> 10sec</w:t>
+            </w:r>
+          </w:p>
+        </w:tc>
+        <w:tc>
+          <w:tcPr>
+            <w:tcW w:w="1416" w:type="dxa"/>
+            <w:vAlign w:val="center"/>
+          </w:tcPr>
+          <w:p>
+            <w:pPr>
               <w:rPr>
                 <w:rFonts w:ascii="Segoe UI" w:hAnsi="Segoe UI" w:cs="Segoe UI"/>
                 <w:b/>
@@ -2460,17 +2590,8 @@
                 <w:sz w:val="20"/>
                 <w:szCs w:val="20"/>
               </w:rPr>
-              <w:t xml:space="preserve"> 10sec</w:t>
-            </w:r>
-          </w:p>
-        </w:tc>
-        <w:tc>
-          <w:tcPr>
-            <w:tcW w:w="1416" w:type="dxa"/>
-            <w:vAlign w:val="center"/>
-          </w:tcPr>
-          <w:p>
-            <w:pPr>
+            </w:pPr>
+            <w:r>
               <w:rPr>
                 <w:rFonts w:ascii="Segoe UI" w:hAnsi="Segoe UI" w:cs="Segoe UI"/>
                 <w:b/>
@@ -2478,6 +2599,16 @@
                 <w:sz w:val="20"/>
                 <w:szCs w:val="20"/>
               </w:rPr>
+              <w:t>Default</w:t>
+            </w:r>
+          </w:p>
+          <w:p>
+            <w:pPr>
+              <w:rPr>
+                <w:rFonts w:ascii="Calibri" w:hAnsi="Calibri" w:cs="Calibri"/>
+                <w:sz w:val="22"/>
+                <w:szCs w:val="22"/>
+              </w:rPr>
             </w:pPr>
             <w:r>
               <w:rPr>
@@ -2487,18 +2618,17 @@
                 <w:sz w:val="20"/>
                 <w:szCs w:val="20"/>
               </w:rPr>
-              <w:t>Default</w:t>
-            </w:r>
-          </w:p>
-          <w:p>
-            <w:pPr>
-              <w:rPr>
-                <w:rFonts w:ascii="Calibri" w:hAnsi="Calibri" w:cs="Calibri"/>
-                <w:sz w:val="22"/>
-                <w:szCs w:val="22"/>
-              </w:rPr>
-            </w:pPr>
-            <w:r>
+              <w:t>GUID</w:t>
+            </w:r>
+          </w:p>
+        </w:tc>
+        <w:tc>
+          <w:tcPr>
+            <w:tcW w:w="1435" w:type="dxa"/>
+            <w:vAlign w:val="center"/>
+          </w:tcPr>
+          <w:p>
+            <w:pPr>
               <w:rPr>
                 <w:rFonts w:ascii="Segoe UI" w:hAnsi="Segoe UI" w:cs="Segoe UI"/>
                 <w:b/>
@@ -2506,17 +2636,9 @@
                 <w:sz w:val="20"/>
                 <w:szCs w:val="20"/>
               </w:rPr>
-              <w:t>GUID</w:t>
-            </w:r>
-          </w:p>
-        </w:tc>
-        <w:tc>
-          <w:tcPr>
-            <w:tcW w:w="1435" w:type="dxa"/>
-            <w:vAlign w:val="center"/>
-          </w:tcPr>
-          <w:p>
-            <w:pPr>
+            </w:pPr>
+            <w:proofErr w:type="spellStart"/>
+            <w:r>
               <w:rPr>
                 <w:rFonts w:ascii="Segoe UI" w:hAnsi="Segoe UI" w:cs="Segoe UI"/>
                 <w:b/>
@@ -2524,8 +2646,8 @@
                 <w:sz w:val="20"/>
                 <w:szCs w:val="20"/>
               </w:rPr>
-            </w:pPr>
-            <w:proofErr w:type="spellStart"/>
+              <w:t>Expire</w:t>
+            </w:r>
             <w:r>
               <w:rPr>
                 <w:rFonts w:ascii="Segoe UI" w:hAnsi="Segoe UI" w:cs="Segoe UI"/>
@@ -2534,8 +2656,9 @@
                 <w:sz w:val="20"/>
                 <w:szCs w:val="20"/>
               </w:rPr>
-              <w:t>Expire</w:t>
-            </w:r>
+              <w:t>After</w:t>
+            </w:r>
+            <w:proofErr w:type="spellEnd"/>
             <w:r>
               <w:rPr>
                 <w:rFonts w:ascii="Segoe UI" w:hAnsi="Segoe UI" w:cs="Segoe UI"/>
@@ -2544,9 +2667,9 @@
                 <w:sz w:val="20"/>
                 <w:szCs w:val="20"/>
               </w:rPr>
-              <w:t>After</w:t>
-            </w:r>
-            <w:proofErr w:type="spellEnd"/>
+              <w:t xml:space="preserve"> + </w:t>
+            </w:r>
+            <w:proofErr w:type="spellStart"/>
             <w:r>
               <w:rPr>
                 <w:rFonts w:ascii="Segoe UI" w:hAnsi="Segoe UI" w:cs="Segoe UI"/>
@@ -2555,9 +2678,8 @@
                 <w:sz w:val="20"/>
                 <w:szCs w:val="20"/>
               </w:rPr>
-              <w:t xml:space="preserve"> + </w:t>
-            </w:r>
-            <w:proofErr w:type="spellStart"/>
+              <w:t>Expire</w:t>
+            </w:r>
             <w:r>
               <w:rPr>
                 <w:rFonts w:ascii="Segoe UI" w:hAnsi="Segoe UI" w:cs="Segoe UI"/>
@@ -2566,8 +2688,18 @@
                 <w:sz w:val="20"/>
                 <w:szCs w:val="20"/>
               </w:rPr>
-              <w:t>Expire</w:t>
-            </w:r>
+              <w:t>On</w:t>
+            </w:r>
+            <w:proofErr w:type="spellEnd"/>
+          </w:p>
+          <w:p>
+            <w:pPr>
+              <w:rPr>
+                <w:rFonts w:ascii="Calibri" w:hAnsi="Calibri" w:cs="Calibri"/>
+                <w:sz w:val="22"/>
+                <w:szCs w:val="22"/>
+              </w:rPr>
+            </w:pPr>
             <w:r>
               <w:rPr>
                 <w:rFonts w:ascii="Segoe UI" w:hAnsi="Segoe UI" w:cs="Segoe UI"/>
@@ -2576,14 +2708,23 @@
                 <w:sz w:val="20"/>
                 <w:szCs w:val="20"/>
               </w:rPr>
-              <w:t>On</w:t>
-            </w:r>
-            <w:proofErr w:type="spellEnd"/>
-          </w:p>
-          <w:p>
-            <w:pPr>
-              <w:rPr>
-                <w:rFonts w:ascii="Calibri" w:hAnsi="Calibri" w:cs="Calibri"/>
+              <w:t>GUID</w:t>
+            </w:r>
+          </w:p>
+        </w:tc>
+      </w:tr>
+      <w:tr>
+        <w:tc>
+          <w:tcPr>
+            <w:tcW w:w="827" w:type="dxa"/>
+            <w:vAlign w:val="center"/>
+          </w:tcPr>
+          <w:p>
+            <w:pPr>
+              <w:rPr>
+                <w:rFonts w:ascii="Calibri" w:hAnsi="Calibri" w:cs="Calibri"/>
+                <w:b/>
+                <w:bCs/>
                 <w:sz w:val="22"/>
                 <w:szCs w:val="22"/>
               </w:rPr>
@@ -2596,7 +2737,238 @@
                 <w:sz w:val="20"/>
                 <w:szCs w:val="20"/>
               </w:rPr>
-              <w:t>GUID</w:t>
+              <w:t>Initial</w:t>
+            </w:r>
+          </w:p>
+        </w:tc>
+        <w:tc>
+          <w:tcPr>
+            <w:tcW w:w="1429" w:type="dxa"/>
+            <w:vAlign w:val="center"/>
+          </w:tcPr>
+          <w:p>
+            <w:pPr>
+              <w:rPr>
+                <w:rFonts w:ascii="Calibri" w:hAnsi="Calibri" w:cs="Calibri"/>
+                <w:sz w:val="22"/>
+                <w:szCs w:val="22"/>
+              </w:rPr>
+            </w:pPr>
+            <w:r>
+              <w:rPr>
+                <w:rFonts w:ascii="Calibri" w:hAnsi="Calibri" w:cs="Calibri"/>
+                <w:sz w:val="22"/>
+                <w:szCs w:val="22"/>
+              </w:rPr>
+              <w:t>c29c6d6a-4755-4a75-bfce-</w:t>
+            </w:r>
+            <w:r>
+              <w:rPr>
+                <w:rFonts w:ascii="Calibri" w:hAnsi="Calibri" w:cs="Calibri"/>
+                <w:sz w:val="22"/>
+                <w:szCs w:val="22"/>
+              </w:rPr>
+              <w:br/>
+              <w:t>e8d307264bc2</w:t>
+            </w:r>
+            <w:r>
+              <w:rPr>
+                <w:rFonts w:ascii="Calibri" w:hAnsi="Calibri" w:cs="Calibri"/>
+                <w:sz w:val="22"/>
+                <w:szCs w:val="22"/>
+              </w:rPr>
+              <w:br/>
+            </w:r>
+          </w:p>
+        </w:tc>
+        <w:tc>
+          <w:tcPr>
+            <w:tcW w:w="1423" w:type="dxa"/>
+            <w:vAlign w:val="center"/>
+          </w:tcPr>
+          <w:p>
+            <w:pPr>
+              <w:rPr>
+                <w:rFonts w:ascii="Calibri" w:hAnsi="Calibri" w:cs="Calibri"/>
+                <w:sz w:val="22"/>
+                <w:szCs w:val="22"/>
+              </w:rPr>
+            </w:pPr>
+            <w:r>
+              <w:rPr>
+                <w:rFonts w:ascii="Calibri" w:hAnsi="Calibri" w:cs="Calibri"/>
+                <w:sz w:val="22"/>
+                <w:szCs w:val="22"/>
+              </w:rPr>
+              <w:t>b37e9857-d90d-44f0-a32a- 72e97ff27c7d</w:t>
+            </w:r>
+            <w:r>
+              <w:rPr>
+                <w:rFonts w:ascii="Calibri" w:hAnsi="Calibri" w:cs="Calibri"/>
+                <w:sz w:val="22"/>
+                <w:szCs w:val="22"/>
+              </w:rPr>
+              <w:br/>
+            </w:r>
+          </w:p>
+        </w:tc>
+        <w:tc>
+          <w:tcPr>
+            <w:tcW w:w="1413" w:type="dxa"/>
+            <w:vAlign w:val="center"/>
+          </w:tcPr>
+          <w:p>
+            <w:pPr>
+              <w:rPr>
+                <w:rFonts w:ascii="Calibri" w:hAnsi="Calibri" w:cs="Calibri"/>
+                <w:sz w:val="22"/>
+                <w:szCs w:val="22"/>
+              </w:rPr>
+            </w:pPr>
+            <w:r>
+              <w:rPr>
+                <w:rFonts w:ascii="Calibri" w:hAnsi="Calibri" w:cs="Calibri"/>
+                <w:sz w:val="22"/>
+                <w:szCs w:val="22"/>
+              </w:rPr>
+              <w:t>81716932-931b-4d54-aeba-</w:t>
+            </w:r>
+            <w:r>
+              <w:rPr>
+                <w:rFonts w:ascii="Calibri" w:hAnsi="Calibri" w:cs="Calibri"/>
+                <w:sz w:val="22"/>
+                <w:szCs w:val="22"/>
+              </w:rPr>
+              <w:br/>
+              <w:t>Od05d8a2a8fd</w:t>
+            </w:r>
+            <w:r>
+              <w:rPr>
+                <w:rFonts w:ascii="Calibri" w:hAnsi="Calibri" w:cs="Calibri"/>
+                <w:sz w:val="22"/>
+                <w:szCs w:val="22"/>
+              </w:rPr>
+              <w:br/>
+            </w:r>
+          </w:p>
+        </w:tc>
+        <w:tc>
+          <w:tcPr>
+            <w:tcW w:w="1407" w:type="dxa"/>
+            <w:vAlign w:val="center"/>
+          </w:tcPr>
+          <w:p>
+            <w:pPr>
+              <w:rPr>
+                <w:rFonts w:ascii="Calibri" w:hAnsi="Calibri" w:cs="Calibri"/>
+                <w:sz w:val="22"/>
+                <w:szCs w:val="22"/>
+              </w:rPr>
+            </w:pPr>
+            <w:r>
+              <w:rPr>
+                <w:rFonts w:ascii="Calibri" w:hAnsi="Calibri" w:cs="Calibri"/>
+                <w:sz w:val="22"/>
+                <w:szCs w:val="22"/>
+              </w:rPr>
+              <w:t>97cc46f3-ab2a-46e4-</w:t>
+            </w:r>
+            <w:r>
+              <w:rPr>
+                <w:rFonts w:ascii="Calibri" w:hAnsi="Calibri" w:cs="Calibri"/>
+                <w:sz w:val="22"/>
+                <w:szCs w:val="22"/>
+              </w:rPr>
+              <w:br/>
+              <w:t>927f-33cb6e580a18</w:t>
+            </w:r>
+            <w:r>
+              <w:rPr>
+                <w:rFonts w:ascii="Calibri" w:hAnsi="Calibri" w:cs="Calibri"/>
+                <w:sz w:val="22"/>
+                <w:szCs w:val="22"/>
+              </w:rPr>
+              <w:br/>
+            </w:r>
+          </w:p>
+        </w:tc>
+        <w:tc>
+          <w:tcPr>
+            <w:tcW w:w="1416" w:type="dxa"/>
+            <w:vAlign w:val="center"/>
+          </w:tcPr>
+          <w:p>
+            <w:pPr>
+              <w:rPr>
+                <w:rFonts w:ascii="Calibri" w:hAnsi="Calibri" w:cs="Calibri"/>
+                <w:sz w:val="22"/>
+                <w:szCs w:val="22"/>
+              </w:rPr>
+            </w:pPr>
+            <w:r>
+              <w:rPr>
+                <w:rFonts w:ascii="Calibri" w:hAnsi="Calibri" w:cs="Calibri"/>
+                <w:sz w:val="22"/>
+                <w:szCs w:val="22"/>
+              </w:rPr>
+              <w:t>12549639-68c4-436f-bf9d-</w:t>
+            </w:r>
+            <w:r>
+              <w:rPr>
+                <w:rFonts w:ascii="Calibri" w:hAnsi="Calibri" w:cs="Calibri"/>
+                <w:sz w:val="22"/>
+                <w:szCs w:val="22"/>
+              </w:rPr>
+              <w:br/>
+              <w:t>2d49ea7e0ebf</w:t>
+            </w:r>
+            <w:r>
+              <w:rPr>
+                <w:rFonts w:ascii="Calibri" w:hAnsi="Calibri" w:cs="Calibri"/>
+                <w:sz w:val="22"/>
+                <w:szCs w:val="22"/>
+              </w:rPr>
+              <w:br/>
+            </w:r>
+          </w:p>
+        </w:tc>
+        <w:tc>
+          <w:tcPr>
+            <w:tcW w:w="1435" w:type="dxa"/>
+            <w:vAlign w:val="center"/>
+          </w:tcPr>
+          <w:p>
+            <w:pPr>
+              <w:rPr>
+                <w:rFonts w:ascii="Calibri" w:hAnsi="Calibri" w:cs="Calibri"/>
+                <w:sz w:val="22"/>
+                <w:szCs w:val="22"/>
+              </w:rPr>
+            </w:pPr>
+            <w:r>
+              <w:rPr>
+                <w:rFonts w:ascii="Calibri" w:hAnsi="Calibri" w:cs="Calibri"/>
+                <w:sz w:val="22"/>
+                <w:szCs w:val="22"/>
+              </w:rPr>
+              <w:t>75fce5ba-0025-</w:t>
+            </w:r>
+            <w:r>
+              <w:rPr>
+                <w:rFonts w:ascii="Calibri" w:hAnsi="Calibri" w:cs="Calibri"/>
+                <w:sz w:val="22"/>
+                <w:szCs w:val="22"/>
+              </w:rPr>
+              <w:br/>
+              <w:t>4a99-8dac-102464b88304</w:t>
+            </w:r>
+            <w:r>
+              <w:rPr>
+                <w:rFonts w:ascii="Calibri" w:hAnsi="Calibri" w:cs="Calibri"/>
+                <w:sz w:val="22"/>
+                <w:szCs w:val="22"/>
+              </w:rPr>
+              <w:br/>
             </w:r>
           </w:p>
         </w:tc>
@@ -2625,258 +2997,8 @@
                 <w:sz w:val="20"/>
                 <w:szCs w:val="20"/>
               </w:rPr>
-              <w:t>Initial</w:t>
-            </w:r>
-          </w:p>
-        </w:tc>
-        <w:tc>
-          <w:tcPr>
-            <w:tcW w:w="1429" w:type="dxa"/>
-            <w:vAlign w:val="center"/>
-          </w:tcPr>
-          <w:p>
-            <w:pPr>
-              <w:rPr>
-                <w:rFonts w:ascii="Calibri" w:hAnsi="Calibri" w:cs="Calibri"/>
-                <w:sz w:val="22"/>
-                <w:szCs w:val="22"/>
-              </w:rPr>
-            </w:pPr>
-            <w:r>
-              <w:rPr>
-                <w:rFonts w:ascii="Calibri" w:hAnsi="Calibri" w:cs="Calibri"/>
-                <w:sz w:val="22"/>
-                <w:szCs w:val="22"/>
-              </w:rPr>
-              <w:t>c29c6d6a-4755-4a75-bfce-</w:t>
-            </w:r>
-            <w:r>
-              <w:rPr>
-                <w:rFonts w:ascii="Calibri" w:hAnsi="Calibri" w:cs="Calibri"/>
-                <w:sz w:val="22"/>
-                <w:szCs w:val="22"/>
-              </w:rPr>
-              <w:br/>
-              <w:t>e8d307264bc2</w:t>
-            </w:r>
-            <w:r>
-              <w:rPr>
-                <w:rFonts w:ascii="Calibri" w:hAnsi="Calibri" w:cs="Calibri"/>
-                <w:sz w:val="22"/>
-                <w:szCs w:val="22"/>
-              </w:rPr>
-              <w:br/>
-            </w:r>
-          </w:p>
-        </w:tc>
-        <w:tc>
-          <w:tcPr>
-            <w:tcW w:w="1423" w:type="dxa"/>
-            <w:vAlign w:val="center"/>
-          </w:tcPr>
-          <w:p>
-            <w:pPr>
-              <w:rPr>
-                <w:rFonts w:ascii="Calibri" w:hAnsi="Calibri" w:cs="Calibri"/>
-                <w:sz w:val="22"/>
-                <w:szCs w:val="22"/>
-              </w:rPr>
-            </w:pPr>
-            <w:r>
-              <w:rPr>
-                <w:rFonts w:ascii="Calibri" w:hAnsi="Calibri" w:cs="Calibri"/>
-                <w:sz w:val="22"/>
-                <w:szCs w:val="22"/>
-              </w:rPr>
-              <w:t>b37e9857-d90d-44f0-a32a- 72e97ff27c7d</w:t>
-            </w:r>
-            <w:r>
-              <w:rPr>
-                <w:rFonts w:ascii="Calibri" w:hAnsi="Calibri" w:cs="Calibri"/>
-                <w:sz w:val="22"/>
-                <w:szCs w:val="22"/>
-              </w:rPr>
-              <w:br/>
-            </w:r>
-          </w:p>
-        </w:tc>
-        <w:tc>
-          <w:tcPr>
-            <w:tcW w:w="1413" w:type="dxa"/>
-            <w:vAlign w:val="center"/>
-          </w:tcPr>
-          <w:p>
-            <w:pPr>
-              <w:rPr>
-                <w:rFonts w:ascii="Calibri" w:hAnsi="Calibri" w:cs="Calibri"/>
-                <w:sz w:val="22"/>
-                <w:szCs w:val="22"/>
-              </w:rPr>
-            </w:pPr>
-            <w:r>
-              <w:rPr>
-                <w:rFonts w:ascii="Calibri" w:hAnsi="Calibri" w:cs="Calibri"/>
-                <w:sz w:val="22"/>
-                <w:szCs w:val="22"/>
-              </w:rPr>
-              <w:t>81716932-931b-4d54-aeba-</w:t>
-            </w:r>
-            <w:r>
-              <w:rPr>
-                <w:rFonts w:ascii="Calibri" w:hAnsi="Calibri" w:cs="Calibri"/>
-                <w:sz w:val="22"/>
-                <w:szCs w:val="22"/>
-              </w:rPr>
-              <w:br/>
-              <w:t>Od05d8a2a8fd</w:t>
-            </w:r>
-            <w:r>
-              <w:rPr>
-                <w:rFonts w:ascii="Calibri" w:hAnsi="Calibri" w:cs="Calibri"/>
-                <w:sz w:val="22"/>
-                <w:szCs w:val="22"/>
-              </w:rPr>
-              <w:br/>
-            </w:r>
-          </w:p>
-        </w:tc>
-        <w:tc>
-          <w:tcPr>
-            <w:tcW w:w="1407" w:type="dxa"/>
-            <w:vAlign w:val="center"/>
-          </w:tcPr>
-          <w:p>
-            <w:pPr>
-              <w:rPr>
-                <w:rFonts w:ascii="Calibri" w:hAnsi="Calibri" w:cs="Calibri"/>
-                <w:sz w:val="22"/>
-                <w:szCs w:val="22"/>
-              </w:rPr>
-            </w:pPr>
-            <w:r>
-              <w:rPr>
-                <w:rFonts w:ascii="Calibri" w:hAnsi="Calibri" w:cs="Calibri"/>
-                <w:sz w:val="22"/>
-                <w:szCs w:val="22"/>
-              </w:rPr>
-              <w:t>97cc46f3-ab2a-46e4-</w:t>
-            </w:r>
-            <w:r>
-              <w:rPr>
-                <w:rFonts w:ascii="Calibri" w:hAnsi="Calibri" w:cs="Calibri"/>
-                <w:sz w:val="22"/>
-                <w:szCs w:val="22"/>
-              </w:rPr>
-              <w:br/>
-              <w:t>927f-33cb6e580a18</w:t>
-            </w:r>
-            <w:r>
-              <w:rPr>
-                <w:rFonts w:ascii="Calibri" w:hAnsi="Calibri" w:cs="Calibri"/>
-                <w:sz w:val="22"/>
-                <w:szCs w:val="22"/>
-              </w:rPr>
-              <w:br/>
-            </w:r>
-          </w:p>
-        </w:tc>
-        <w:tc>
-          <w:tcPr>
-            <w:tcW w:w="1416" w:type="dxa"/>
-            <w:vAlign w:val="center"/>
-          </w:tcPr>
-          <w:p>
-            <w:pPr>
-              <w:rPr>
-                <w:rFonts w:ascii="Calibri" w:hAnsi="Calibri" w:cs="Calibri"/>
-                <w:sz w:val="22"/>
-                <w:szCs w:val="22"/>
-              </w:rPr>
-            </w:pPr>
-            <w:r>
-              <w:rPr>
-                <w:rFonts w:ascii="Calibri" w:hAnsi="Calibri" w:cs="Calibri"/>
-                <w:sz w:val="22"/>
-                <w:szCs w:val="22"/>
-              </w:rPr>
-              <w:t>12549639-68c4-436f-bf9d-</w:t>
-            </w:r>
-            <w:r>
-              <w:rPr>
-                <w:rFonts w:ascii="Calibri" w:hAnsi="Calibri" w:cs="Calibri"/>
-                <w:sz w:val="22"/>
-                <w:szCs w:val="22"/>
-              </w:rPr>
-              <w:br/>
-              <w:t>2d49ea7e0ebf</w:t>
-            </w:r>
-            <w:r>
-              <w:rPr>
-                <w:rFonts w:ascii="Calibri" w:hAnsi="Calibri" w:cs="Calibri"/>
-                <w:sz w:val="22"/>
-                <w:szCs w:val="22"/>
-              </w:rPr>
-              <w:br/>
-            </w:r>
-          </w:p>
-        </w:tc>
-        <w:tc>
-          <w:tcPr>
-            <w:tcW w:w="1435" w:type="dxa"/>
-            <w:vAlign w:val="center"/>
-          </w:tcPr>
-          <w:p>
-            <w:pPr>
-              <w:rPr>
-                <w:rFonts w:ascii="Calibri" w:hAnsi="Calibri" w:cs="Calibri"/>
-                <w:sz w:val="22"/>
-                <w:szCs w:val="22"/>
-              </w:rPr>
-            </w:pPr>
-            <w:r>
-              <w:rPr>
-                <w:rFonts w:ascii="Calibri" w:hAnsi="Calibri" w:cs="Calibri"/>
-                <w:sz w:val="22"/>
-                <w:szCs w:val="22"/>
-              </w:rPr>
-              <w:t>75fce5ba-0025-</w:t>
-            </w:r>
-            <w:r>
-              <w:rPr>
-                <w:rFonts w:ascii="Calibri" w:hAnsi="Calibri" w:cs="Calibri"/>
-                <w:sz w:val="22"/>
-                <w:szCs w:val="22"/>
-              </w:rPr>
-              <w:br/>
-              <w:t>4a99-8dac-102464b88304</w:t>
-            </w:r>
-            <w:r>
-              <w:rPr>
-                <w:rFonts w:ascii="Calibri" w:hAnsi="Calibri" w:cs="Calibri"/>
-                <w:sz w:val="22"/>
-                <w:szCs w:val="22"/>
-              </w:rPr>
-              <w:br/>
-            </w:r>
-          </w:p>
-        </w:tc>
-      </w:tr>
-      <w:tr>
-        <w:tc>
-          <w:tcPr>
-            <w:tcW w:w="827" w:type="dxa"/>
-            <w:vAlign w:val="center"/>
-          </w:tcPr>
-          <w:p>
-            <w:pPr>
-              <w:rPr>
-                <w:rFonts w:ascii="Calibri" w:hAnsi="Calibri" w:cs="Calibri"/>
-                <w:b/>
-                <w:bCs/>
-                <w:sz w:val="22"/>
-                <w:szCs w:val="22"/>
-              </w:rPr>
-            </w:pPr>
+              <w:t xml:space="preserve">After </w:t>
+            </w:r>
             <w:r>
               <w:rPr>
                 <w:rFonts w:ascii="Segoe UI" w:hAnsi="Segoe UI" w:cs="Segoe UI"/>
@@ -2885,7 +3007,7 @@
                 <w:sz w:val="20"/>
                 <w:szCs w:val="20"/>
               </w:rPr>
-              <w:t xml:space="preserve">After </w:t>
+              <w:t>+</w:t>
             </w:r>
             <w:r>
               <w:rPr>
@@ -2895,7 +3017,7 @@
                 <w:sz w:val="20"/>
                 <w:szCs w:val="20"/>
               </w:rPr>
-              <w:t>+</w:t>
+              <w:t>10</w:t>
             </w:r>
             <w:r>
               <w:rPr>
@@ -2905,7 +3027,7 @@
                 <w:sz w:val="20"/>
                 <w:szCs w:val="20"/>
               </w:rPr>
-              <w:t>10</w:t>
+              <w:t xml:space="preserve"> sec</w:t>
             </w:r>
             <w:r>
               <w:rPr>
@@ -2915,8 +3037,226 @@
                 <w:sz w:val="20"/>
                 <w:szCs w:val="20"/>
               </w:rPr>
-              <w:t xml:space="preserve"> sec</w:t>
-            </w:r>
+              <w:t xml:space="preserve"> ‏</w:t>
+            </w:r>
+          </w:p>
+        </w:tc>
+        <w:tc>
+          <w:tcPr>
+            <w:tcW w:w="1429" w:type="dxa"/>
+          </w:tcPr>
+          <w:p>
+            <w:pPr>
+              <w:rPr>
+                <w:rFonts w:ascii="Calibri" w:hAnsi="Calibri" w:cs="Calibri"/>
+                <w:sz w:val="22"/>
+                <w:szCs w:val="22"/>
+              </w:rPr>
+            </w:pPr>
+            <w:r>
+              <w:rPr>
+                <w:rFonts w:ascii="Calibri" w:hAnsi="Calibri" w:cs="Calibri"/>
+                <w:sz w:val="22"/>
+                <w:szCs w:val="22"/>
+              </w:rPr>
+              <w:t>bf485309-0525-4e66-9cfd- 09b1666e5492</w:t>
+            </w:r>
+          </w:p>
+        </w:tc>
+        <w:tc>
+          <w:tcPr>
+            <w:tcW w:w="1423" w:type="dxa"/>
+          </w:tcPr>
+          <w:p>
+            <w:pPr>
+              <w:rPr>
+                <w:rFonts w:ascii="Calibri" w:hAnsi="Calibri" w:cs="Calibri"/>
+                <w:sz w:val="22"/>
+                <w:szCs w:val="22"/>
+              </w:rPr>
+            </w:pPr>
+            <w:r>
+              <w:rPr>
+                <w:rFonts w:ascii="Calibri" w:hAnsi="Calibri" w:cs="Calibri"/>
+                <w:sz w:val="22"/>
+                <w:szCs w:val="22"/>
+              </w:rPr>
+              <w:t>b37e9857-d90d-44f0-a32a- 72e97ff27c7d</w:t>
+            </w:r>
+            <w:r>
+              <w:rPr>
+                <w:rFonts w:ascii="Calibri" w:hAnsi="Calibri" w:cs="Calibri"/>
+                <w:sz w:val="22"/>
+                <w:szCs w:val="22"/>
+              </w:rPr>
+              <w:br/>
+            </w:r>
+          </w:p>
+        </w:tc>
+        <w:tc>
+          <w:tcPr>
+            <w:tcW w:w="1413" w:type="dxa"/>
+          </w:tcPr>
+          <w:p>
+            <w:pPr>
+              <w:rPr>
+                <w:rFonts w:ascii="Calibri" w:hAnsi="Calibri" w:cs="Calibri"/>
+                <w:sz w:val="22"/>
+                <w:szCs w:val="22"/>
+              </w:rPr>
+            </w:pPr>
+            <w:r>
+              <w:rPr>
+                <w:rFonts w:ascii="Calibri" w:hAnsi="Calibri" w:cs="Calibri"/>
+                <w:sz w:val="22"/>
+                <w:szCs w:val="22"/>
+              </w:rPr>
+              <w:t>6c92ab8a-1b8a-4b67-8dc4-</w:t>
+            </w:r>
+            <w:r>
+              <w:rPr>
+                <w:rFonts w:ascii="Calibri" w:hAnsi="Calibri" w:cs="Calibri"/>
+                <w:sz w:val="22"/>
+                <w:szCs w:val="22"/>
+              </w:rPr>
+              <w:br/>
+              <w:t>6c5d9cfa36c9</w:t>
+            </w:r>
+            <w:r>
+              <w:rPr>
+                <w:rFonts w:ascii="Calibri" w:hAnsi="Calibri" w:cs="Calibri"/>
+                <w:sz w:val="22"/>
+                <w:szCs w:val="22"/>
+              </w:rPr>
+              <w:br/>
+            </w:r>
+          </w:p>
+        </w:tc>
+        <w:tc>
+          <w:tcPr>
+            <w:tcW w:w="1407" w:type="dxa"/>
+          </w:tcPr>
+          <w:p>
+            <w:pPr>
+              <w:rPr>
+                <w:rFonts w:ascii="Calibri" w:hAnsi="Calibri" w:cs="Calibri"/>
+                <w:sz w:val="22"/>
+                <w:szCs w:val="22"/>
+              </w:rPr>
+            </w:pPr>
+            <w:r>
+              <w:rPr>
+                <w:rFonts w:ascii="Calibri" w:hAnsi="Calibri" w:cs="Calibri"/>
+                <w:sz w:val="22"/>
+                <w:szCs w:val="22"/>
+              </w:rPr>
+              <w:t>ac0280f4-fe48-4746- 89d3-2f622b276725</w:t>
+            </w:r>
+            <w:r>
+              <w:rPr>
+                <w:rFonts w:ascii="Calibri" w:hAnsi="Calibri" w:cs="Calibri"/>
+                <w:sz w:val="22"/>
+                <w:szCs w:val="22"/>
+              </w:rPr>
+              <w:br/>
+            </w:r>
+          </w:p>
+        </w:tc>
+        <w:tc>
+          <w:tcPr>
+            <w:tcW w:w="1416" w:type="dxa"/>
+          </w:tcPr>
+          <w:p>
+            <w:pPr>
+              <w:rPr>
+                <w:rFonts w:ascii="Calibri" w:hAnsi="Calibri" w:cs="Calibri"/>
+                <w:sz w:val="22"/>
+                <w:szCs w:val="22"/>
+              </w:rPr>
+            </w:pPr>
+            <w:r>
+              <w:rPr>
+                <w:rFonts w:ascii="Calibri" w:hAnsi="Calibri" w:cs="Calibri"/>
+                <w:sz w:val="22"/>
+                <w:szCs w:val="22"/>
+              </w:rPr>
+              <w:t>12549639-68c4-436f-bf9d-</w:t>
+            </w:r>
+            <w:r>
+              <w:rPr>
+                <w:rFonts w:ascii="Calibri" w:hAnsi="Calibri" w:cs="Calibri"/>
+                <w:sz w:val="22"/>
+                <w:szCs w:val="22"/>
+              </w:rPr>
+              <w:br/>
+              <w:t>2d49ea7e0ebf</w:t>
+            </w:r>
+            <w:r>
+              <w:rPr>
+                <w:rFonts w:ascii="Calibri" w:hAnsi="Calibri" w:cs="Calibri"/>
+                <w:sz w:val="22"/>
+                <w:szCs w:val="22"/>
+              </w:rPr>
+              <w:br/>
+            </w:r>
+          </w:p>
+        </w:tc>
+        <w:tc>
+          <w:tcPr>
+            <w:tcW w:w="1435" w:type="dxa"/>
+          </w:tcPr>
+          <w:p>
+            <w:pPr>
+              <w:rPr>
+                <w:rFonts w:ascii="Calibri" w:hAnsi="Calibri" w:cs="Calibri"/>
+                <w:sz w:val="22"/>
+                <w:szCs w:val="22"/>
+              </w:rPr>
+            </w:pPr>
+            <w:r>
+              <w:rPr>
+                <w:rFonts w:ascii="Calibri" w:hAnsi="Calibri" w:cs="Calibri"/>
+                <w:sz w:val="22"/>
+                <w:szCs w:val="22"/>
+              </w:rPr>
+              <w:t>75fce5ba-0025-</w:t>
+            </w:r>
+            <w:r>
+              <w:rPr>
+                <w:rFonts w:ascii="Calibri" w:hAnsi="Calibri" w:cs="Calibri"/>
+                <w:sz w:val="22"/>
+                <w:szCs w:val="22"/>
+              </w:rPr>
+              <w:br/>
+              <w:t>4a99-8dac-102464b88304</w:t>
+            </w:r>
+            <w:r>
+              <w:rPr>
+                <w:rFonts w:ascii="Calibri" w:hAnsi="Calibri" w:cs="Calibri"/>
+                <w:sz w:val="22"/>
+                <w:szCs w:val="22"/>
+              </w:rPr>
+              <w:br/>
+            </w:r>
+          </w:p>
+        </w:tc>
+      </w:tr>
+      <w:tr>
+        <w:tc>
+          <w:tcPr>
+            <w:tcW w:w="827" w:type="dxa"/>
+            <w:vAlign w:val="center"/>
+          </w:tcPr>
+          <w:p>
+            <w:pPr>
+              <w:rPr>
+                <w:rFonts w:ascii="Calibri" w:hAnsi="Calibri" w:cs="Calibri"/>
+                <w:b/>
+                <w:bCs/>
+                <w:sz w:val="22"/>
+                <w:szCs w:val="22"/>
+              </w:rPr>
+            </w:pPr>
             <w:r>
               <w:rPr>
                 <w:rFonts w:ascii="Segoe UI" w:hAnsi="Segoe UI" w:cs="Segoe UI"/>
@@ -2925,226 +3265,8 @@
                 <w:sz w:val="20"/>
                 <w:szCs w:val="20"/>
               </w:rPr>
-              <w:t xml:space="preserve"> ‏</w:t>
-            </w:r>
-          </w:p>
-        </w:tc>
-        <w:tc>
-          <w:tcPr>
-            <w:tcW w:w="1429" w:type="dxa"/>
-          </w:tcPr>
-          <w:p>
-            <w:pPr>
-              <w:rPr>
-                <w:rFonts w:ascii="Calibri" w:hAnsi="Calibri" w:cs="Calibri"/>
-                <w:sz w:val="22"/>
-                <w:szCs w:val="22"/>
-              </w:rPr>
-            </w:pPr>
-            <w:r>
-              <w:rPr>
-                <w:rFonts w:ascii="Calibri" w:hAnsi="Calibri" w:cs="Calibri"/>
-                <w:sz w:val="22"/>
-                <w:szCs w:val="22"/>
-              </w:rPr>
-              <w:t>bf485309-0525-4e66-9cfd- 09b1666e5492</w:t>
-            </w:r>
-          </w:p>
-        </w:tc>
-        <w:tc>
-          <w:tcPr>
-            <w:tcW w:w="1423" w:type="dxa"/>
-          </w:tcPr>
-          <w:p>
-            <w:pPr>
-              <w:rPr>
-                <w:rFonts w:ascii="Calibri" w:hAnsi="Calibri" w:cs="Calibri"/>
-                <w:sz w:val="22"/>
-                <w:szCs w:val="22"/>
-              </w:rPr>
-            </w:pPr>
-            <w:r>
-              <w:rPr>
-                <w:rFonts w:ascii="Calibri" w:hAnsi="Calibri" w:cs="Calibri"/>
-                <w:sz w:val="22"/>
-                <w:szCs w:val="22"/>
-              </w:rPr>
-              <w:t>b37e9857-d90d-44f0-a32a- 72e97ff27c7d</w:t>
-            </w:r>
-            <w:r>
-              <w:rPr>
-                <w:rFonts w:ascii="Calibri" w:hAnsi="Calibri" w:cs="Calibri"/>
-                <w:sz w:val="22"/>
-                <w:szCs w:val="22"/>
-              </w:rPr>
-              <w:br/>
-            </w:r>
-          </w:p>
-        </w:tc>
-        <w:tc>
-          <w:tcPr>
-            <w:tcW w:w="1413" w:type="dxa"/>
-          </w:tcPr>
-          <w:p>
-            <w:pPr>
-              <w:rPr>
-                <w:rFonts w:ascii="Calibri" w:hAnsi="Calibri" w:cs="Calibri"/>
-                <w:sz w:val="22"/>
-                <w:szCs w:val="22"/>
-              </w:rPr>
-            </w:pPr>
-            <w:r>
-              <w:rPr>
-                <w:rFonts w:ascii="Calibri" w:hAnsi="Calibri" w:cs="Calibri"/>
-                <w:sz w:val="22"/>
-                <w:szCs w:val="22"/>
-              </w:rPr>
-              <w:t>6c92ab8a-1b8a-4b67-8dc4-</w:t>
-            </w:r>
-            <w:r>
-              <w:rPr>
-                <w:rFonts w:ascii="Calibri" w:hAnsi="Calibri" w:cs="Calibri"/>
-                <w:sz w:val="22"/>
-                <w:szCs w:val="22"/>
-              </w:rPr>
-              <w:br/>
-              <w:t>6c5d9cfa36c9</w:t>
-            </w:r>
-            <w:r>
-              <w:rPr>
-                <w:rFonts w:ascii="Calibri" w:hAnsi="Calibri" w:cs="Calibri"/>
-                <w:sz w:val="22"/>
-                <w:szCs w:val="22"/>
-              </w:rPr>
-              <w:br/>
-            </w:r>
-          </w:p>
-        </w:tc>
-        <w:tc>
-          <w:tcPr>
-            <w:tcW w:w="1407" w:type="dxa"/>
-          </w:tcPr>
-          <w:p>
-            <w:pPr>
-              <w:rPr>
-                <w:rFonts w:ascii="Calibri" w:hAnsi="Calibri" w:cs="Calibri"/>
-                <w:sz w:val="22"/>
-                <w:szCs w:val="22"/>
-              </w:rPr>
-            </w:pPr>
-            <w:r>
-              <w:rPr>
-                <w:rFonts w:ascii="Calibri" w:hAnsi="Calibri" w:cs="Calibri"/>
-                <w:sz w:val="22"/>
-                <w:szCs w:val="22"/>
-              </w:rPr>
-              <w:t>ac0280f4-fe48-4746- 89d3-2f622b276725</w:t>
-            </w:r>
-            <w:r>
-              <w:rPr>
-                <w:rFonts w:ascii="Calibri" w:hAnsi="Calibri" w:cs="Calibri"/>
-                <w:sz w:val="22"/>
-                <w:szCs w:val="22"/>
-              </w:rPr>
-              <w:br/>
-            </w:r>
-          </w:p>
-        </w:tc>
-        <w:tc>
-          <w:tcPr>
-            <w:tcW w:w="1416" w:type="dxa"/>
-          </w:tcPr>
-          <w:p>
-            <w:pPr>
-              <w:rPr>
-                <w:rFonts w:ascii="Calibri" w:hAnsi="Calibri" w:cs="Calibri"/>
-                <w:sz w:val="22"/>
-                <w:szCs w:val="22"/>
-              </w:rPr>
-            </w:pPr>
-            <w:r>
-              <w:rPr>
-                <w:rFonts w:ascii="Calibri" w:hAnsi="Calibri" w:cs="Calibri"/>
-                <w:sz w:val="22"/>
-                <w:szCs w:val="22"/>
-              </w:rPr>
-              <w:t>12549639-68c4-436f-bf9d-</w:t>
-            </w:r>
-            <w:r>
-              <w:rPr>
-                <w:rFonts w:ascii="Calibri" w:hAnsi="Calibri" w:cs="Calibri"/>
-                <w:sz w:val="22"/>
-                <w:szCs w:val="22"/>
-              </w:rPr>
-              <w:br/>
-              <w:t>2d49ea7e0ebf</w:t>
-            </w:r>
-            <w:r>
-              <w:rPr>
-                <w:rFonts w:ascii="Calibri" w:hAnsi="Calibri" w:cs="Calibri"/>
-                <w:sz w:val="22"/>
-                <w:szCs w:val="22"/>
-              </w:rPr>
-              <w:br/>
-            </w:r>
-          </w:p>
-        </w:tc>
-        <w:tc>
-          <w:tcPr>
-            <w:tcW w:w="1435" w:type="dxa"/>
-          </w:tcPr>
-          <w:p>
-            <w:pPr>
-              <w:rPr>
-                <w:rFonts w:ascii="Calibri" w:hAnsi="Calibri" w:cs="Calibri"/>
-                <w:sz w:val="22"/>
-                <w:szCs w:val="22"/>
-              </w:rPr>
-            </w:pPr>
-            <w:r>
-              <w:rPr>
-                <w:rFonts w:ascii="Calibri" w:hAnsi="Calibri" w:cs="Calibri"/>
-                <w:sz w:val="22"/>
-                <w:szCs w:val="22"/>
-              </w:rPr>
-              <w:t>75fce5ba-0025-</w:t>
-            </w:r>
-            <w:r>
-              <w:rPr>
-                <w:rFonts w:ascii="Calibri" w:hAnsi="Calibri" w:cs="Calibri"/>
-                <w:sz w:val="22"/>
-                <w:szCs w:val="22"/>
-              </w:rPr>
-              <w:br/>
-              <w:t>4a99-8dac-102464b88304</w:t>
-            </w:r>
-            <w:r>
-              <w:rPr>
-                <w:rFonts w:ascii="Calibri" w:hAnsi="Calibri" w:cs="Calibri"/>
-                <w:sz w:val="22"/>
-                <w:szCs w:val="22"/>
-              </w:rPr>
-              <w:br/>
-            </w:r>
-          </w:p>
-        </w:tc>
-      </w:tr>
-      <w:tr>
-        <w:tc>
-          <w:tcPr>
-            <w:tcW w:w="827" w:type="dxa"/>
-            <w:vAlign w:val="center"/>
-          </w:tcPr>
-          <w:p>
-            <w:pPr>
-              <w:rPr>
-                <w:rFonts w:ascii="Calibri" w:hAnsi="Calibri" w:cs="Calibri"/>
-                <w:b/>
-                <w:bCs/>
-                <w:sz w:val="22"/>
-                <w:szCs w:val="22"/>
-              </w:rPr>
-            </w:pPr>
+              <w:t xml:space="preserve">After </w:t>
+            </w:r>
             <w:r>
               <w:rPr>
                 <w:rFonts w:ascii="Segoe UI" w:hAnsi="Segoe UI" w:cs="Segoe UI"/>
@@ -3153,8 +3275,218 @@
                 <w:sz w:val="20"/>
                 <w:szCs w:val="20"/>
               </w:rPr>
-              <w:t xml:space="preserve">After </w:t>
-            </w:r>
+              <w:t>+15 sec</w:t>
+            </w:r>
+          </w:p>
+        </w:tc>
+        <w:tc>
+          <w:tcPr>
+            <w:tcW w:w="1429" w:type="dxa"/>
+          </w:tcPr>
+          <w:p>
+            <w:pPr>
+              <w:rPr>
+                <w:rFonts w:ascii="Calibri" w:hAnsi="Calibri" w:cs="Calibri"/>
+                <w:sz w:val="22"/>
+                <w:szCs w:val="22"/>
+              </w:rPr>
+            </w:pPr>
+            <w:r>
+              <w:rPr>
+                <w:rFonts w:ascii="Calibri" w:hAnsi="Calibri" w:cs="Calibri"/>
+                <w:sz w:val="22"/>
+                <w:szCs w:val="22"/>
+              </w:rPr>
+              <w:t>bf485309-0525-4e66-9cfd- 09b1666e5492</w:t>
+            </w:r>
+          </w:p>
+        </w:tc>
+        <w:tc>
+          <w:tcPr>
+            <w:tcW w:w="1423" w:type="dxa"/>
+          </w:tcPr>
+          <w:p>
+            <w:pPr>
+              <w:rPr>
+                <w:rFonts w:ascii="Calibri" w:hAnsi="Calibri" w:cs="Calibri"/>
+                <w:sz w:val="22"/>
+                <w:szCs w:val="22"/>
+              </w:rPr>
+            </w:pPr>
+            <w:r>
+              <w:rPr>
+                <w:rFonts w:ascii="Calibri" w:hAnsi="Calibri" w:cs="Calibri"/>
+                <w:sz w:val="22"/>
+                <w:szCs w:val="22"/>
+              </w:rPr>
+              <w:t>b37e9857-d90d-44f0-a32a- 72e97ff27c7d</w:t>
+            </w:r>
+            <w:r>
+              <w:rPr>
+                <w:rFonts w:ascii="Calibri" w:hAnsi="Calibri" w:cs="Calibri"/>
+                <w:sz w:val="22"/>
+                <w:szCs w:val="22"/>
+              </w:rPr>
+              <w:br/>
+            </w:r>
+          </w:p>
+        </w:tc>
+        <w:tc>
+          <w:tcPr>
+            <w:tcW w:w="1413" w:type="dxa"/>
+          </w:tcPr>
+          <w:p>
+            <w:pPr>
+              <w:rPr>
+                <w:rFonts w:ascii="Calibri" w:hAnsi="Calibri" w:cs="Calibri"/>
+                <w:sz w:val="22"/>
+                <w:szCs w:val="22"/>
+              </w:rPr>
+            </w:pPr>
+            <w:r>
+              <w:rPr>
+                <w:rFonts w:ascii="Calibri" w:hAnsi="Calibri" w:cs="Calibri"/>
+                <w:sz w:val="22"/>
+                <w:szCs w:val="22"/>
+              </w:rPr>
+              <w:t>6c92ab8a-1b8a-4b67-8dc4-</w:t>
+            </w:r>
+            <w:r>
+              <w:rPr>
+                <w:rFonts w:ascii="Calibri" w:hAnsi="Calibri" w:cs="Calibri"/>
+                <w:sz w:val="22"/>
+                <w:szCs w:val="22"/>
+              </w:rPr>
+              <w:br/>
+              <w:t>6c5d9cfa36c9</w:t>
+            </w:r>
+            <w:r>
+              <w:rPr>
+                <w:rFonts w:ascii="Calibri" w:hAnsi="Calibri" w:cs="Calibri"/>
+                <w:sz w:val="22"/>
+                <w:szCs w:val="22"/>
+              </w:rPr>
+              <w:br/>
+            </w:r>
+          </w:p>
+        </w:tc>
+        <w:tc>
+          <w:tcPr>
+            <w:tcW w:w="1407" w:type="dxa"/>
+          </w:tcPr>
+          <w:p>
+            <w:pPr>
+              <w:rPr>
+                <w:rFonts w:ascii="Calibri" w:hAnsi="Calibri" w:cs="Calibri"/>
+                <w:sz w:val="22"/>
+                <w:szCs w:val="22"/>
+              </w:rPr>
+            </w:pPr>
+            <w:r>
+              <w:rPr>
+                <w:rFonts w:ascii="Calibri" w:hAnsi="Calibri" w:cs="Calibri"/>
+                <w:sz w:val="22"/>
+                <w:szCs w:val="22"/>
+              </w:rPr>
+              <w:t>ac0280f4-fe48-4746- 89d3-2f622b276725</w:t>
+            </w:r>
+          </w:p>
+        </w:tc>
+        <w:tc>
+          <w:tcPr>
+            <w:tcW w:w="1416" w:type="dxa"/>
+          </w:tcPr>
+          <w:p>
+            <w:pPr>
+              <w:rPr>
+                <w:rFonts w:ascii="Calibri" w:hAnsi="Calibri" w:cs="Calibri"/>
+                <w:sz w:val="22"/>
+                <w:szCs w:val="22"/>
+              </w:rPr>
+            </w:pPr>
+            <w:r>
+              <w:rPr>
+                <w:rFonts w:ascii="Calibri" w:hAnsi="Calibri" w:cs="Calibri"/>
+                <w:sz w:val="22"/>
+                <w:szCs w:val="22"/>
+              </w:rPr>
+              <w:t>12549639-68c4-436f-bf9d-</w:t>
+            </w:r>
+            <w:r>
+              <w:rPr>
+                <w:rFonts w:ascii="Calibri" w:hAnsi="Calibri" w:cs="Calibri"/>
+                <w:sz w:val="22"/>
+                <w:szCs w:val="22"/>
+              </w:rPr>
+              <w:br/>
+              <w:t>2d49ea7e0ebf</w:t>
+            </w:r>
+            <w:r>
+              <w:rPr>
+                <w:rFonts w:ascii="Calibri" w:hAnsi="Calibri" w:cs="Calibri"/>
+                <w:sz w:val="22"/>
+                <w:szCs w:val="22"/>
+              </w:rPr>
+              <w:br/>
+            </w:r>
+          </w:p>
+        </w:tc>
+        <w:tc>
+          <w:tcPr>
+            <w:tcW w:w="1435" w:type="dxa"/>
+          </w:tcPr>
+          <w:p>
+            <w:pPr>
+              <w:rPr>
+                <w:rFonts w:ascii="Calibri" w:hAnsi="Calibri" w:cs="Calibri"/>
+                <w:sz w:val="22"/>
+                <w:szCs w:val="22"/>
+              </w:rPr>
+            </w:pPr>
+            <w:r>
+              <w:rPr>
+                <w:rFonts w:ascii="Calibri" w:hAnsi="Calibri" w:cs="Calibri"/>
+                <w:sz w:val="22"/>
+                <w:szCs w:val="22"/>
+              </w:rPr>
+              <w:t>75fce5ba-0025-</w:t>
+            </w:r>
+            <w:r>
+              <w:rPr>
+                <w:rFonts w:ascii="Calibri" w:hAnsi="Calibri" w:cs="Calibri"/>
+                <w:sz w:val="22"/>
+                <w:szCs w:val="22"/>
+              </w:rPr>
+              <w:br/>
+              <w:t>4a99-8dac-102464b88304</w:t>
+            </w:r>
+            <w:r>
+              <w:rPr>
+                <w:rFonts w:ascii="Calibri" w:hAnsi="Calibri" w:cs="Calibri"/>
+                <w:sz w:val="22"/>
+                <w:szCs w:val="22"/>
+              </w:rPr>
+              <w:br/>
+            </w:r>
+          </w:p>
+        </w:tc>
+      </w:tr>
+      <w:tr>
+        <w:tc>
+          <w:tcPr>
+            <w:tcW w:w="827" w:type="dxa"/>
+            <w:vAlign w:val="center"/>
+          </w:tcPr>
+          <w:p>
+            <w:pPr>
+              <w:rPr>
+                <w:rFonts w:ascii="Calibri" w:hAnsi="Calibri" w:cs="Calibri"/>
+                <w:b/>
+                <w:bCs/>
+                <w:sz w:val="22"/>
+                <w:szCs w:val="22"/>
+              </w:rPr>
+            </w:pPr>
             <w:r>
               <w:rPr>
                 <w:rFonts w:ascii="Segoe UI" w:hAnsi="Segoe UI" w:cs="Segoe UI"/>
@@ -3163,218 +3495,8 @@
                 <w:sz w:val="20"/>
                 <w:szCs w:val="20"/>
               </w:rPr>
-              <w:t>+15 sec</w:t>
-            </w:r>
-          </w:p>
-        </w:tc>
-        <w:tc>
-          <w:tcPr>
-            <w:tcW w:w="1429" w:type="dxa"/>
-          </w:tcPr>
-          <w:p>
-            <w:pPr>
-              <w:rPr>
-                <w:rFonts w:ascii="Calibri" w:hAnsi="Calibri" w:cs="Calibri"/>
-                <w:sz w:val="22"/>
-                <w:szCs w:val="22"/>
-              </w:rPr>
-            </w:pPr>
-            <w:r>
-              <w:rPr>
-                <w:rFonts w:ascii="Calibri" w:hAnsi="Calibri" w:cs="Calibri"/>
-                <w:sz w:val="22"/>
-                <w:szCs w:val="22"/>
-              </w:rPr>
-              <w:t>bf485309-0525-4e66-9cfd- 09b1666e5492</w:t>
-            </w:r>
-          </w:p>
-        </w:tc>
-        <w:tc>
-          <w:tcPr>
-            <w:tcW w:w="1423" w:type="dxa"/>
-          </w:tcPr>
-          <w:p>
-            <w:pPr>
-              <w:rPr>
-                <w:rFonts w:ascii="Calibri" w:hAnsi="Calibri" w:cs="Calibri"/>
-                <w:sz w:val="22"/>
-                <w:szCs w:val="22"/>
-              </w:rPr>
-            </w:pPr>
-            <w:r>
-              <w:rPr>
-                <w:rFonts w:ascii="Calibri" w:hAnsi="Calibri" w:cs="Calibri"/>
-                <w:sz w:val="22"/>
-                <w:szCs w:val="22"/>
-              </w:rPr>
-              <w:t>b37e9857-d90d-44f0-a32a- 72e97ff27c7d</w:t>
-            </w:r>
-            <w:r>
-              <w:rPr>
-                <w:rFonts w:ascii="Calibri" w:hAnsi="Calibri" w:cs="Calibri"/>
-                <w:sz w:val="22"/>
-                <w:szCs w:val="22"/>
-              </w:rPr>
-              <w:br/>
-            </w:r>
-          </w:p>
-        </w:tc>
-        <w:tc>
-          <w:tcPr>
-            <w:tcW w:w="1413" w:type="dxa"/>
-          </w:tcPr>
-          <w:p>
-            <w:pPr>
-              <w:rPr>
-                <w:rFonts w:ascii="Calibri" w:hAnsi="Calibri" w:cs="Calibri"/>
-                <w:sz w:val="22"/>
-                <w:szCs w:val="22"/>
-              </w:rPr>
-            </w:pPr>
-            <w:r>
-              <w:rPr>
-                <w:rFonts w:ascii="Calibri" w:hAnsi="Calibri" w:cs="Calibri"/>
-                <w:sz w:val="22"/>
-                <w:szCs w:val="22"/>
-              </w:rPr>
-              <w:t>6c92ab8a-1b8a-4b67-8dc4-</w:t>
-            </w:r>
-            <w:r>
-              <w:rPr>
-                <w:rFonts w:ascii="Calibri" w:hAnsi="Calibri" w:cs="Calibri"/>
-                <w:sz w:val="22"/>
-                <w:szCs w:val="22"/>
-              </w:rPr>
-              <w:br/>
-              <w:t>6c5d9cfa36c9</w:t>
-            </w:r>
-            <w:r>
-              <w:rPr>
-                <w:rFonts w:ascii="Calibri" w:hAnsi="Calibri" w:cs="Calibri"/>
-                <w:sz w:val="22"/>
-                <w:szCs w:val="22"/>
-              </w:rPr>
-              <w:br/>
-            </w:r>
-          </w:p>
-        </w:tc>
-        <w:tc>
-          <w:tcPr>
-            <w:tcW w:w="1407" w:type="dxa"/>
-          </w:tcPr>
-          <w:p>
-            <w:pPr>
-              <w:rPr>
-                <w:rFonts w:ascii="Calibri" w:hAnsi="Calibri" w:cs="Calibri"/>
-                <w:sz w:val="22"/>
-                <w:szCs w:val="22"/>
-              </w:rPr>
-            </w:pPr>
-            <w:r>
-              <w:rPr>
-                <w:rFonts w:ascii="Calibri" w:hAnsi="Calibri" w:cs="Calibri"/>
-                <w:sz w:val="22"/>
-                <w:szCs w:val="22"/>
-              </w:rPr>
-              <w:t>ac0280f4-fe48-4746- 89d3-2f622b276725</w:t>
-            </w:r>
-          </w:p>
-        </w:tc>
-        <w:tc>
-          <w:tcPr>
-            <w:tcW w:w="1416" w:type="dxa"/>
-          </w:tcPr>
-          <w:p>
-            <w:pPr>
-              <w:rPr>
-                <w:rFonts w:ascii="Calibri" w:hAnsi="Calibri" w:cs="Calibri"/>
-                <w:sz w:val="22"/>
-                <w:szCs w:val="22"/>
-              </w:rPr>
-            </w:pPr>
-            <w:r>
-              <w:rPr>
-                <w:rFonts w:ascii="Calibri" w:hAnsi="Calibri" w:cs="Calibri"/>
-                <w:sz w:val="22"/>
-                <w:szCs w:val="22"/>
-              </w:rPr>
-              <w:t>12549639-68c4-436f-bf9d-</w:t>
-            </w:r>
-            <w:r>
-              <w:rPr>
-                <w:rFonts w:ascii="Calibri" w:hAnsi="Calibri" w:cs="Calibri"/>
-                <w:sz w:val="22"/>
-                <w:szCs w:val="22"/>
-              </w:rPr>
-              <w:br/>
-              <w:t>2d49ea7e0ebf</w:t>
-            </w:r>
-            <w:r>
-              <w:rPr>
-                <w:rFonts w:ascii="Calibri" w:hAnsi="Calibri" w:cs="Calibri"/>
-                <w:sz w:val="22"/>
-                <w:szCs w:val="22"/>
-              </w:rPr>
-              <w:br/>
-            </w:r>
-          </w:p>
-        </w:tc>
-        <w:tc>
-          <w:tcPr>
-            <w:tcW w:w="1435" w:type="dxa"/>
-          </w:tcPr>
-          <w:p>
-            <w:pPr>
-              <w:rPr>
-                <w:rFonts w:ascii="Calibri" w:hAnsi="Calibri" w:cs="Calibri"/>
-                <w:sz w:val="22"/>
-                <w:szCs w:val="22"/>
-              </w:rPr>
-            </w:pPr>
-            <w:r>
-              <w:rPr>
-                <w:rFonts w:ascii="Calibri" w:hAnsi="Calibri" w:cs="Calibri"/>
-                <w:sz w:val="22"/>
-                <w:szCs w:val="22"/>
-              </w:rPr>
-              <w:t>75fce5ba-0025-</w:t>
-            </w:r>
-            <w:r>
-              <w:rPr>
-                <w:rFonts w:ascii="Calibri" w:hAnsi="Calibri" w:cs="Calibri"/>
-                <w:sz w:val="22"/>
-                <w:szCs w:val="22"/>
-              </w:rPr>
-              <w:br/>
-              <w:t>4a99-8dac-102464b88304</w:t>
-            </w:r>
-            <w:r>
-              <w:rPr>
-                <w:rFonts w:ascii="Calibri" w:hAnsi="Calibri" w:cs="Calibri"/>
-                <w:sz w:val="22"/>
-                <w:szCs w:val="22"/>
-              </w:rPr>
-              <w:br/>
-            </w:r>
-          </w:p>
-        </w:tc>
-      </w:tr>
-      <w:tr>
-        <w:tc>
-          <w:tcPr>
-            <w:tcW w:w="827" w:type="dxa"/>
-            <w:vAlign w:val="center"/>
-          </w:tcPr>
-          <w:p>
-            <w:pPr>
-              <w:rPr>
-                <w:rFonts w:ascii="Calibri" w:hAnsi="Calibri" w:cs="Calibri"/>
-                <w:b/>
-                <w:bCs/>
-                <w:sz w:val="22"/>
-                <w:szCs w:val="22"/>
-              </w:rPr>
-            </w:pPr>
+              <w:t xml:space="preserve">After </w:t>
+            </w:r>
             <w:r>
               <w:rPr>
                 <w:rFonts w:ascii="Segoe UI" w:hAnsi="Segoe UI" w:cs="Segoe UI"/>
@@ -3383,7 +3505,7 @@
                 <w:sz w:val="20"/>
                 <w:szCs w:val="20"/>
               </w:rPr>
-              <w:t xml:space="preserve">After </w:t>
+              <w:t>+</w:t>
             </w:r>
             <w:r>
               <w:rPr>
@@ -3393,7 +3515,7 @@
                 <w:sz w:val="20"/>
                 <w:szCs w:val="20"/>
               </w:rPr>
-              <w:t>+</w:t>
+              <w:t>3</w:t>
             </w:r>
             <w:r>
               <w:rPr>
@@ -3403,8 +3525,218 @@
                 <w:sz w:val="20"/>
                 <w:szCs w:val="20"/>
               </w:rPr>
-              <w:t>3</w:t>
-            </w:r>
+              <w:t>0 sec</w:t>
+            </w:r>
+          </w:p>
+        </w:tc>
+        <w:tc>
+          <w:tcPr>
+            <w:tcW w:w="1429" w:type="dxa"/>
+          </w:tcPr>
+          <w:p>
+            <w:pPr>
+              <w:rPr>
+                <w:rFonts w:ascii="Calibri" w:hAnsi="Calibri" w:cs="Calibri"/>
+                <w:sz w:val="22"/>
+                <w:szCs w:val="22"/>
+              </w:rPr>
+            </w:pPr>
+            <w:r>
+              <w:rPr>
+                <w:rFonts w:ascii="Calibri" w:hAnsi="Calibri" w:cs="Calibri"/>
+                <w:sz w:val="22"/>
+                <w:szCs w:val="22"/>
+              </w:rPr>
+              <w:t>e2fa1472-6e9c-40fe-bc76-</w:t>
+            </w:r>
+            <w:r>
+              <w:rPr>
+                <w:rFonts w:ascii="Calibri" w:hAnsi="Calibri" w:cs="Calibri"/>
+                <w:sz w:val="22"/>
+                <w:szCs w:val="22"/>
+              </w:rPr>
+              <w:br/>
+              <w:t>86301ada0c3f</w:t>
+            </w:r>
+            <w:r>
+              <w:rPr>
+                <w:rFonts w:ascii="Calibri" w:hAnsi="Calibri" w:cs="Calibri"/>
+                <w:sz w:val="22"/>
+                <w:szCs w:val="22"/>
+              </w:rPr>
+              <w:br/>
+            </w:r>
+          </w:p>
+        </w:tc>
+        <w:tc>
+          <w:tcPr>
+            <w:tcW w:w="1423" w:type="dxa"/>
+          </w:tcPr>
+          <w:p>
+            <w:pPr>
+              <w:rPr>
+                <w:rFonts w:ascii="Calibri" w:hAnsi="Calibri" w:cs="Calibri"/>
+                <w:sz w:val="22"/>
+                <w:szCs w:val="22"/>
+              </w:rPr>
+            </w:pPr>
+            <w:r>
+              <w:rPr>
+                <w:rFonts w:ascii="Calibri" w:hAnsi="Calibri" w:cs="Calibri"/>
+                <w:sz w:val="22"/>
+                <w:szCs w:val="22"/>
+              </w:rPr>
+              <w:t>f4fb4cb8-f5b8-4651-a527- da52b372540a</w:t>
+            </w:r>
+            <w:r>
+              <w:rPr>
+                <w:rFonts w:ascii="Calibri" w:hAnsi="Calibri" w:cs="Calibri"/>
+                <w:sz w:val="22"/>
+                <w:szCs w:val="22"/>
+              </w:rPr>
+              <w:br/>
+            </w:r>
+          </w:p>
+        </w:tc>
+        <w:tc>
+          <w:tcPr>
+            <w:tcW w:w="1413" w:type="dxa"/>
+          </w:tcPr>
+          <w:p>
+            <w:pPr>
+              <w:rPr>
+                <w:rFonts w:ascii="Calibri" w:hAnsi="Calibri" w:cs="Calibri"/>
+                <w:sz w:val="22"/>
+                <w:szCs w:val="22"/>
+              </w:rPr>
+            </w:pPr>
+            <w:r>
+              <w:rPr>
+                <w:rFonts w:ascii="Calibri" w:hAnsi="Calibri" w:cs="Calibri"/>
+                <w:sz w:val="22"/>
+                <w:szCs w:val="22"/>
+              </w:rPr>
+              <w:t>6c92ab8a-1b8a-4b67-8dc4-</w:t>
+            </w:r>
+            <w:r>
+              <w:rPr>
+                <w:rFonts w:ascii="Calibri" w:hAnsi="Calibri" w:cs="Calibri"/>
+                <w:sz w:val="22"/>
+                <w:szCs w:val="22"/>
+              </w:rPr>
+              <w:br/>
+              <w:t>6c5d9cfa36c9</w:t>
+            </w:r>
+            <w:r>
+              <w:rPr>
+                <w:rFonts w:ascii="Calibri" w:hAnsi="Calibri" w:cs="Calibri"/>
+                <w:sz w:val="22"/>
+                <w:szCs w:val="22"/>
+              </w:rPr>
+              <w:br/>
+            </w:r>
+          </w:p>
+        </w:tc>
+        <w:tc>
+          <w:tcPr>
+            <w:tcW w:w="1407" w:type="dxa"/>
+          </w:tcPr>
+          <w:p>
+            <w:pPr>
+              <w:rPr>
+                <w:rFonts w:ascii="Calibri" w:hAnsi="Calibri" w:cs="Calibri"/>
+                <w:sz w:val="22"/>
+                <w:szCs w:val="22"/>
+              </w:rPr>
+            </w:pPr>
+            <w:r>
+              <w:rPr>
+                <w:rFonts w:ascii="Calibri" w:hAnsi="Calibri" w:cs="Calibri"/>
+                <w:sz w:val="22"/>
+                <w:szCs w:val="22"/>
+              </w:rPr>
+              <w:t>ac0280f4-fe48-4746- 89d3-2f622b276725</w:t>
+            </w:r>
+          </w:p>
+        </w:tc>
+        <w:tc>
+          <w:tcPr>
+            <w:tcW w:w="1416" w:type="dxa"/>
+          </w:tcPr>
+          <w:p>
+            <w:pPr>
+              <w:rPr>
+                <w:rFonts w:ascii="Calibri" w:hAnsi="Calibri" w:cs="Calibri"/>
+                <w:sz w:val="22"/>
+                <w:szCs w:val="22"/>
+              </w:rPr>
+            </w:pPr>
+            <w:r>
+              <w:rPr>
+                <w:rFonts w:ascii="Calibri" w:hAnsi="Calibri" w:cs="Calibri"/>
+                <w:sz w:val="22"/>
+                <w:szCs w:val="22"/>
+              </w:rPr>
+              <w:t>6861645e-4a98-4f33-8e90- d9f412b4f9c3</w:t>
+            </w:r>
+          </w:p>
+        </w:tc>
+        <w:tc>
+          <w:tcPr>
+            <w:tcW w:w="1435" w:type="dxa"/>
+          </w:tcPr>
+          <w:p>
+            <w:pPr>
+              <w:rPr>
+                <w:rFonts w:ascii="Calibri" w:hAnsi="Calibri" w:cs="Calibri"/>
+                <w:sz w:val="22"/>
+                <w:szCs w:val="22"/>
+              </w:rPr>
+            </w:pPr>
+            <w:r>
+              <w:rPr>
+                <w:rFonts w:ascii="Calibri" w:hAnsi="Calibri" w:cs="Calibri"/>
+                <w:sz w:val="22"/>
+                <w:szCs w:val="22"/>
+              </w:rPr>
+              <w:t>8471b2b0-3cd0-</w:t>
+            </w:r>
+            <w:r>
+              <w:rPr>
+                <w:rFonts w:ascii="Calibri" w:hAnsi="Calibri" w:cs="Calibri"/>
+                <w:sz w:val="22"/>
+                <w:szCs w:val="22"/>
+              </w:rPr>
+              <w:br/>
+              <w:t>45bb-85d6-eb4d39d5484e</w:t>
+            </w:r>
+            <w:r>
+              <w:rPr>
+                <w:rFonts w:ascii="Calibri" w:hAnsi="Calibri" w:cs="Calibri"/>
+                <w:sz w:val="22"/>
+                <w:szCs w:val="22"/>
+              </w:rPr>
+              <w:br/>
+            </w:r>
+          </w:p>
+        </w:tc>
+      </w:tr>
+      <w:tr>
+        <w:tc>
+          <w:tcPr>
+            <w:tcW w:w="827" w:type="dxa"/>
+            <w:vAlign w:val="center"/>
+          </w:tcPr>
+          <w:p>
+            <w:pPr>
+              <w:rPr>
+                <w:rFonts w:ascii="Calibri" w:hAnsi="Calibri" w:cs="Calibri"/>
+                <w:b/>
+                <w:bCs/>
+                <w:sz w:val="22"/>
+                <w:szCs w:val="22"/>
+              </w:rPr>
+            </w:pPr>
             <w:r>
               <w:rPr>
                 <w:rFonts w:ascii="Segoe UI" w:hAnsi="Segoe UI" w:cs="Segoe UI"/>
@@ -3413,218 +3745,8 @@
                 <w:sz w:val="20"/>
                 <w:szCs w:val="20"/>
               </w:rPr>
-              <w:t>0 sec</w:t>
-            </w:r>
-          </w:p>
-        </w:tc>
-        <w:tc>
-          <w:tcPr>
-            <w:tcW w:w="1429" w:type="dxa"/>
-          </w:tcPr>
-          <w:p>
-            <w:pPr>
-              <w:rPr>
-                <w:rFonts w:ascii="Calibri" w:hAnsi="Calibri" w:cs="Calibri"/>
-                <w:sz w:val="22"/>
-                <w:szCs w:val="22"/>
-              </w:rPr>
-            </w:pPr>
-            <w:r>
-              <w:rPr>
-                <w:rFonts w:ascii="Calibri" w:hAnsi="Calibri" w:cs="Calibri"/>
-                <w:sz w:val="22"/>
-                <w:szCs w:val="22"/>
-              </w:rPr>
-              <w:t>e2fa1472-6e9c-40fe-bc76-</w:t>
-            </w:r>
-            <w:r>
-              <w:rPr>
-                <w:rFonts w:ascii="Calibri" w:hAnsi="Calibri" w:cs="Calibri"/>
-                <w:sz w:val="22"/>
-                <w:szCs w:val="22"/>
-              </w:rPr>
-              <w:br/>
-              <w:t>86301ada0c3f</w:t>
-            </w:r>
-            <w:r>
-              <w:rPr>
-                <w:rFonts w:ascii="Calibri" w:hAnsi="Calibri" w:cs="Calibri"/>
-                <w:sz w:val="22"/>
-                <w:szCs w:val="22"/>
-              </w:rPr>
-              <w:br/>
-            </w:r>
-          </w:p>
-        </w:tc>
-        <w:tc>
-          <w:tcPr>
-            <w:tcW w:w="1423" w:type="dxa"/>
-          </w:tcPr>
-          <w:p>
-            <w:pPr>
-              <w:rPr>
-                <w:rFonts w:ascii="Calibri" w:hAnsi="Calibri" w:cs="Calibri"/>
-                <w:sz w:val="22"/>
-                <w:szCs w:val="22"/>
-              </w:rPr>
-            </w:pPr>
-            <w:r>
-              <w:rPr>
-                <w:rFonts w:ascii="Calibri" w:hAnsi="Calibri" w:cs="Calibri"/>
-                <w:sz w:val="22"/>
-                <w:szCs w:val="22"/>
-              </w:rPr>
-              <w:t>f4fb4cb8-f5b8-4651-a527- da52b372540a</w:t>
-            </w:r>
-            <w:r>
-              <w:rPr>
-                <w:rFonts w:ascii="Calibri" w:hAnsi="Calibri" w:cs="Calibri"/>
-                <w:sz w:val="22"/>
-                <w:szCs w:val="22"/>
-              </w:rPr>
-              <w:br/>
-            </w:r>
-          </w:p>
-        </w:tc>
-        <w:tc>
-          <w:tcPr>
-            <w:tcW w:w="1413" w:type="dxa"/>
-          </w:tcPr>
-          <w:p>
-            <w:pPr>
-              <w:rPr>
-                <w:rFonts w:ascii="Calibri" w:hAnsi="Calibri" w:cs="Calibri"/>
-                <w:sz w:val="22"/>
-                <w:szCs w:val="22"/>
-              </w:rPr>
-            </w:pPr>
-            <w:r>
-              <w:rPr>
-                <w:rFonts w:ascii="Calibri" w:hAnsi="Calibri" w:cs="Calibri"/>
-                <w:sz w:val="22"/>
-                <w:szCs w:val="22"/>
-              </w:rPr>
-              <w:t>6c92ab8a-1b8a-4b67-8dc4-</w:t>
-            </w:r>
-            <w:r>
-              <w:rPr>
-                <w:rFonts w:ascii="Calibri" w:hAnsi="Calibri" w:cs="Calibri"/>
-                <w:sz w:val="22"/>
-                <w:szCs w:val="22"/>
-              </w:rPr>
-              <w:br/>
-              <w:t>6c5d9cfa36c9</w:t>
-            </w:r>
-            <w:r>
-              <w:rPr>
-                <w:rFonts w:ascii="Calibri" w:hAnsi="Calibri" w:cs="Calibri"/>
-                <w:sz w:val="22"/>
-                <w:szCs w:val="22"/>
-              </w:rPr>
-              <w:br/>
-            </w:r>
-          </w:p>
-        </w:tc>
-        <w:tc>
-          <w:tcPr>
-            <w:tcW w:w="1407" w:type="dxa"/>
-          </w:tcPr>
-          <w:p>
-            <w:pPr>
-              <w:rPr>
-                <w:rFonts w:ascii="Calibri" w:hAnsi="Calibri" w:cs="Calibri"/>
-                <w:sz w:val="22"/>
-                <w:szCs w:val="22"/>
-              </w:rPr>
-            </w:pPr>
-            <w:r>
-              <w:rPr>
-                <w:rFonts w:ascii="Calibri" w:hAnsi="Calibri" w:cs="Calibri"/>
-                <w:sz w:val="22"/>
-                <w:szCs w:val="22"/>
-              </w:rPr>
-              <w:t>ac0280f4-fe48-4746- 89d3-2f622b276725</w:t>
-            </w:r>
-          </w:p>
-        </w:tc>
-        <w:tc>
-          <w:tcPr>
-            <w:tcW w:w="1416" w:type="dxa"/>
-          </w:tcPr>
-          <w:p>
-            <w:pPr>
-              <w:rPr>
-                <w:rFonts w:ascii="Calibri" w:hAnsi="Calibri" w:cs="Calibri"/>
-                <w:sz w:val="22"/>
-                <w:szCs w:val="22"/>
-              </w:rPr>
-            </w:pPr>
-            <w:r>
-              <w:rPr>
-                <w:rFonts w:ascii="Calibri" w:hAnsi="Calibri" w:cs="Calibri"/>
-                <w:sz w:val="22"/>
-                <w:szCs w:val="22"/>
-              </w:rPr>
-              <w:t>6861645e-4a98-4f33-8e90- d9f412b4f9c3</w:t>
-            </w:r>
-          </w:p>
-        </w:tc>
-        <w:tc>
-          <w:tcPr>
-            <w:tcW w:w="1435" w:type="dxa"/>
-          </w:tcPr>
-          <w:p>
-            <w:pPr>
-              <w:rPr>
-                <w:rFonts w:ascii="Calibri" w:hAnsi="Calibri" w:cs="Calibri"/>
-                <w:sz w:val="22"/>
-                <w:szCs w:val="22"/>
-              </w:rPr>
-            </w:pPr>
-            <w:r>
-              <w:rPr>
-                <w:rFonts w:ascii="Calibri" w:hAnsi="Calibri" w:cs="Calibri"/>
-                <w:sz w:val="22"/>
-                <w:szCs w:val="22"/>
-              </w:rPr>
-              <w:t>8471b2b0-3cd0-</w:t>
-            </w:r>
-            <w:r>
-              <w:rPr>
-                <w:rFonts w:ascii="Calibri" w:hAnsi="Calibri" w:cs="Calibri"/>
-                <w:sz w:val="22"/>
-                <w:szCs w:val="22"/>
-              </w:rPr>
-              <w:br/>
-              <w:t>45bb-85d6-eb4d39d5484e</w:t>
-            </w:r>
-            <w:r>
-              <w:rPr>
-                <w:rFonts w:ascii="Calibri" w:hAnsi="Calibri" w:cs="Calibri"/>
-                <w:sz w:val="22"/>
-                <w:szCs w:val="22"/>
-              </w:rPr>
-              <w:br/>
-            </w:r>
-          </w:p>
-        </w:tc>
-      </w:tr>
-      <w:tr>
-        <w:tc>
-          <w:tcPr>
-            <w:tcW w:w="827" w:type="dxa"/>
-            <w:vAlign w:val="center"/>
-          </w:tcPr>
-          <w:p>
-            <w:pPr>
-              <w:rPr>
-                <w:rFonts w:ascii="Calibri" w:hAnsi="Calibri" w:cs="Calibri"/>
-                <w:b/>
-                <w:bCs/>
-                <w:sz w:val="22"/>
-                <w:szCs w:val="22"/>
-              </w:rPr>
-            </w:pPr>
+              <w:t xml:space="preserve">After   </w:t>
+            </w:r>
             <w:r>
               <w:rPr>
                 <w:rFonts w:ascii="Segoe UI" w:hAnsi="Segoe UI" w:cs="Segoe UI"/>
@@ -3633,16 +3755,6 @@
                 <w:sz w:val="20"/>
                 <w:szCs w:val="20"/>
               </w:rPr>
-              <w:t xml:space="preserve">After   </w:t>
-            </w:r>
-            <w:r>
-              <w:rPr>
-                <w:rFonts w:ascii="Segoe UI" w:hAnsi="Segoe UI" w:cs="Segoe UI"/>
-                <w:b/>
-                <w:bCs/>
-                <w:sz w:val="20"/>
-                <w:szCs w:val="20"/>
-              </w:rPr>
               <w:t>+2 min</w:t>
             </w:r>
           </w:p>
@@ -3888,6 +4000,8 @@
       <w:pPr>
         <w:rPr>
           <w:rFonts w:ascii="Calibri" w:hAnsi="Calibri" w:cs="Calibri"/>
+          <w:b/>
+          <w:bCs/>
           <w:sz w:val="22"/>
           <w:szCs w:val="22"/>
         </w:rPr>
@@ -3912,6 +4026,14 @@
         </w:rPr>
         <w:t xml:space="preserve"> </w:t>
       </w:r>
+      <w:r>
+        <w:rPr>
+          <w:rFonts w:ascii="Calibri" w:hAnsi="Calibri" w:cs="Calibri"/>
+          <w:sz w:val="22"/>
+          <w:szCs w:val="22"/>
+        </w:rPr>
+        <w:t>b302f1c9370af906fcbb08287cc556ca56767507</w:t>
+      </w:r>
     </w:p>
     <w:p>
       <w:pPr>
@@ -3949,7 +4071,7 @@
         </w:rPr>
         <w:t xml:space="preserve">: Found below </w:t>
       </w:r>
-      <w:hyperlink r:id="rId25" w:history="1">
+      <w:hyperlink r:id="rId29" w:history="1">
         <w:r>
           <w:rPr>
             <w:rStyle w:val="Hyperlink"/>
@@ -4029,6 +4151,7 @@
           <w:sz w:val="22"/>
           <w:szCs w:val="22"/>
         </w:rPr>
+        <w:lastRenderedPageBreak/>
         <w:t>Run time error:</w:t>
       </w:r>
       <w:r>
@@ -4057,7 +4180,7 @@
         </w:rPr>
         <w:t xml:space="preserve"> - </w:t>
       </w:r>
-      <w:hyperlink r:id="rId26" w:history="1">
+      <w:hyperlink r:id="rId30" w:history="1">
         <w:r>
           <w:rPr>
             <w:rStyle w:val="Hyperlink"/>
@@ -4108,7 +4231,6 @@
           <w:sz w:val="22"/>
           <w:szCs w:val="22"/>
         </w:rPr>
-        <w:lastRenderedPageBreak/>
         <w:t xml:space="preserve">Conclusion: </w:t>
       </w:r>
       <w:proofErr w:type="spellStart"/>
@@ -7366,6 +7488,15 @@
 </file>
 
 <file path=customXml/item2.xml><?xml version="1.0" encoding="utf-8"?>
+<?mso-contentType ?>
+<FormTemplates xmlns="http://schemas.microsoft.com/sharepoint/v3/contenttype/forms">
+  <Display>DocumentLibraryForm</Display>
+  <Edit>DocumentLibraryForm</Edit>
+  <New>DocumentLibraryForm</New>
+</FormTemplates>
+</file>
+
+<file path=customXml/item3.xml><?xml version="1.0" encoding="utf-8"?>
 <ct:contentTypeSchema xmlns:ct="http://schemas.microsoft.com/office/2006/metadata/contentType" xmlns:ma="http://schemas.microsoft.com/office/2006/metadata/properties/metaAttributes" ct:_="" ma:_="" ma:contentTypeName="Document" ma:contentTypeID="0x010100EC19F68DC43C164F9A3DE24D5D9AFCF8" ma:contentTypeVersion="16" ma:contentTypeDescription="Create a new document." ma:contentTypeScope="" ma:versionID="26b9fde581bd410d35edec2660bbbce3">
   <xsd:schema xmlns:xsd="http://www.w3.org/2001/XMLSchema" xmlns:xs="http://www.w3.org/2001/XMLSchema" xmlns:p="http://schemas.microsoft.com/office/2006/metadata/properties" xmlns:ns3="3b1629a4-d2b2-4f19-9676-5f20b70ce082" xmlns:ns4="c9aeeca5-d7bd-4245-9100-dfc107739a16" targetNamespace="http://schemas.microsoft.com/office/2006/metadata/properties" ma:root="true" ma:fieldsID="85b2c106fe9133781cbefcb571257798" ns3:_="" ns4:_="">
     <xsd:import namespace="3b1629a4-d2b2-4f19-9676-5f20b70ce082"/>
@@ -7604,15 +7735,6 @@
 </ct:contentTypeSchema>
 </file>
 
-<file path=customXml/item3.xml><?xml version="1.0" encoding="utf-8"?>
-<?mso-contentType ?>
-<FormTemplates xmlns="http://schemas.microsoft.com/sharepoint/v3/contenttype/forms">
-  <Display>DocumentLibraryForm</Display>
-  <Edit>DocumentLibraryForm</Edit>
-  <New>DocumentLibraryForm</New>
-</FormTemplates>
-</file>
-
 <file path=customXml/itemProps1.xml><?xml version="1.0" encoding="utf-8"?>
 <ds:datastoreItem xmlns:ds="http://schemas.openxmlformats.org/officeDocument/2006/customXml" ds:itemID="{AA3C9C74-6E90-4DC2-A21D-57B9661F21F3}">
   <ds:schemaRefs>
@@ -7624,6 +7746,14 @@
 </file>
 
 <file path=customXml/itemProps2.xml><?xml version="1.0" encoding="utf-8"?>
+<ds:datastoreItem xmlns:ds="http://schemas.openxmlformats.org/officeDocument/2006/customXml" ds:itemID="{927D1DB6-87D8-40C0-80F8-9F563F981634}">
+  <ds:schemaRefs>
+    <ds:schemaRef ds:uri="http://schemas.microsoft.com/sharepoint/v3/contenttype/forms"/>
+  </ds:schemaRefs>
+</ds:datastoreItem>
+</file>
+
+<file path=customXml/itemProps3.xml><?xml version="1.0" encoding="utf-8"?>
 <ds:datastoreItem xmlns:ds="http://schemas.openxmlformats.org/officeDocument/2006/customXml" ds:itemID="{9988BF47-9E56-4B76-B22A-8F1982E4B201}">
   <ds:schemaRefs>
     <ds:schemaRef ds:uri="http://schemas.microsoft.com/office/2006/metadata/contentType"/>
@@ -7640,12 +7770,4 @@
     <ds:schemaRef ds:uri="http://schemas.microsoft.com/internal/obd"/>
   </ds:schemaRefs>
 </ds:datastoreItem>
-</file>
-
-<file path=customXml/itemProps3.xml><?xml version="1.0" encoding="utf-8"?>
-<ds:datastoreItem xmlns:ds="http://schemas.openxmlformats.org/officeDocument/2006/customXml" ds:itemID="{927D1DB6-87D8-40C0-80F8-9F563F981634}">
-  <ds:schemaRefs>
-    <ds:schemaRef ds:uri="http://schemas.microsoft.com/sharepoint/v3/contenttype/forms"/>
-  </ds:schemaRefs>
-</ds:datastoreItem>
 </file>
</xml_diff>